<commit_message>
Documento de Requisitos (versão 1.1)
Agora com hiperlinks de acesso para o GitHub!
</commit_message>
<xml_diff>
--- a/docs/Documento de Requisitos.docx
+++ b/docs/Documento de Requisitos.docx
@@ -948,8 +948,6 @@
           <w:r>
             <w:t>Sumário</w:t>
           </w:r>
-          <w:bookmarkStart w:id="0" w:name="_GoBack"/>
-          <w:bookmarkEnd w:id="0"/>
         </w:p>
         <w:p>
           <w:pPr>
@@ -975,7 +973,7 @@
           <w:r>
             <w:fldChar w:fldCharType="separate"/>
           </w:r>
-          <w:hyperlink w:anchor="_Toc20318363" w:history="1">
+          <w:hyperlink w:anchor="_Toc20319717" w:history="1">
             <w:r>
               <w:rPr>
                 <w:rStyle w:val="Hyperlink"/>
@@ -1019,7 +1017,7 @@
                 <w:noProof/>
                 <w:webHidden/>
               </w:rPr>
-              <w:instrText xml:space="preserve"> PAGEREF _Toc20318363 \h </w:instrText>
+              <w:instrText xml:space="preserve"> PAGEREF _Toc20319717 \h </w:instrText>
             </w:r>
             <w:r>
               <w:rPr>
@@ -1064,7 +1062,7 @@
               <w:lang w:bidi="ar-SA"/>
             </w:rPr>
           </w:pPr>
-          <w:hyperlink w:anchor="_Toc20318364" w:history="1">
+          <w:hyperlink w:anchor="_Toc20319718" w:history="1">
             <w:r>
               <w:rPr>
                 <w:rStyle w:val="Hyperlink"/>
@@ -1091,7 +1089,7 @@
                 <w:noProof/>
                 <w:webHidden/>
               </w:rPr>
-              <w:instrText xml:space="preserve"> PAGEREF _Toc20318364 \h </w:instrText>
+              <w:instrText xml:space="preserve"> PAGEREF _Toc20319718 \h </w:instrText>
             </w:r>
             <w:r>
               <w:rPr>
@@ -1137,7 +1135,7 @@
               <w:lang w:bidi="ar-SA"/>
             </w:rPr>
           </w:pPr>
-          <w:hyperlink w:anchor="_Toc20318365" w:history="1">
+          <w:hyperlink w:anchor="_Toc20319719" w:history="1">
             <w:r>
               <w:rPr>
                 <w:rStyle w:val="Hyperlink"/>
@@ -1181,7 +1179,7 @@
                 <w:noProof/>
                 <w:webHidden/>
               </w:rPr>
-              <w:instrText xml:space="preserve"> PAGEREF _Toc20318365 \h </w:instrText>
+              <w:instrText xml:space="preserve"> PAGEREF _Toc20319719 \h </w:instrText>
             </w:r>
             <w:r>
               <w:rPr>
@@ -1227,7 +1225,7 @@
               <w:lang w:bidi="ar-SA"/>
             </w:rPr>
           </w:pPr>
-          <w:hyperlink w:anchor="_Toc20318366" w:history="1">
+          <w:hyperlink w:anchor="_Toc20319720" w:history="1">
             <w:r>
               <w:rPr>
                 <w:rStyle w:val="Hyperlink"/>
@@ -1271,7 +1269,7 @@
                 <w:noProof/>
                 <w:webHidden/>
               </w:rPr>
-              <w:instrText xml:space="preserve"> PAGEREF _Toc20318366 \h </w:instrText>
+              <w:instrText xml:space="preserve"> PAGEREF _Toc20319720 \h </w:instrText>
             </w:r>
             <w:r>
               <w:rPr>
@@ -1317,7 +1315,7 @@
               <w:lang w:bidi="ar-SA"/>
             </w:rPr>
           </w:pPr>
-          <w:hyperlink w:anchor="_Toc20318367" w:history="1">
+          <w:hyperlink w:anchor="_Toc20319721" w:history="1">
             <w:r>
               <w:rPr>
                 <w:rStyle w:val="Hyperlink"/>
@@ -1361,7 +1359,7 @@
                 <w:noProof/>
                 <w:webHidden/>
               </w:rPr>
-              <w:instrText xml:space="preserve"> PAGEREF _Toc20318367 \h </w:instrText>
+              <w:instrText xml:space="preserve"> PAGEREF _Toc20319721 \h </w:instrText>
             </w:r>
             <w:r>
               <w:rPr>
@@ -1407,7 +1405,7 @@
               <w:lang w:bidi="ar-SA"/>
             </w:rPr>
           </w:pPr>
-          <w:hyperlink w:anchor="_Toc20318368" w:history="1">
+          <w:hyperlink w:anchor="_Toc20319722" w:history="1">
             <w:r>
               <w:rPr>
                 <w:rStyle w:val="Hyperlink"/>
@@ -1451,7 +1449,7 @@
                 <w:noProof/>
                 <w:webHidden/>
               </w:rPr>
-              <w:instrText xml:space="preserve"> PAGEREF _Toc20318368 \h </w:instrText>
+              <w:instrText xml:space="preserve"> PAGEREF _Toc20319722 \h </w:instrText>
             </w:r>
             <w:r>
               <w:rPr>
@@ -1497,7 +1495,7 @@
               <w:lang w:bidi="ar-SA"/>
             </w:rPr>
           </w:pPr>
-          <w:hyperlink w:anchor="_Toc20318369" w:history="1">
+          <w:hyperlink w:anchor="_Toc20319723" w:history="1">
             <w:r>
               <w:rPr>
                 <w:rStyle w:val="Hyperlink"/>
@@ -1541,7 +1539,7 @@
                 <w:noProof/>
                 <w:webHidden/>
               </w:rPr>
-              <w:instrText xml:space="preserve"> PAGEREF _Toc20318369 \h </w:instrText>
+              <w:instrText xml:space="preserve"> PAGEREF _Toc20319723 \h </w:instrText>
             </w:r>
             <w:r>
               <w:rPr>
@@ -1587,7 +1585,7 @@
               <w:lang w:bidi="ar-SA"/>
             </w:rPr>
           </w:pPr>
-          <w:hyperlink w:anchor="_Toc20318370" w:history="1">
+          <w:hyperlink w:anchor="_Toc20319724" w:history="1">
             <w:r>
               <w:rPr>
                 <w:rStyle w:val="Hyperlink"/>
@@ -1631,7 +1629,7 @@
                 <w:noProof/>
                 <w:webHidden/>
               </w:rPr>
-              <w:instrText xml:space="preserve"> PAGEREF _Toc20318370 \h </w:instrText>
+              <w:instrText xml:space="preserve"> PAGEREF _Toc20319724 \h </w:instrText>
             </w:r>
             <w:r>
               <w:rPr>
@@ -1677,7 +1675,7 @@
               <w:lang w:bidi="ar-SA"/>
             </w:rPr>
           </w:pPr>
-          <w:hyperlink w:anchor="_Toc20318371" w:history="1">
+          <w:hyperlink w:anchor="_Toc20319725" w:history="1">
             <w:r>
               <w:rPr>
                 <w:rStyle w:val="Hyperlink"/>
@@ -1721,7 +1719,7 @@
                 <w:noProof/>
                 <w:webHidden/>
               </w:rPr>
-              <w:instrText xml:space="preserve"> PAGEREF _Toc20318371 \h </w:instrText>
+              <w:instrText xml:space="preserve"> PAGEREF _Toc20319725 \h </w:instrText>
             </w:r>
             <w:r>
               <w:rPr>
@@ -1767,7 +1765,7 @@
               <w:lang w:bidi="ar-SA"/>
             </w:rPr>
           </w:pPr>
-          <w:hyperlink w:anchor="_Toc20318372" w:history="1">
+          <w:hyperlink w:anchor="_Toc20319726" w:history="1">
             <w:r>
               <w:rPr>
                 <w:rStyle w:val="Hyperlink"/>
@@ -1811,7 +1809,7 @@
                 <w:noProof/>
                 <w:webHidden/>
               </w:rPr>
-              <w:instrText xml:space="preserve"> PAGEREF _Toc20318372 \h </w:instrText>
+              <w:instrText xml:space="preserve"> PAGEREF _Toc20319726 \h </w:instrText>
             </w:r>
             <w:r>
               <w:rPr>
@@ -1857,7 +1855,7 @@
               <w:lang w:bidi="ar-SA"/>
             </w:rPr>
           </w:pPr>
-          <w:hyperlink w:anchor="_Toc20318373" w:history="1">
+          <w:hyperlink w:anchor="_Toc20319727" w:history="1">
             <w:r>
               <w:rPr>
                 <w:rStyle w:val="Hyperlink"/>
@@ -1901,7 +1899,7 @@
                 <w:noProof/>
                 <w:webHidden/>
               </w:rPr>
-              <w:instrText xml:space="preserve"> PAGEREF _Toc20318373 \h </w:instrText>
+              <w:instrText xml:space="preserve"> PAGEREF _Toc20319727 \h </w:instrText>
             </w:r>
             <w:r>
               <w:rPr>
@@ -1947,7 +1945,7 @@
               <w:lang w:bidi="ar-SA"/>
             </w:rPr>
           </w:pPr>
-          <w:hyperlink w:anchor="_Toc20318374" w:history="1">
+          <w:hyperlink w:anchor="_Toc20319728" w:history="1">
             <w:r>
               <w:rPr>
                 <w:rStyle w:val="Hyperlink"/>
@@ -1991,7 +1989,7 @@
                 <w:noProof/>
                 <w:webHidden/>
               </w:rPr>
-              <w:instrText xml:space="preserve"> PAGEREF _Toc20318374 \h </w:instrText>
+              <w:instrText xml:space="preserve"> PAGEREF _Toc20319728 \h </w:instrText>
             </w:r>
             <w:r>
               <w:rPr>
@@ -2037,7 +2035,7 @@
               <w:lang w:bidi="ar-SA"/>
             </w:rPr>
           </w:pPr>
-          <w:hyperlink w:anchor="_Toc20318375" w:history="1">
+          <w:hyperlink w:anchor="_Toc20319729" w:history="1">
             <w:r>
               <w:rPr>
                 <w:rStyle w:val="Hyperlink"/>
@@ -2081,7 +2079,7 @@
                 <w:noProof/>
                 <w:webHidden/>
               </w:rPr>
-              <w:instrText xml:space="preserve"> PAGEREF _Toc20318375 \h </w:instrText>
+              <w:instrText xml:space="preserve"> PAGEREF _Toc20319729 \h </w:instrText>
             </w:r>
             <w:r>
               <w:rPr>
@@ -2127,7 +2125,7 @@
               <w:lang w:bidi="ar-SA"/>
             </w:rPr>
           </w:pPr>
-          <w:hyperlink w:anchor="_Toc20318376" w:history="1">
+          <w:hyperlink w:anchor="_Toc20319730" w:history="1">
             <w:r>
               <w:rPr>
                 <w:rStyle w:val="Hyperlink"/>
@@ -2171,7 +2169,7 @@
                 <w:noProof/>
                 <w:webHidden/>
               </w:rPr>
-              <w:instrText xml:space="preserve"> PAGEREF _Toc20318376 \h </w:instrText>
+              <w:instrText xml:space="preserve"> PAGEREF _Toc20319730 \h </w:instrText>
             </w:r>
             <w:r>
               <w:rPr>
@@ -2217,7 +2215,7 @@
               <w:lang w:bidi="ar-SA"/>
             </w:rPr>
           </w:pPr>
-          <w:hyperlink w:anchor="_Toc20318377" w:history="1">
+          <w:hyperlink w:anchor="_Toc20319731" w:history="1">
             <w:r>
               <w:rPr>
                 <w:rStyle w:val="Hyperlink"/>
@@ -2261,7 +2259,7 @@
                 <w:noProof/>
                 <w:webHidden/>
               </w:rPr>
-              <w:instrText xml:space="preserve"> PAGEREF _Toc20318377 \h </w:instrText>
+              <w:instrText xml:space="preserve"> PAGEREF _Toc20319731 \h </w:instrText>
             </w:r>
             <w:r>
               <w:rPr>
@@ -2307,7 +2305,7 @@
               <w:lang w:bidi="ar-SA"/>
             </w:rPr>
           </w:pPr>
-          <w:hyperlink w:anchor="_Toc20318378" w:history="1">
+          <w:hyperlink w:anchor="_Toc20319732" w:history="1">
             <w:r>
               <w:rPr>
                 <w:rStyle w:val="Hyperlink"/>
@@ -2351,7 +2349,7 @@
                 <w:noProof/>
                 <w:webHidden/>
               </w:rPr>
-              <w:instrText xml:space="preserve"> PAGEREF _Toc20318378 \h </w:instrText>
+              <w:instrText xml:space="preserve"> PAGEREF _Toc20319732 \h </w:instrText>
             </w:r>
             <w:r>
               <w:rPr>
@@ -2397,7 +2395,7 @@
               <w:lang w:bidi="ar-SA"/>
             </w:rPr>
           </w:pPr>
-          <w:hyperlink w:anchor="_Toc20318379" w:history="1">
+          <w:hyperlink w:anchor="_Toc20319733" w:history="1">
             <w:r>
               <w:rPr>
                 <w:rStyle w:val="Hyperlink"/>
@@ -2441,7 +2439,7 @@
                 <w:noProof/>
                 <w:webHidden/>
               </w:rPr>
-              <w:instrText xml:space="preserve"> PAGEREF _Toc20318379 \h </w:instrText>
+              <w:instrText xml:space="preserve"> PAGEREF _Toc20319733 \h </w:instrText>
             </w:r>
             <w:r>
               <w:rPr>
@@ -2487,7 +2485,7 @@
               <w:lang w:bidi="ar-SA"/>
             </w:rPr>
           </w:pPr>
-          <w:hyperlink w:anchor="_Toc20318380" w:history="1">
+          <w:hyperlink w:anchor="_Toc20319734" w:history="1">
             <w:r>
               <w:rPr>
                 <w:rStyle w:val="Hyperlink"/>
@@ -2531,7 +2529,7 @@
                 <w:noProof/>
                 <w:webHidden/>
               </w:rPr>
-              <w:instrText xml:space="preserve"> PAGEREF _Toc20318380 \h </w:instrText>
+              <w:instrText xml:space="preserve"> PAGEREF _Toc20319734 \h </w:instrText>
             </w:r>
             <w:r>
               <w:rPr>
@@ -2576,7 +2574,7 @@
               <w:lang w:bidi="ar-SA"/>
             </w:rPr>
           </w:pPr>
-          <w:hyperlink w:anchor="_Toc20318381" w:history="1">
+          <w:hyperlink w:anchor="_Toc20319735" w:history="1">
             <w:r>
               <w:rPr>
                 <w:rStyle w:val="Hyperlink"/>
@@ -2603,7 +2601,7 @@
                 <w:noProof/>
                 <w:webHidden/>
               </w:rPr>
-              <w:instrText xml:space="preserve"> PAGEREF _Toc20318381 \h </w:instrText>
+              <w:instrText xml:space="preserve"> PAGEREF _Toc20319735 \h </w:instrText>
             </w:r>
             <w:r>
               <w:rPr>
@@ -2648,7 +2646,7 @@
               <w:lang w:bidi="ar-SA"/>
             </w:rPr>
           </w:pPr>
-          <w:hyperlink w:anchor="_Toc20318382" w:history="1">
+          <w:hyperlink w:anchor="_Toc20319736" w:history="1">
             <w:r>
               <w:rPr>
                 <w:rStyle w:val="Hyperlink"/>
@@ -2675,7 +2673,7 @@
                 <w:noProof/>
                 <w:webHidden/>
               </w:rPr>
-              <w:instrText xml:space="preserve"> PAGEREF _Toc20318382 \h </w:instrText>
+              <w:instrText xml:space="preserve"> PAGEREF _Toc20319736 \h </w:instrText>
             </w:r>
             <w:r>
               <w:rPr>
@@ -2720,7 +2718,7 @@
               <w:lang w:bidi="ar-SA"/>
             </w:rPr>
           </w:pPr>
-          <w:hyperlink w:anchor="_Toc20318383" w:history="1">
+          <w:hyperlink w:anchor="_Toc20319737" w:history="1">
             <w:r>
               <w:rPr>
                 <w:rStyle w:val="Hyperlink"/>
@@ -2747,7 +2745,7 @@
                 <w:noProof/>
                 <w:webHidden/>
               </w:rPr>
-              <w:instrText xml:space="preserve"> PAGEREF _Toc20318383 \h </w:instrText>
+              <w:instrText xml:space="preserve"> PAGEREF _Toc20319737 \h </w:instrText>
             </w:r>
             <w:r>
               <w:rPr>
@@ -2807,12 +2805,12 @@
           <w:numId w:val="4"/>
         </w:numPr>
       </w:pPr>
-      <w:bookmarkStart w:id="1" w:name="_Toc20318363"/>
+      <w:bookmarkStart w:id="0" w:name="_Toc20319717"/>
       <w:r>
         <w:lastRenderedPageBreak/>
         <w:t>INTRODUÇÃO</w:t>
       </w:r>
-      <w:bookmarkEnd w:id="1"/>
+      <w:bookmarkEnd w:id="0"/>
     </w:p>
     <w:p>
       <w:pPr>
@@ -2865,14 +2863,14 @@
       <w:pPr>
         <w:pStyle w:val="Ttulo2"/>
       </w:pPr>
-      <w:bookmarkStart w:id="2" w:name="_Toc20318364"/>
+      <w:bookmarkStart w:id="1" w:name="_Toc20319718"/>
       <w:r>
         <w:t xml:space="preserve">1.1 </w:t>
       </w:r>
       <w:r>
         <w:t>Convenções, Termos e Abreviaturas.</w:t>
       </w:r>
-      <w:bookmarkEnd w:id="2"/>
+      <w:bookmarkEnd w:id="1"/>
     </w:p>
     <w:p>
       <w:pPr>
@@ -3463,11 +3461,11 @@
       <w:r>
         <w:t xml:space="preserve"> </w:t>
       </w:r>
-      <w:bookmarkStart w:id="3" w:name="_Toc20318365"/>
+      <w:bookmarkStart w:id="2" w:name="_Toc20319719"/>
       <w:r>
         <w:t>Referências</w:t>
       </w:r>
-      <w:bookmarkEnd w:id="3"/>
+      <w:bookmarkEnd w:id="2"/>
     </w:p>
     <w:p>
       <w:pPr>
@@ -3732,7 +3730,7 @@
             <w:pPr>
               <w:pStyle w:val="TableParagraph"/>
               <w:spacing w:line="229" w:lineRule="exact"/>
-              <w:jc w:val="center"/>
+              <w:jc w:val="both"/>
               <w:rPr>
                 <w:sz w:val="20"/>
               </w:rPr>
@@ -3742,7 +3740,7 @@
                 <w:sz w:val="20"/>
                 <w:u w:val="single"/>
               </w:rPr>
-              <w:t>Em desenvolvimento...</w:t>
+              <w:t>https://github.com/ryatsuga/cosmos/blob/master/docs/Plano%20de%20Negocios.docx</w:t>
             </w:r>
           </w:p>
         </w:tc>
@@ -3870,7 +3868,7 @@
             <w:pPr>
               <w:pStyle w:val="TableParagraph"/>
               <w:spacing w:line="227" w:lineRule="exact"/>
-              <w:jc w:val="center"/>
+              <w:jc w:val="both"/>
               <w:rPr>
                 <w:sz w:val="20"/>
               </w:rPr>
@@ -3880,7 +3878,7 @@
                 <w:sz w:val="20"/>
                 <w:u w:val="single"/>
               </w:rPr>
-              <w:t>Em desenvolvimento...</w:t>
+              <w:t>https://github.com/ryatsuga/cosmos/blob/master/docs/Documento%20de%20Requisitos.docx</w:t>
             </w:r>
           </w:p>
         </w:tc>
@@ -3924,6 +3922,8 @@
           <w:sz w:val="32"/>
         </w:rPr>
       </w:pPr>
+      <w:bookmarkStart w:id="3" w:name="_GoBack"/>
+      <w:bookmarkEnd w:id="3"/>
     </w:p>
     <w:p>
       <w:pPr>
@@ -4023,7 +4023,7 @@
           <w:numId w:val="4"/>
         </w:numPr>
       </w:pPr>
-      <w:bookmarkStart w:id="4" w:name="_Toc20318366"/>
+      <w:bookmarkStart w:id="4" w:name="_Toc20319720"/>
       <w:r>
         <w:lastRenderedPageBreak/>
         <w:t>REGRAS DE NEGÓCIO</w:t>
@@ -4051,7 +4051,7 @@
           <w:tab w:val="left" w:pos="727"/>
         </w:tabs>
       </w:pPr>
-      <w:bookmarkStart w:id="5" w:name="_Toc20318367"/>
+      <w:bookmarkStart w:id="5" w:name="_Toc20319721"/>
       <w:r>
         <w:t xml:space="preserve">Módulo: </w:t>
       </w:r>
@@ -6263,7 +6263,7 @@
         </w:numPr>
         <w:spacing w:after="240" w:line="360" w:lineRule="auto"/>
       </w:pPr>
-      <w:bookmarkStart w:id="6" w:name="_Toc20318368"/>
+      <w:bookmarkStart w:id="6" w:name="_Toc20319722"/>
       <w:r>
         <w:lastRenderedPageBreak/>
         <w:t>REQUISITOS FUNCIONAIS</w:t>
@@ -6285,7 +6285,7 @@
       <w:r>
         <w:t xml:space="preserve"> </w:t>
       </w:r>
-      <w:bookmarkStart w:id="7" w:name="_Toc20318369"/>
+      <w:bookmarkStart w:id="7" w:name="_Toc20319723"/>
       <w:r>
         <w:t>Processo: Controle de Usuários</w:t>
       </w:r>
@@ -6665,7 +6665,7 @@
       <w:r>
         <w:t xml:space="preserve"> </w:t>
       </w:r>
-      <w:bookmarkStart w:id="8" w:name="_Toc20318370"/>
+      <w:bookmarkStart w:id="8" w:name="_Toc20319724"/>
       <w:r>
         <w:t>Processo: Controle de Negócio</w:t>
       </w:r>
@@ -7150,7 +7150,7 @@
         <w:lastRenderedPageBreak/>
         <w:t xml:space="preserve"> </w:t>
       </w:r>
-      <w:bookmarkStart w:id="9" w:name="_Toc20318371"/>
+      <w:bookmarkStart w:id="9" w:name="_Toc20319725"/>
       <w:r>
         <w:t>Processo: Controle de Ordem de Serviço</w:t>
       </w:r>
@@ -7460,7 +7460,7 @@
         </w:numPr>
         <w:spacing w:after="240" w:line="360" w:lineRule="auto"/>
       </w:pPr>
-      <w:bookmarkStart w:id="10" w:name="_Toc20318372"/>
+      <w:bookmarkStart w:id="10" w:name="_Toc20319726"/>
       <w:r>
         <w:lastRenderedPageBreak/>
         <w:t>REQUISITOS NÃO FUNCIONAIS</w:t>
@@ -8319,7 +8319,6 @@
               </w:rPr>
               <w:t xml:space="preserve">ou </w:t>
             </w:r>
-            <w:proofErr w:type="gramStart"/>
             <w:r>
               <w:rPr>
                 <w:b w:val="0"/>
@@ -8334,17 +8333,8 @@
                 <w:bCs w:val="0"/>
                 <w:sz w:val="20"/>
               </w:rPr>
-              <w:t xml:space="preserve"> </w:t>
-            </w:r>
-            <w:r>
-              <w:rPr>
-                <w:b w:val="0"/>
-                <w:bCs w:val="0"/>
-                <w:sz w:val="20"/>
-              </w:rPr>
               <w:t>;</w:t>
             </w:r>
-            <w:proofErr w:type="gramEnd"/>
             <w:r>
               <w:rPr>
                 <w:b w:val="0"/>
@@ -8578,7 +8568,7 @@
         </w:numPr>
         <w:spacing w:after="240"/>
       </w:pPr>
-      <w:bookmarkStart w:id="11" w:name="_Toc20318373"/>
+      <w:bookmarkStart w:id="11" w:name="_Toc20319727"/>
       <w:r>
         <w:lastRenderedPageBreak/>
         <w:t>REQUISITOS COMPLEMENTARES</w:t>
@@ -8607,7 +8597,7 @@
       <w:r>
         <w:t xml:space="preserve"> </w:t>
       </w:r>
-      <w:bookmarkStart w:id="12" w:name="_Toc20318374"/>
+      <w:bookmarkStart w:id="12" w:name="_Toc20319728"/>
       <w:r>
         <w:t>Processo: Controle de Usuários</w:t>
       </w:r>
@@ -9470,7 +9460,7 @@
       <w:r>
         <w:t xml:space="preserve"> </w:t>
       </w:r>
-      <w:bookmarkStart w:id="13" w:name="_Toc20318375"/>
+      <w:bookmarkStart w:id="13" w:name="_Toc20319729"/>
       <w:r>
         <w:t xml:space="preserve">Processo: Controle de </w:t>
       </w:r>
@@ -9911,7 +9901,7 @@
         <w:lastRenderedPageBreak/>
         <w:t xml:space="preserve"> </w:t>
       </w:r>
-      <w:bookmarkStart w:id="14" w:name="_Toc20318376"/>
+      <w:bookmarkStart w:id="14" w:name="_Toc20319730"/>
       <w:r>
         <w:t xml:space="preserve">Processo: Controle de </w:t>
       </w:r>
@@ -10452,7 +10442,7 @@
         <w:spacing w:after="240"/>
       </w:pPr>
       <w:bookmarkStart w:id="15" w:name="_67yng7u0nqhx" w:colFirst="0" w:colLast="0"/>
-      <w:bookmarkStart w:id="16" w:name="_Toc20318377"/>
+      <w:bookmarkStart w:id="16" w:name="_Toc20319731"/>
       <w:bookmarkEnd w:id="15"/>
       <w:r>
         <w:lastRenderedPageBreak/>
@@ -10482,7 +10472,7 @@
       <w:r>
         <w:t xml:space="preserve"> </w:t>
       </w:r>
-      <w:bookmarkStart w:id="17" w:name="_Toc20318378"/>
+      <w:bookmarkStart w:id="17" w:name="_Toc20319732"/>
       <w:r>
         <w:t>DESCRIÇÃO DE CASO DE USO</w:t>
       </w:r>
@@ -11092,15 +11082,7 @@
                 <w:bCs w:val="0"/>
                 <w:sz w:val="20"/>
               </w:rPr>
-              <w:t>dos negócios</w:t>
-            </w:r>
-            <w:r>
-              <w:rPr>
-                <w:b w:val="0"/>
-                <w:bCs w:val="0"/>
-                <w:sz w:val="20"/>
-              </w:rPr>
-              <w:t>.</w:t>
+              <w:t>dos negócios.</w:t>
             </w:r>
           </w:p>
         </w:tc>
@@ -11681,7 +11663,7 @@
         </w:numPr>
         <w:spacing w:after="240"/>
       </w:pPr>
-      <w:bookmarkStart w:id="18" w:name="_Toc20318379"/>
+      <w:bookmarkStart w:id="18" w:name="_Toc20319733"/>
       <w:r>
         <w:lastRenderedPageBreak/>
         <w:t>DIAGRAMAS</w:t>
@@ -11707,7 +11689,7 @@
         </w:tabs>
         <w:spacing w:after="240" w:line="360" w:lineRule="auto"/>
       </w:pPr>
-      <w:bookmarkStart w:id="19" w:name="_Toc20318380"/>
+      <w:bookmarkStart w:id="19" w:name="_Toc20319734"/>
       <w:r>
         <w:rPr>
           <w:noProof/>
@@ -31091,7 +31073,7 @@
         <w:spacing w:after="240" w:line="360" w:lineRule="auto"/>
         <w:ind w:left="567" w:firstLine="0"/>
       </w:pPr>
-      <w:bookmarkStart w:id="20" w:name="_Toc20318381"/>
+      <w:bookmarkStart w:id="20" w:name="_Toc20319735"/>
       <w:r>
         <w:t>7.2 DIAGRAMA DE CLASSE</w:t>
       </w:r>
@@ -31114,7 +31096,7 @@
         <w:pStyle w:val="Ttulo1"/>
         <w:ind w:left="426"/>
       </w:pPr>
-      <w:bookmarkStart w:id="21" w:name="_Toc20318382"/>
+      <w:bookmarkStart w:id="21" w:name="_Toc20319736"/>
       <w:r>
         <w:t>Em desenvolvimento....</w:t>
       </w:r>
@@ -31137,7 +31119,7 @@
         <w:pStyle w:val="Ttulo1"/>
         <w:ind w:left="426"/>
       </w:pPr>
-      <w:bookmarkStart w:id="22" w:name="_Toc20318383"/>
+      <w:bookmarkStart w:id="22" w:name="_Toc20319737"/>
       <w:r>
         <w:lastRenderedPageBreak/>
         <w:t xml:space="preserve">?. </w:t>
@@ -36724,7 +36706,7 @@
 </file>
 
 <file path=customXml/itemProps1.xml><?xml version="1.0" encoding="utf-8"?>
-<ds:datastoreItem xmlns:ds="http://schemas.openxmlformats.org/officeDocument/2006/customXml" ds:itemID="{B0E3D059-5B96-4F70-86AB-E4AD97E38DF2}">
+<ds:datastoreItem xmlns:ds="http://schemas.openxmlformats.org/officeDocument/2006/customXml" ds:itemID="{1AEE3AA1-A7D1-48CE-BBD4-92C1B354849C}">
   <ds:schemaRefs>
     <ds:schemaRef ds:uri="http://schemas.openxmlformats.org/officeDocument/2006/bibliography"/>
   </ds:schemaRefs>

</xml_diff>

<commit_message>
Documento de Requisitos (versão 2)
Adequações
</commit_message>
<xml_diff>
--- a/docs/Documento de Requisitos.docx
+++ b/docs/Documento de Requisitos.docx
@@ -11,8 +11,6 @@
           <w:rFonts w:ascii="Times New Roman"/>
         </w:rPr>
       </w:pPr>
-      <w:bookmarkStart w:id="0" w:name="_GoBack"/>
-      <w:bookmarkEnd w:id="0"/>
       <w:r>
         <w:rPr>
           <w:rFonts w:ascii="Times New Roman"/>
@@ -541,10 +539,10 @@
         <w:tblLook w:val="01E0" w:firstRow="1" w:lastRow="1" w:firstColumn="1" w:lastColumn="1" w:noHBand="0" w:noVBand="0"/>
       </w:tblPr>
       <w:tblGrid>
-        <w:gridCol w:w="1550"/>
-        <w:gridCol w:w="1080"/>
-        <w:gridCol w:w="4680"/>
-        <w:gridCol w:w="2410"/>
+        <w:gridCol w:w="1579"/>
+        <w:gridCol w:w="1051"/>
+        <w:gridCol w:w="4619"/>
+        <w:gridCol w:w="2471"/>
       </w:tblGrid>
       <w:tr>
         <w:trPr>
@@ -552,7 +550,7 @@
         </w:trPr>
         <w:tc>
           <w:tcPr>
-            <w:tcW w:w="1550" w:type="dxa"/>
+            <w:tcW w:w="1579" w:type="dxa"/>
             <w:shd w:val="clear" w:color="auto" w:fill="D9D9D9"/>
           </w:tcPr>
           <w:p>
@@ -577,7 +575,7 @@
         </w:tc>
         <w:tc>
           <w:tcPr>
-            <w:tcW w:w="1080" w:type="dxa"/>
+            <w:tcW w:w="1051" w:type="dxa"/>
             <w:shd w:val="clear" w:color="auto" w:fill="D9D9D9"/>
           </w:tcPr>
           <w:p>
@@ -602,7 +600,7 @@
         </w:tc>
         <w:tc>
           <w:tcPr>
-            <w:tcW w:w="4680" w:type="dxa"/>
+            <w:tcW w:w="4619" w:type="dxa"/>
             <w:shd w:val="clear" w:color="auto" w:fill="D9D9D9"/>
           </w:tcPr>
           <w:p>
@@ -627,7 +625,7 @@
         </w:tc>
         <w:tc>
           <w:tcPr>
-            <w:tcW w:w="2410" w:type="dxa"/>
+            <w:tcW w:w="2471" w:type="dxa"/>
             <w:shd w:val="clear" w:color="auto" w:fill="D9D9D9"/>
           </w:tcPr>
           <w:p>
@@ -647,6 +645,335 @@
                 <w:sz w:val="20"/>
               </w:rPr>
               <w:t>Autor</w:t>
+            </w:r>
+          </w:p>
+        </w:tc>
+      </w:tr>
+      <w:tr>
+        <w:trPr>
+          <w:trHeight w:val="1984"/>
+        </w:trPr>
+        <w:tc>
+          <w:tcPr>
+            <w:tcW w:w="1579" w:type="dxa"/>
+          </w:tcPr>
+          <w:p>
+            <w:pPr>
+              <w:pStyle w:val="TableParagraph"/>
+              <w:spacing w:line="227" w:lineRule="exact"/>
+              <w:ind w:left="69"/>
+              <w:jc w:val="center"/>
+              <w:rPr>
+                <w:b/>
+                <w:bCs/>
+                <w:sz w:val="20"/>
+              </w:rPr>
+            </w:pPr>
+            <w:r>
+              <w:rPr>
+                <w:b/>
+                <w:bCs/>
+                <w:sz w:val="20"/>
+              </w:rPr>
+              <w:t>15</w:t>
+            </w:r>
+            <w:r>
+              <w:rPr>
+                <w:b/>
+                <w:bCs/>
+                <w:sz w:val="20"/>
+              </w:rPr>
+              <w:t>/</w:t>
+            </w:r>
+            <w:r>
+              <w:rPr>
+                <w:b/>
+                <w:bCs/>
+                <w:sz w:val="20"/>
+              </w:rPr>
+              <w:t>09</w:t>
+            </w:r>
+            <w:r>
+              <w:rPr>
+                <w:b/>
+                <w:bCs/>
+                <w:sz w:val="20"/>
+              </w:rPr>
+              <w:t>/2019</w:t>
+            </w:r>
+          </w:p>
+        </w:tc>
+        <w:tc>
+          <w:tcPr>
+            <w:tcW w:w="1051" w:type="dxa"/>
+          </w:tcPr>
+          <w:p>
+            <w:pPr>
+              <w:pStyle w:val="TableParagraph"/>
+              <w:spacing w:line="227" w:lineRule="exact"/>
+              <w:ind w:left="184" w:right="177"/>
+              <w:jc w:val="center"/>
+              <w:rPr>
+                <w:b/>
+                <w:bCs/>
+                <w:sz w:val="20"/>
+              </w:rPr>
+            </w:pPr>
+            <w:r>
+              <w:rPr>
+                <w:b/>
+                <w:bCs/>
+                <w:sz w:val="20"/>
+              </w:rPr>
+              <w:t>1.0</w:t>
+            </w:r>
+          </w:p>
+        </w:tc>
+        <w:tc>
+          <w:tcPr>
+            <w:tcW w:w="4619" w:type="dxa"/>
+          </w:tcPr>
+          <w:p>
+            <w:pPr>
+              <w:pStyle w:val="TableParagraph"/>
+              <w:spacing w:line="276" w:lineRule="auto"/>
+              <w:ind w:left="70"/>
+              <w:rPr>
+                <w:b/>
+                <w:bCs/>
+                <w:color w:val="000000" w:themeColor="text1"/>
+              </w:rPr>
+            </w:pPr>
+            <w:r>
+              <w:rPr>
+                <w:b/>
+                <w:bCs/>
+                <w:color w:val="000000" w:themeColor="text1"/>
+              </w:rPr>
+              <w:t>Elaboração do Documento</w:t>
+            </w:r>
+            <w:r>
+              <w:rPr>
+                <w:b/>
+                <w:bCs/>
+                <w:color w:val="000000" w:themeColor="text1"/>
+              </w:rPr>
+              <w:t xml:space="preserve">: </w:t>
+            </w:r>
+          </w:p>
+          <w:p>
+            <w:pPr>
+              <w:pStyle w:val="TableParagraph"/>
+              <w:spacing w:line="276" w:lineRule="auto"/>
+              <w:ind w:left="70"/>
+              <w:rPr>
+                <w:color w:val="000000" w:themeColor="text1"/>
+              </w:rPr>
+            </w:pPr>
+          </w:p>
+          <w:p>
+            <w:pPr>
+              <w:pStyle w:val="TableParagraph"/>
+              <w:ind w:left="70"/>
+              <w:rPr>
+                <w:color w:val="000000" w:themeColor="text1"/>
+              </w:rPr>
+            </w:pPr>
+            <w:hyperlink w:anchor="_INTRODUÇÃO" w:history="1">
+              <w:r>
+                <w:rPr>
+                  <w:rStyle w:val="Hyperlink"/>
+                  <w:color w:val="000000" w:themeColor="text1"/>
+                  <w:u w:val="none"/>
+                </w:rPr>
+                <w:t>1.Introdução</w:t>
+              </w:r>
+            </w:hyperlink>
+            <w:r>
+              <w:rPr>
+                <w:color w:val="000000" w:themeColor="text1"/>
+              </w:rPr>
+              <w:t xml:space="preserve"> </w:t>
+            </w:r>
+            <w:r>
+              <w:rPr>
+                <w:color w:val="000000" w:themeColor="text1"/>
+              </w:rPr>
+              <w:t>(</w:t>
+            </w:r>
+            <w:r>
+              <w:rPr>
+                <w:color w:val="000000" w:themeColor="text1"/>
+              </w:rPr>
+              <w:t xml:space="preserve">tópicos </w:t>
+            </w:r>
+            <w:r>
+              <w:rPr>
+                <w:color w:val="000000" w:themeColor="text1"/>
+              </w:rPr>
+              <w:t>1.1 e 1.2)</w:t>
+            </w:r>
+            <w:r>
+              <w:rPr>
+                <w:color w:val="000000" w:themeColor="text1"/>
+              </w:rPr>
+              <w:t>;</w:t>
+            </w:r>
+          </w:p>
+          <w:p>
+            <w:pPr>
+              <w:pStyle w:val="TableParagraph"/>
+              <w:ind w:left="70"/>
+              <w:rPr>
+                <w:color w:val="000000" w:themeColor="text1"/>
+              </w:rPr>
+            </w:pPr>
+            <w:hyperlink w:anchor="_REGRAS_DE_NEGÓCIO" w:history="1">
+              <w:r>
+                <w:rPr>
+                  <w:rStyle w:val="Hyperlink"/>
+                  <w:color w:val="000000" w:themeColor="text1"/>
+                  <w:u w:val="none"/>
+                </w:rPr>
+                <w:t>2.Regras de negócio</w:t>
+              </w:r>
+            </w:hyperlink>
+            <w:r>
+              <w:rPr>
+                <w:color w:val="000000" w:themeColor="text1"/>
+              </w:rPr>
+              <w:t xml:space="preserve"> (</w:t>
+            </w:r>
+            <w:r>
+              <w:rPr>
+                <w:color w:val="000000" w:themeColor="text1"/>
+              </w:rPr>
+              <w:t>m</w:t>
+            </w:r>
+            <w:r>
+              <w:rPr>
+                <w:color w:val="000000" w:themeColor="text1"/>
+              </w:rPr>
+              <w:t>ó</w:t>
+            </w:r>
+            <w:r>
+              <w:rPr>
+                <w:color w:val="000000" w:themeColor="text1"/>
+              </w:rPr>
+              <w:t>dulos</w:t>
+            </w:r>
+            <w:r>
+              <w:rPr>
+                <w:color w:val="000000" w:themeColor="text1"/>
+              </w:rPr>
+              <w:t xml:space="preserve"> 2.1 e 2.2);</w:t>
+            </w:r>
+          </w:p>
+          <w:p>
+            <w:pPr>
+              <w:pStyle w:val="TableParagraph"/>
+              <w:ind w:left="70"/>
+              <w:rPr>
+                <w:color w:val="000000" w:themeColor="text1"/>
+              </w:rPr>
+            </w:pPr>
+            <w:hyperlink w:anchor="_REQUISITOS_FUNCIONAIS" w:history="1">
+              <w:r>
+                <w:rPr>
+                  <w:rStyle w:val="Hyperlink"/>
+                  <w:color w:val="000000" w:themeColor="text1"/>
+                  <w:u w:val="none"/>
+                </w:rPr>
+                <w:t>3.Requisitos funcionais</w:t>
+              </w:r>
+            </w:hyperlink>
+            <w:r>
+              <w:rPr>
+                <w:color w:val="000000" w:themeColor="text1"/>
+              </w:rPr>
+              <w:t xml:space="preserve"> (tópicos 3.1, 3.2 e 3.3); </w:t>
+            </w:r>
+          </w:p>
+          <w:p>
+            <w:pPr>
+              <w:pStyle w:val="TableParagraph"/>
+              <w:ind w:left="70"/>
+              <w:rPr>
+                <w:color w:val="000000" w:themeColor="text1"/>
+              </w:rPr>
+            </w:pPr>
+            <w:hyperlink w:anchor="_REQUISITOS_NÃO_FUNCIONAIS" w:history="1">
+              <w:r>
+                <w:rPr>
+                  <w:rStyle w:val="Hyperlink"/>
+                  <w:color w:val="000000" w:themeColor="text1"/>
+                  <w:u w:val="none"/>
+                </w:rPr>
+                <w:t>4.Requisitos não funcionais</w:t>
+              </w:r>
+            </w:hyperlink>
+            <w:r>
+              <w:rPr>
+                <w:color w:val="000000" w:themeColor="text1"/>
+              </w:rPr>
+              <w:t>;</w:t>
+            </w:r>
+          </w:p>
+          <w:p>
+            <w:pPr>
+              <w:pStyle w:val="TableParagraph"/>
+              <w:ind w:left="70"/>
+              <w:rPr>
+                <w:color w:val="000000" w:themeColor="text1"/>
+                <w:sz w:val="20"/>
+              </w:rPr>
+            </w:pPr>
+            <w:hyperlink w:anchor="_REQUISITOS_COMPLEMENTARES" w:history="1">
+              <w:r>
+                <w:rPr>
+                  <w:rStyle w:val="Hyperlink"/>
+                  <w:color w:val="000000" w:themeColor="text1"/>
+                  <w:u w:val="none"/>
+                </w:rPr>
+                <w:t>5.Requisitos complementares</w:t>
+              </w:r>
+            </w:hyperlink>
+            <w:r>
+              <w:rPr>
+                <w:color w:val="000000" w:themeColor="text1"/>
+              </w:rPr>
+              <w:t xml:space="preserve"> (tópicos 5.1, 5.2 e 5.3)</w:t>
+            </w:r>
+            <w:r>
+              <w:rPr>
+                <w:color w:val="000000" w:themeColor="text1"/>
+              </w:rPr>
+              <w:t>.</w:t>
+            </w:r>
+          </w:p>
+        </w:tc>
+        <w:tc>
+          <w:tcPr>
+            <w:tcW w:w="2471" w:type="dxa"/>
+          </w:tcPr>
+          <w:p>
+            <w:pPr>
+              <w:pStyle w:val="TableParagraph"/>
+              <w:spacing w:line="227" w:lineRule="exact"/>
+              <w:ind w:left="70"/>
+              <w:rPr>
+                <w:b/>
+                <w:bCs/>
+                <w:sz w:val="20"/>
+              </w:rPr>
+            </w:pPr>
+            <w:r>
+              <w:rPr>
+                <w:b/>
+                <w:bCs/>
+                <w:sz w:val="20"/>
+              </w:rPr>
+              <w:t>Leandro Passos</w:t>
             </w:r>
           </w:p>
         </w:tc>
@@ -657,46 +984,33 @@
         </w:trPr>
         <w:tc>
           <w:tcPr>
-            <w:tcW w:w="1550" w:type="dxa"/>
+            <w:tcW w:w="1579" w:type="dxa"/>
           </w:tcPr>
           <w:p>
             <w:pPr>
               <w:pStyle w:val="TableParagraph"/>
               <w:spacing w:line="227" w:lineRule="exact"/>
               <w:ind w:left="69"/>
-              <w:rPr>
+              <w:jc w:val="center"/>
+              <w:rPr>
+                <w:b/>
+                <w:bCs/>
                 <w:sz w:val="20"/>
               </w:rPr>
             </w:pPr>
             <w:r>
               <w:rPr>
-                <w:sz w:val="20"/>
-              </w:rPr>
-              <w:t>15</w:t>
-            </w:r>
-            <w:r>
-              <w:rPr>
-                <w:sz w:val="20"/>
-              </w:rPr>
-              <w:t>/</w:t>
-            </w:r>
-            <w:r>
-              <w:rPr>
-                <w:sz w:val="20"/>
-              </w:rPr>
-              <w:t>09</w:t>
-            </w:r>
-            <w:r>
-              <w:rPr>
-                <w:sz w:val="20"/>
-              </w:rPr>
-              <w:t>/2019</w:t>
+                <w:b/>
+                <w:bCs/>
+                <w:sz w:val="20"/>
+              </w:rPr>
+              <w:t>25/09/2019</w:t>
             </w:r>
           </w:p>
         </w:tc>
         <w:tc>
           <w:tcPr>
-            <w:tcW w:w="1080" w:type="dxa"/>
+            <w:tcW w:w="1051" w:type="dxa"/>
           </w:tcPr>
           <w:p>
             <w:pPr>
@@ -712,13 +1026,337 @@
               <w:rPr>
                 <w:sz w:val="20"/>
               </w:rPr>
-              <w:t>1.0</w:t>
+              <w:t>1</w:t>
+            </w:r>
+            <w:r>
+              <w:rPr>
+                <w:sz w:val="20"/>
+              </w:rPr>
+              <w:t>.</w:t>
+            </w:r>
+            <w:r>
+              <w:rPr>
+                <w:sz w:val="20"/>
+              </w:rPr>
+              <w:t>1</w:t>
             </w:r>
           </w:p>
         </w:tc>
         <w:tc>
           <w:tcPr>
-            <w:tcW w:w="4680" w:type="dxa"/>
+            <w:tcW w:w="4619" w:type="dxa"/>
+          </w:tcPr>
+          <w:p>
+            <w:pPr>
+              <w:pStyle w:val="TableParagraph"/>
+              <w:ind w:left="70"/>
+              <w:rPr>
+                <w:b/>
+                <w:bCs/>
+                <w:color w:val="000000" w:themeColor="text1"/>
+              </w:rPr>
+            </w:pPr>
+            <w:r>
+              <w:rPr>
+                <w:b/>
+                <w:bCs/>
+                <w:color w:val="000000" w:themeColor="text1"/>
+              </w:rPr>
+              <w:t>Atualização do Documento</w:t>
+            </w:r>
+            <w:r>
+              <w:rPr>
+                <w:b/>
+                <w:bCs/>
+                <w:color w:val="000000" w:themeColor="text1"/>
+              </w:rPr>
+              <w:t>:</w:t>
+            </w:r>
+          </w:p>
+          <w:p>
+            <w:pPr>
+              <w:pStyle w:val="TableParagraph"/>
+              <w:ind w:left="70"/>
+              <w:rPr>
+                <w:color w:val="000000" w:themeColor="text1"/>
+              </w:rPr>
+            </w:pPr>
+          </w:p>
+          <w:p>
+            <w:pPr>
+              <w:pStyle w:val="TableParagraph"/>
+              <w:ind w:left="70"/>
+              <w:rPr>
+                <w:color w:val="000000" w:themeColor="text1"/>
+              </w:rPr>
+            </w:pPr>
+            <w:hyperlink w:anchor="_REGRAS_DE_NEGÓCIO" w:history="1">
+              <w:r>
+                <w:rPr>
+                  <w:rStyle w:val="Hyperlink"/>
+                  <w:color w:val="000000" w:themeColor="text1"/>
+                  <w:u w:val="none"/>
+                </w:rPr>
+                <w:t>1.Introdução</w:t>
+              </w:r>
+            </w:hyperlink>
+            <w:r>
+              <w:rPr>
+                <w:color w:val="000000" w:themeColor="text1"/>
+              </w:rPr>
+              <w:t xml:space="preserve"> (inserção de hiperlinks no tópico 1.2);</w:t>
+            </w:r>
+          </w:p>
+          <w:p>
+            <w:pPr>
+              <w:pStyle w:val="TableParagraph"/>
+              <w:ind w:left="70"/>
+              <w:rPr>
+                <w:color w:val="000000" w:themeColor="text1"/>
+              </w:rPr>
+            </w:pPr>
+            <w:hyperlink w:anchor="_REGRAS_DE_NEGÓCIO" w:history="1">
+              <w:r>
+                <w:rPr>
+                  <w:rStyle w:val="Hyperlink"/>
+                  <w:color w:val="000000" w:themeColor="text1"/>
+                  <w:u w:val="none"/>
+                </w:rPr>
+                <w:t>2.Regras de negócio</w:t>
+              </w:r>
+            </w:hyperlink>
+            <w:r>
+              <w:rPr>
+                <w:color w:val="000000" w:themeColor="text1"/>
+              </w:rPr>
+              <w:t xml:space="preserve"> (</w:t>
+            </w:r>
+            <w:r>
+              <w:rPr>
+                <w:color w:val="000000" w:themeColor="text1"/>
+              </w:rPr>
+              <w:t xml:space="preserve">alteração na RNG004 no </w:t>
+            </w:r>
+            <w:r>
+              <w:rPr>
+                <w:color w:val="000000" w:themeColor="text1"/>
+              </w:rPr>
+              <w:t>m</w:t>
+            </w:r>
+            <w:r>
+              <w:rPr>
+                <w:color w:val="000000" w:themeColor="text1"/>
+              </w:rPr>
+              <w:t>ó</w:t>
+            </w:r>
+            <w:r>
+              <w:rPr>
+                <w:color w:val="000000" w:themeColor="text1"/>
+              </w:rPr>
+              <w:t>dulo</w:t>
+            </w:r>
+            <w:r>
+              <w:rPr>
+                <w:color w:val="000000" w:themeColor="text1"/>
+              </w:rPr>
+              <w:t xml:space="preserve"> 2.1 e elaboração da RGN008</w:t>
+            </w:r>
+            <w:r>
+              <w:rPr>
+                <w:color w:val="000000" w:themeColor="text1"/>
+              </w:rPr>
+              <w:t xml:space="preserve"> e </w:t>
+            </w:r>
+            <w:r>
+              <w:rPr>
+                <w:color w:val="000000" w:themeColor="text1"/>
+              </w:rPr>
+              <w:t>009)</w:t>
+            </w:r>
+            <w:r>
+              <w:rPr>
+                <w:color w:val="000000" w:themeColor="text1"/>
+              </w:rPr>
+              <w:t>;</w:t>
+            </w:r>
+          </w:p>
+          <w:p>
+            <w:pPr>
+              <w:pStyle w:val="TableParagraph"/>
+              <w:ind w:left="70"/>
+              <w:rPr>
+                <w:color w:val="000000" w:themeColor="text1"/>
+              </w:rPr>
+            </w:pPr>
+            <w:hyperlink w:anchor="_REQUISITOS_FUNCIONAIS" w:history="1">
+              <w:r>
+                <w:rPr>
+                  <w:rStyle w:val="Hyperlink"/>
+                  <w:color w:val="000000" w:themeColor="text1"/>
+                  <w:u w:val="none"/>
+                </w:rPr>
+                <w:t>3.Requisitos funcionais</w:t>
+              </w:r>
+            </w:hyperlink>
+            <w:r>
+              <w:rPr>
+                <w:color w:val="000000" w:themeColor="text1"/>
+              </w:rPr>
+              <w:t xml:space="preserve"> (eliminação de redundâncias nos processos 3.1, 3.2 e 3.3)</w:t>
+            </w:r>
+            <w:r>
+              <w:rPr>
+                <w:color w:val="000000" w:themeColor="text1"/>
+              </w:rPr>
+              <w:t>;</w:t>
+            </w:r>
+          </w:p>
+          <w:p>
+            <w:pPr>
+              <w:pStyle w:val="TableParagraph"/>
+              <w:ind w:left="70"/>
+              <w:rPr>
+                <w:color w:val="000000" w:themeColor="text1"/>
+              </w:rPr>
+            </w:pPr>
+            <w:hyperlink w:anchor="_REQUISITOS_NÃO_FUNCIONAIS" w:history="1">
+              <w:r>
+                <w:rPr>
+                  <w:rStyle w:val="Hyperlink"/>
+                  <w:color w:val="000000" w:themeColor="text1"/>
+                  <w:u w:val="none"/>
+                </w:rPr>
+                <w:t>4.Requisitos não funcionais</w:t>
+              </w:r>
+            </w:hyperlink>
+            <w:r>
+              <w:rPr>
+                <w:color w:val="000000" w:themeColor="text1"/>
+              </w:rPr>
+              <w:t xml:space="preserve"> (elaboração da RNF_Q006).</w:t>
+            </w:r>
+          </w:p>
+          <w:p>
+            <w:pPr>
+              <w:pStyle w:val="TableParagraph"/>
+              <w:ind w:left="70"/>
+              <w:rPr>
+                <w:color w:val="000000" w:themeColor="text1"/>
+              </w:rPr>
+            </w:pPr>
+            <w:hyperlink w:anchor="_REQUISITOS_COMPLEMENTARES" w:history="1">
+              <w:r>
+                <w:rPr>
+                  <w:rStyle w:val="Hyperlink"/>
+                  <w:color w:val="000000" w:themeColor="text1"/>
+                  <w:u w:val="none"/>
+                </w:rPr>
+                <w:t>5. Requisitos complementares</w:t>
+              </w:r>
+            </w:hyperlink>
+            <w:r>
+              <w:rPr>
+                <w:color w:val="000000" w:themeColor="text1"/>
+              </w:rPr>
+              <w:t xml:space="preserve"> (elaboração dos processos </w:t>
+            </w:r>
+            <w:r>
+              <w:rPr>
+                <w:color w:val="000000" w:themeColor="text1"/>
+              </w:rPr>
+              <w:t>5</w:t>
+            </w:r>
+            <w:r>
+              <w:rPr>
+                <w:color w:val="000000" w:themeColor="text1"/>
+              </w:rPr>
+              <w:t xml:space="preserve">.2 e </w:t>
+            </w:r>
+            <w:r>
+              <w:rPr>
+                <w:color w:val="000000" w:themeColor="text1"/>
+              </w:rPr>
+              <w:t>5</w:t>
+            </w:r>
+            <w:r>
+              <w:rPr>
+                <w:color w:val="000000" w:themeColor="text1"/>
+              </w:rPr>
+              <w:t>.3</w:t>
+            </w:r>
+            <w:r>
+              <w:rPr>
+                <w:color w:val="000000" w:themeColor="text1"/>
+              </w:rPr>
+              <w:t>)</w:t>
+            </w:r>
+          </w:p>
+          <w:p>
+            <w:pPr>
+              <w:pStyle w:val="TableParagraph"/>
+              <w:ind w:left="70"/>
+              <w:rPr>
+                <w:color w:val="000000" w:themeColor="text1"/>
+              </w:rPr>
+            </w:pPr>
+            <w:hyperlink w:anchor="_CASOS_DE_USO" w:history="1">
+              <w:r>
+                <w:rPr>
+                  <w:rStyle w:val="Hyperlink"/>
+                  <w:color w:val="000000" w:themeColor="text1"/>
+                  <w:u w:val="none"/>
+                </w:rPr>
+                <w:t>6. Casos de Uso</w:t>
+              </w:r>
+            </w:hyperlink>
+            <w:r>
+              <w:rPr>
+                <w:color w:val="000000" w:themeColor="text1"/>
+              </w:rPr>
+              <w:t xml:space="preserve"> (elaboração da descrição dos casos de uso – 6.1)</w:t>
+            </w:r>
+          </w:p>
+          <w:p>
+            <w:pPr>
+              <w:pStyle w:val="TableParagraph"/>
+              <w:ind w:left="70"/>
+              <w:rPr>
+                <w:color w:val="000000" w:themeColor="text1"/>
+              </w:rPr>
+            </w:pPr>
+            <w:hyperlink w:anchor="_DIAGRAMAS" w:history="1">
+              <w:r>
+                <w:rPr>
+                  <w:rStyle w:val="Hyperlink"/>
+                  <w:color w:val="000000" w:themeColor="text1"/>
+                  <w:u w:val="none"/>
+                </w:rPr>
+                <w:t>7. Diagramas</w:t>
+              </w:r>
+            </w:hyperlink>
+            <w:r>
+              <w:rPr>
+                <w:color w:val="000000" w:themeColor="text1"/>
+              </w:rPr>
+              <w:t xml:space="preserve"> (elaboração do diagrama de casos de uso – 7.1)</w:t>
+            </w:r>
+          </w:p>
+          <w:p>
+            <w:pPr>
+              <w:pStyle w:val="TableParagraph"/>
+              <w:spacing w:line="227" w:lineRule="exact"/>
+              <w:ind w:left="70"/>
+              <w:jc w:val="both"/>
+              <w:rPr>
+                <w:color w:val="000000" w:themeColor="text1"/>
+                <w:sz w:val="20"/>
+              </w:rPr>
+            </w:pPr>
+          </w:p>
+        </w:tc>
+        <w:tc>
+          <w:tcPr>
+            <w:tcW w:w="2471" w:type="dxa"/>
           </w:tcPr>
           <w:p>
             <w:pPr>
@@ -726,35 +1364,18 @@
               <w:spacing w:line="227" w:lineRule="exact"/>
               <w:ind w:left="70"/>
               <w:rPr>
+                <w:b/>
+                <w:bCs/>
                 <w:sz w:val="20"/>
               </w:rPr>
             </w:pPr>
             <w:r>
               <w:rPr>
-                <w:sz w:val="20"/>
-              </w:rPr>
-              <w:t>Elaboração do Documento</w:t>
-            </w:r>
-          </w:p>
-        </w:tc>
-        <w:tc>
-          <w:tcPr>
-            <w:tcW w:w="2410" w:type="dxa"/>
-          </w:tcPr>
-          <w:p>
-            <w:pPr>
-              <w:pStyle w:val="TableParagraph"/>
-              <w:spacing w:line="227" w:lineRule="exact"/>
-              <w:ind w:left="70"/>
-              <w:rPr>
-                <w:sz w:val="20"/>
-              </w:rPr>
-            </w:pPr>
-            <w:r>
-              <w:rPr>
-                <w:sz w:val="20"/>
-              </w:rPr>
-              <w:t>Leandro Passos</w:t>
+                <w:b/>
+                <w:bCs/>
+                <w:sz w:val="20"/>
+              </w:rPr>
+              <w:t>Guilherme Andrade</w:t>
             </w:r>
           </w:p>
         </w:tc>
@@ -765,28 +1386,33 @@
         </w:trPr>
         <w:tc>
           <w:tcPr>
-            <w:tcW w:w="1550" w:type="dxa"/>
+            <w:tcW w:w="1579" w:type="dxa"/>
           </w:tcPr>
           <w:p>
             <w:pPr>
               <w:pStyle w:val="TableParagraph"/>
               <w:spacing w:line="227" w:lineRule="exact"/>
               <w:ind w:left="69"/>
-              <w:rPr>
+              <w:jc w:val="center"/>
+              <w:rPr>
+                <w:b/>
+                <w:bCs/>
                 <w:sz w:val="20"/>
               </w:rPr>
             </w:pPr>
             <w:r>
               <w:rPr>
-                <w:sz w:val="20"/>
-              </w:rPr>
-              <w:t>25/09/2019</w:t>
+                <w:b/>
+                <w:bCs/>
+                <w:sz w:val="20"/>
+              </w:rPr>
+              <w:t>14/10/2019</w:t>
             </w:r>
           </w:p>
         </w:tc>
         <w:tc>
           <w:tcPr>
-            <w:tcW w:w="1080" w:type="dxa"/>
+            <w:tcW w:w="1051" w:type="dxa"/>
           </w:tcPr>
           <w:p>
             <w:pPr>
@@ -795,32 +1421,151 @@
               <w:ind w:left="184" w:right="177"/>
               <w:jc w:val="center"/>
               <w:rPr>
+                <w:b/>
+                <w:bCs/>
                 <w:sz w:val="20"/>
               </w:rPr>
             </w:pPr>
             <w:r>
               <w:rPr>
-                <w:sz w:val="20"/>
-              </w:rPr>
-              <w:t>1</w:t>
-            </w:r>
-            <w:r>
-              <w:rPr>
-                <w:sz w:val="20"/>
-              </w:rPr>
-              <w:t>.</w:t>
-            </w:r>
-            <w:r>
-              <w:rPr>
-                <w:sz w:val="20"/>
-              </w:rPr>
-              <w:t>1</w:t>
+                <w:b/>
+                <w:bCs/>
+                <w:sz w:val="20"/>
+              </w:rPr>
+              <w:t>2.0</w:t>
             </w:r>
           </w:p>
         </w:tc>
         <w:tc>
           <w:tcPr>
-            <w:tcW w:w="4680" w:type="dxa"/>
+            <w:tcW w:w="4619" w:type="dxa"/>
+          </w:tcPr>
+          <w:p>
+            <w:pPr>
+              <w:pStyle w:val="TableParagraph"/>
+              <w:ind w:left="70"/>
+              <w:rPr>
+                <w:b/>
+                <w:bCs/>
+                <w:color w:val="000000" w:themeColor="text1"/>
+              </w:rPr>
+            </w:pPr>
+            <w:r>
+              <w:rPr>
+                <w:b/>
+                <w:bCs/>
+                <w:color w:val="000000" w:themeColor="text1"/>
+              </w:rPr>
+              <w:t>Revisão do Documento:</w:t>
+            </w:r>
+          </w:p>
+          <w:p>
+            <w:pPr>
+              <w:pStyle w:val="TableParagraph"/>
+              <w:ind w:left="70"/>
+              <w:rPr>
+                <w:b/>
+                <w:bCs/>
+                <w:color w:val="000000" w:themeColor="text1"/>
+              </w:rPr>
+            </w:pPr>
+          </w:p>
+          <w:p>
+            <w:pPr>
+              <w:pStyle w:val="TableParagraph"/>
+              <w:ind w:left="70"/>
+              <w:rPr>
+                <w:color w:val="000000" w:themeColor="text1"/>
+              </w:rPr>
+            </w:pPr>
+            <w:hyperlink w:anchor="_REGRAS_DE_NEGÓCIO" w:history="1">
+              <w:r>
+                <w:rPr>
+                  <w:rStyle w:val="Hyperlink"/>
+                  <w:color w:val="000000" w:themeColor="text1"/>
+                  <w:u w:val="none"/>
+                </w:rPr>
+                <w:t>2.Regras de negócio</w:t>
+              </w:r>
+            </w:hyperlink>
+            <w:r>
+              <w:rPr>
+                <w:color w:val="000000" w:themeColor="text1"/>
+              </w:rPr>
+              <w:t xml:space="preserve"> (alteração da RNG006 no módulo 2.2 para adequação em relação aos parâmetros do sistema);</w:t>
+            </w:r>
+          </w:p>
+          <w:p>
+            <w:pPr>
+              <w:pStyle w:val="TableParagraph"/>
+              <w:ind w:left="70"/>
+              <w:rPr>
+                <w:color w:val="000000" w:themeColor="text1"/>
+              </w:rPr>
+            </w:pPr>
+            <w:hyperlink w:anchor="_REQUISITOS_NÃO_FUNCIONAIS" w:history="1">
+              <w:r>
+                <w:rPr>
+                  <w:rStyle w:val="Hyperlink"/>
+                  <w:color w:val="000000" w:themeColor="text1"/>
+                  <w:u w:val="none"/>
+                </w:rPr>
+                <w:t>4.Requisitos não funcionais</w:t>
+              </w:r>
+            </w:hyperlink>
+            <w:r>
+              <w:rPr>
+                <w:color w:val="000000" w:themeColor="text1"/>
+              </w:rPr>
+              <w:t xml:space="preserve"> (alteração da RNF_Q004 para adequação em relação aos parâmetros do sistema);</w:t>
+            </w:r>
+          </w:p>
+          <w:p>
+            <w:pPr>
+              <w:pStyle w:val="TableParagraph"/>
+              <w:ind w:left="70"/>
+              <w:rPr>
+                <w:color w:val="000000" w:themeColor="text1"/>
+              </w:rPr>
+            </w:pPr>
+          </w:p>
+          <w:p>
+            <w:pPr>
+              <w:pStyle w:val="TableParagraph"/>
+              <w:ind w:left="70"/>
+              <w:rPr>
+                <w:b/>
+                <w:bCs/>
+                <w:color w:val="000000" w:themeColor="text1"/>
+              </w:rPr>
+            </w:pPr>
+          </w:p>
+          <w:p>
+            <w:pPr>
+              <w:pStyle w:val="TableParagraph"/>
+              <w:ind w:left="70"/>
+              <w:rPr>
+                <w:b/>
+                <w:bCs/>
+                <w:color w:val="000000" w:themeColor="text1"/>
+              </w:rPr>
+            </w:pPr>
+          </w:p>
+          <w:p>
+            <w:pPr>
+              <w:pStyle w:val="TableParagraph"/>
+              <w:ind w:left="70"/>
+              <w:rPr>
+                <w:b/>
+                <w:bCs/>
+                <w:color w:val="000000" w:themeColor="text1"/>
+              </w:rPr>
+            </w:pPr>
+          </w:p>
+        </w:tc>
+        <w:tc>
+          <w:tcPr>
+            <w:tcW w:w="2471" w:type="dxa"/>
           </w:tcPr>
           <w:p>
             <w:pPr>
@@ -828,32 +1573,15 @@
               <w:spacing w:line="227" w:lineRule="exact"/>
               <w:ind w:left="70"/>
               <w:rPr>
+                <w:b/>
+                <w:bCs/>
                 <w:sz w:val="20"/>
               </w:rPr>
             </w:pPr>
             <w:r>
               <w:rPr>
-                <w:sz w:val="20"/>
-              </w:rPr>
-              <w:t>Atualização do Documento</w:t>
-            </w:r>
-          </w:p>
-        </w:tc>
-        <w:tc>
-          <w:tcPr>
-            <w:tcW w:w="2410" w:type="dxa"/>
-          </w:tcPr>
-          <w:p>
-            <w:pPr>
-              <w:pStyle w:val="TableParagraph"/>
-              <w:spacing w:line="227" w:lineRule="exact"/>
-              <w:ind w:left="70"/>
-              <w:rPr>
-                <w:sz w:val="20"/>
-              </w:rPr>
-            </w:pPr>
-            <w:r>
-              <w:rPr>
+                <w:b/>
+                <w:bCs/>
                 <w:sz w:val="20"/>
               </w:rPr>
               <w:t>Guilherme Andrade</w:t>
@@ -942,7 +1670,6 @@
           <w:docPartUnique/>
         </w:docPartObj>
       </w:sdtPr>
-      <w:sdtEndPr/>
       <w:sdtContent>
         <w:p>
           <w:pPr>
@@ -951,6 +1678,8 @@
           <w:r>
             <w:t>Sumário</w:t>
           </w:r>
+          <w:bookmarkStart w:id="0" w:name="_GoBack"/>
+          <w:bookmarkEnd w:id="0"/>
         </w:p>
         <w:p>
           <w:pPr>
@@ -976,7 +1705,7 @@
           <w:r>
             <w:fldChar w:fldCharType="separate"/>
           </w:r>
-          <w:hyperlink w:anchor="_Toc20319717" w:history="1">
+          <w:hyperlink w:anchor="_Toc22101894" w:history="1">
             <w:r>
               <w:rPr>
                 <w:rStyle w:val="Hyperlink"/>
@@ -1020,7 +1749,7 @@
                 <w:noProof/>
                 <w:webHidden/>
               </w:rPr>
-              <w:instrText xml:space="preserve"> PAGEREF _Toc20319717 \h </w:instrText>
+              <w:instrText xml:space="preserve"> PAGEREF _Toc22101894 \h </w:instrText>
             </w:r>
             <w:r>
               <w:rPr>
@@ -1065,7 +1794,7 @@
               <w:lang w:bidi="ar-SA"/>
             </w:rPr>
           </w:pPr>
-          <w:hyperlink w:anchor="_Toc20319718" w:history="1">
+          <w:hyperlink w:anchor="_Toc22101895" w:history="1">
             <w:r>
               <w:rPr>
                 <w:rStyle w:val="Hyperlink"/>
@@ -1092,7 +1821,7 @@
                 <w:noProof/>
                 <w:webHidden/>
               </w:rPr>
-              <w:instrText xml:space="preserve"> PAGEREF _Toc20319718 \h </w:instrText>
+              <w:instrText xml:space="preserve"> PAGEREF _Toc22101895 \h </w:instrText>
             </w:r>
             <w:r>
               <w:rPr>
@@ -1138,7 +1867,7 @@
               <w:lang w:bidi="ar-SA"/>
             </w:rPr>
           </w:pPr>
-          <w:hyperlink w:anchor="_Toc20319719" w:history="1">
+          <w:hyperlink w:anchor="_Toc22101896" w:history="1">
             <w:r>
               <w:rPr>
                 <w:rStyle w:val="Hyperlink"/>
@@ -1182,7 +1911,7 @@
                 <w:noProof/>
                 <w:webHidden/>
               </w:rPr>
-              <w:instrText xml:space="preserve"> PAGEREF _Toc20319719 \h </w:instrText>
+              <w:instrText xml:space="preserve"> PAGEREF _Toc22101896 \h </w:instrText>
             </w:r>
             <w:r>
               <w:rPr>
@@ -1228,7 +1957,7 @@
               <w:lang w:bidi="ar-SA"/>
             </w:rPr>
           </w:pPr>
-          <w:hyperlink w:anchor="_Toc20319720" w:history="1">
+          <w:hyperlink w:anchor="_Toc22101897" w:history="1">
             <w:r>
               <w:rPr>
                 <w:rStyle w:val="Hyperlink"/>
@@ -1272,7 +2001,7 @@
                 <w:noProof/>
                 <w:webHidden/>
               </w:rPr>
-              <w:instrText xml:space="preserve"> PAGEREF _Toc20319720 \h </w:instrText>
+              <w:instrText xml:space="preserve"> PAGEREF _Toc22101897 \h </w:instrText>
             </w:r>
             <w:r>
               <w:rPr>
@@ -1318,7 +2047,7 @@
               <w:lang w:bidi="ar-SA"/>
             </w:rPr>
           </w:pPr>
-          <w:hyperlink w:anchor="_Toc20319721" w:history="1">
+          <w:hyperlink w:anchor="_Toc22101898" w:history="1">
             <w:r>
               <w:rPr>
                 <w:rStyle w:val="Hyperlink"/>
@@ -1362,7 +2091,7 @@
                 <w:noProof/>
                 <w:webHidden/>
               </w:rPr>
-              <w:instrText xml:space="preserve"> PAGEREF _Toc20319721 \h </w:instrText>
+              <w:instrText xml:space="preserve"> PAGEREF _Toc22101898 \h </w:instrText>
             </w:r>
             <w:r>
               <w:rPr>
@@ -1383,6 +2112,190 @@
                 <w:webHidden/>
               </w:rPr>
               <w:t>5</w:t>
+            </w:r>
+            <w:r>
+              <w:rPr>
+                <w:noProof/>
+                <w:webHidden/>
+              </w:rPr>
+              <w:fldChar w:fldCharType="end"/>
+            </w:r>
+          </w:hyperlink>
+        </w:p>
+        <w:p>
+          <w:pPr>
+            <w:pStyle w:val="Sumrio2"/>
+            <w:tabs>
+              <w:tab w:val="left" w:pos="1320"/>
+              <w:tab w:val="right" w:leader="dot" w:pos="10170"/>
+            </w:tabs>
+            <w:rPr>
+              <w:rFonts w:asciiTheme="minorHAnsi" w:eastAsiaTheme="minorEastAsia" w:hAnsiTheme="minorHAnsi" w:cstheme="minorBidi"/>
+              <w:noProof/>
+              <w:sz w:val="22"/>
+              <w:szCs w:val="22"/>
+              <w:lang w:bidi="ar-SA"/>
+            </w:rPr>
+          </w:pPr>
+          <w:hyperlink w:anchor="_Toc22101899" w:history="1">
+            <w:r>
+              <w:rPr>
+                <w:rStyle w:val="Hyperlink"/>
+                <w:b/>
+                <w:noProof/>
+              </w:rPr>
+              <w:t>2.2</w:t>
+            </w:r>
+            <w:r>
+              <w:rPr>
+                <w:rFonts w:asciiTheme="minorHAnsi" w:eastAsiaTheme="minorEastAsia" w:hAnsiTheme="minorHAnsi" w:cstheme="minorBidi"/>
+                <w:noProof/>
+                <w:sz w:val="22"/>
+                <w:szCs w:val="22"/>
+                <w:lang w:bidi="ar-SA"/>
+              </w:rPr>
+              <w:tab/>
+            </w:r>
+            <w:r>
+              <w:rPr>
+                <w:rStyle w:val="Hyperlink"/>
+                <w:b/>
+                <w:noProof/>
+              </w:rPr>
+              <w:t>Módulo: Gestão de Negócio</w:t>
+            </w:r>
+            <w:r>
+              <w:rPr>
+                <w:noProof/>
+                <w:webHidden/>
+              </w:rPr>
+              <w:tab/>
+            </w:r>
+            <w:r>
+              <w:rPr>
+                <w:noProof/>
+                <w:webHidden/>
+              </w:rPr>
+              <w:fldChar w:fldCharType="begin"/>
+            </w:r>
+            <w:r>
+              <w:rPr>
+                <w:noProof/>
+                <w:webHidden/>
+              </w:rPr>
+              <w:instrText xml:space="preserve"> PAGEREF _Toc22101899 \h </w:instrText>
+            </w:r>
+            <w:r>
+              <w:rPr>
+                <w:noProof/>
+                <w:webHidden/>
+              </w:rPr>
+            </w:r>
+            <w:r>
+              <w:rPr>
+                <w:noProof/>
+                <w:webHidden/>
+              </w:rPr>
+              <w:fldChar w:fldCharType="separate"/>
+            </w:r>
+            <w:r>
+              <w:rPr>
+                <w:noProof/>
+                <w:webHidden/>
+              </w:rPr>
+              <w:t>5</w:t>
+            </w:r>
+            <w:r>
+              <w:rPr>
+                <w:noProof/>
+                <w:webHidden/>
+              </w:rPr>
+              <w:fldChar w:fldCharType="end"/>
+            </w:r>
+          </w:hyperlink>
+        </w:p>
+        <w:p>
+          <w:pPr>
+            <w:pStyle w:val="Sumrio2"/>
+            <w:tabs>
+              <w:tab w:val="left" w:pos="1320"/>
+              <w:tab w:val="right" w:leader="dot" w:pos="10170"/>
+            </w:tabs>
+            <w:rPr>
+              <w:rFonts w:asciiTheme="minorHAnsi" w:eastAsiaTheme="minorEastAsia" w:hAnsiTheme="minorHAnsi" w:cstheme="minorBidi"/>
+              <w:noProof/>
+              <w:sz w:val="22"/>
+              <w:szCs w:val="22"/>
+              <w:lang w:bidi="ar-SA"/>
+            </w:rPr>
+          </w:pPr>
+          <w:hyperlink w:anchor="_Toc22101900" w:history="1">
+            <w:r>
+              <w:rPr>
+                <w:rStyle w:val="Hyperlink"/>
+                <w:b/>
+                <w:noProof/>
+              </w:rPr>
+              <w:t>2.3</w:t>
+            </w:r>
+            <w:r>
+              <w:rPr>
+                <w:rFonts w:asciiTheme="minorHAnsi" w:eastAsiaTheme="minorEastAsia" w:hAnsiTheme="minorHAnsi" w:cstheme="minorBidi"/>
+                <w:noProof/>
+                <w:sz w:val="22"/>
+                <w:szCs w:val="22"/>
+                <w:lang w:bidi="ar-SA"/>
+              </w:rPr>
+              <w:tab/>
+            </w:r>
+            <w:r>
+              <w:rPr>
+                <w:rStyle w:val="Hyperlink"/>
+                <w:b/>
+                <w:noProof/>
+              </w:rPr>
+              <w:t>Módulo: Gestão de Ordem de Serviço</w:t>
+            </w:r>
+            <w:r>
+              <w:rPr>
+                <w:noProof/>
+                <w:webHidden/>
+              </w:rPr>
+              <w:tab/>
+            </w:r>
+            <w:r>
+              <w:rPr>
+                <w:noProof/>
+                <w:webHidden/>
+              </w:rPr>
+              <w:fldChar w:fldCharType="begin"/>
+            </w:r>
+            <w:r>
+              <w:rPr>
+                <w:noProof/>
+                <w:webHidden/>
+              </w:rPr>
+              <w:instrText xml:space="preserve"> PAGEREF _Toc22101900 \h </w:instrText>
+            </w:r>
+            <w:r>
+              <w:rPr>
+                <w:noProof/>
+                <w:webHidden/>
+              </w:rPr>
+            </w:r>
+            <w:r>
+              <w:rPr>
+                <w:noProof/>
+                <w:webHidden/>
+              </w:rPr>
+              <w:fldChar w:fldCharType="separate"/>
+            </w:r>
+            <w:r>
+              <w:rPr>
+                <w:noProof/>
+                <w:webHidden/>
+              </w:rPr>
+              <w:t>6</w:t>
             </w:r>
             <w:r>
               <w:rPr>
@@ -1408,7 +2321,7 @@
               <w:lang w:bidi="ar-SA"/>
             </w:rPr>
           </w:pPr>
-          <w:hyperlink w:anchor="_Toc20319722" w:history="1">
+          <w:hyperlink w:anchor="_Toc22101901" w:history="1">
             <w:r>
               <w:rPr>
                 <w:rStyle w:val="Hyperlink"/>
@@ -1452,7 +2365,7 @@
                 <w:noProof/>
                 <w:webHidden/>
               </w:rPr>
-              <w:instrText xml:space="preserve"> PAGEREF _Toc20319722 \h </w:instrText>
+              <w:instrText xml:space="preserve"> PAGEREF _Toc22101901 \h </w:instrText>
             </w:r>
             <w:r>
               <w:rPr>
@@ -1498,7 +2411,7 @@
               <w:lang w:bidi="ar-SA"/>
             </w:rPr>
           </w:pPr>
-          <w:hyperlink w:anchor="_Toc20319723" w:history="1">
+          <w:hyperlink w:anchor="_Toc22101902" w:history="1">
             <w:r>
               <w:rPr>
                 <w:rStyle w:val="Hyperlink"/>
@@ -1542,7 +2455,7 @@
                 <w:noProof/>
                 <w:webHidden/>
               </w:rPr>
-              <w:instrText xml:space="preserve"> PAGEREF _Toc20319723 \h </w:instrText>
+              <w:instrText xml:space="preserve"> PAGEREF _Toc22101902 \h </w:instrText>
             </w:r>
             <w:r>
               <w:rPr>
@@ -1588,7 +2501,7 @@
               <w:lang w:bidi="ar-SA"/>
             </w:rPr>
           </w:pPr>
-          <w:hyperlink w:anchor="_Toc20319724" w:history="1">
+          <w:hyperlink w:anchor="_Toc22101903" w:history="1">
             <w:r>
               <w:rPr>
                 <w:rStyle w:val="Hyperlink"/>
@@ -1632,7 +2545,7 @@
                 <w:noProof/>
                 <w:webHidden/>
               </w:rPr>
-              <w:instrText xml:space="preserve"> PAGEREF _Toc20319724 \h </w:instrText>
+              <w:instrText xml:space="preserve"> PAGEREF _Toc22101903 \h </w:instrText>
             </w:r>
             <w:r>
               <w:rPr>
@@ -1678,7 +2591,7 @@
               <w:lang w:bidi="ar-SA"/>
             </w:rPr>
           </w:pPr>
-          <w:hyperlink w:anchor="_Toc20319725" w:history="1">
+          <w:hyperlink w:anchor="_Toc22101904" w:history="1">
             <w:r>
               <w:rPr>
                 <w:rStyle w:val="Hyperlink"/>
@@ -1722,7 +2635,7 @@
                 <w:noProof/>
                 <w:webHidden/>
               </w:rPr>
-              <w:instrText xml:space="preserve"> PAGEREF _Toc20319725 \h </w:instrText>
+              <w:instrText xml:space="preserve"> PAGEREF _Toc22101904 \h </w:instrText>
             </w:r>
             <w:r>
               <w:rPr>
@@ -1768,7 +2681,7 @@
               <w:lang w:bidi="ar-SA"/>
             </w:rPr>
           </w:pPr>
-          <w:hyperlink w:anchor="_Toc20319726" w:history="1">
+          <w:hyperlink w:anchor="_Toc22101905" w:history="1">
             <w:r>
               <w:rPr>
                 <w:rStyle w:val="Hyperlink"/>
@@ -1812,7 +2725,7 @@
                 <w:noProof/>
                 <w:webHidden/>
               </w:rPr>
-              <w:instrText xml:space="preserve"> PAGEREF _Toc20319726 \h </w:instrText>
+              <w:instrText xml:space="preserve"> PAGEREF _Toc22101905 \h </w:instrText>
             </w:r>
             <w:r>
               <w:rPr>
@@ -1858,7 +2771,7 @@
               <w:lang w:bidi="ar-SA"/>
             </w:rPr>
           </w:pPr>
-          <w:hyperlink w:anchor="_Toc20319727" w:history="1">
+          <w:hyperlink w:anchor="_Toc22101906" w:history="1">
             <w:r>
               <w:rPr>
                 <w:rStyle w:val="Hyperlink"/>
@@ -1902,7 +2815,7 @@
                 <w:noProof/>
                 <w:webHidden/>
               </w:rPr>
-              <w:instrText xml:space="preserve"> PAGEREF _Toc20319727 \h </w:instrText>
+              <w:instrText xml:space="preserve"> PAGEREF _Toc22101906 \h </w:instrText>
             </w:r>
             <w:r>
               <w:rPr>
@@ -1948,7 +2861,7 @@
               <w:lang w:bidi="ar-SA"/>
             </w:rPr>
           </w:pPr>
-          <w:hyperlink w:anchor="_Toc20319728" w:history="1">
+          <w:hyperlink w:anchor="_Toc22101907" w:history="1">
             <w:r>
               <w:rPr>
                 <w:rStyle w:val="Hyperlink"/>
@@ -1992,7 +2905,7 @@
                 <w:noProof/>
                 <w:webHidden/>
               </w:rPr>
-              <w:instrText xml:space="preserve"> PAGEREF _Toc20319728 \h </w:instrText>
+              <w:instrText xml:space="preserve"> PAGEREF _Toc22101907 \h </w:instrText>
             </w:r>
             <w:r>
               <w:rPr>
@@ -2038,7 +2951,7 @@
               <w:lang w:bidi="ar-SA"/>
             </w:rPr>
           </w:pPr>
-          <w:hyperlink w:anchor="_Toc20319729" w:history="1">
+          <w:hyperlink w:anchor="_Toc22101908" w:history="1">
             <w:r>
               <w:rPr>
                 <w:rStyle w:val="Hyperlink"/>
@@ -2082,7 +2995,7 @@
                 <w:noProof/>
                 <w:webHidden/>
               </w:rPr>
-              <w:instrText xml:space="preserve"> PAGEREF _Toc20319729 \h </w:instrText>
+              <w:instrText xml:space="preserve"> PAGEREF _Toc22101908 \h </w:instrText>
             </w:r>
             <w:r>
               <w:rPr>
@@ -2128,7 +3041,7 @@
               <w:lang w:bidi="ar-SA"/>
             </w:rPr>
           </w:pPr>
-          <w:hyperlink w:anchor="_Toc20319730" w:history="1">
+          <w:hyperlink w:anchor="_Toc22101909" w:history="1">
             <w:r>
               <w:rPr>
                 <w:rStyle w:val="Hyperlink"/>
@@ -2172,7 +3085,7 @@
                 <w:noProof/>
                 <w:webHidden/>
               </w:rPr>
-              <w:instrText xml:space="preserve"> PAGEREF _Toc20319730 \h </w:instrText>
+              <w:instrText xml:space="preserve"> PAGEREF _Toc22101909 \h </w:instrText>
             </w:r>
             <w:r>
               <w:rPr>
@@ -2218,7 +3131,7 @@
               <w:lang w:bidi="ar-SA"/>
             </w:rPr>
           </w:pPr>
-          <w:hyperlink w:anchor="_Toc20319731" w:history="1">
+          <w:hyperlink w:anchor="_Toc22101910" w:history="1">
             <w:r>
               <w:rPr>
                 <w:rStyle w:val="Hyperlink"/>
@@ -2262,7 +3175,7 @@
                 <w:noProof/>
                 <w:webHidden/>
               </w:rPr>
-              <w:instrText xml:space="preserve"> PAGEREF _Toc20319731 \h </w:instrText>
+              <w:instrText xml:space="preserve"> PAGEREF _Toc22101910 \h </w:instrText>
             </w:r>
             <w:r>
               <w:rPr>
@@ -2308,7 +3221,7 @@
               <w:lang w:bidi="ar-SA"/>
             </w:rPr>
           </w:pPr>
-          <w:hyperlink w:anchor="_Toc20319732" w:history="1">
+          <w:hyperlink w:anchor="_Toc22101911" w:history="1">
             <w:r>
               <w:rPr>
                 <w:rStyle w:val="Hyperlink"/>
@@ -2352,7 +3265,7 @@
                 <w:noProof/>
                 <w:webHidden/>
               </w:rPr>
-              <w:instrText xml:space="preserve"> PAGEREF _Toc20319732 \h </w:instrText>
+              <w:instrText xml:space="preserve"> PAGEREF _Toc22101911 \h </w:instrText>
             </w:r>
             <w:r>
               <w:rPr>
@@ -2398,7 +3311,7 @@
               <w:lang w:bidi="ar-SA"/>
             </w:rPr>
           </w:pPr>
-          <w:hyperlink w:anchor="_Toc20319733" w:history="1">
+          <w:hyperlink w:anchor="_Toc22101912" w:history="1">
             <w:r>
               <w:rPr>
                 <w:rStyle w:val="Hyperlink"/>
@@ -2442,7 +3355,7 @@
                 <w:noProof/>
                 <w:webHidden/>
               </w:rPr>
-              <w:instrText xml:space="preserve"> PAGEREF _Toc20319733 \h </w:instrText>
+              <w:instrText xml:space="preserve"> PAGEREF _Toc22101912 \h </w:instrText>
             </w:r>
             <w:r>
               <w:rPr>
@@ -2488,7 +3401,7 @@
               <w:lang w:bidi="ar-SA"/>
             </w:rPr>
           </w:pPr>
-          <w:hyperlink w:anchor="_Toc20319734" w:history="1">
+          <w:hyperlink w:anchor="_Toc22101913" w:history="1">
             <w:r>
               <w:rPr>
                 <w:rStyle w:val="Hyperlink"/>
@@ -2532,7 +3445,7 @@
                 <w:noProof/>
                 <w:webHidden/>
               </w:rPr>
-              <w:instrText xml:space="preserve"> PAGEREF _Toc20319734 \h </w:instrText>
+              <w:instrText xml:space="preserve"> PAGEREF _Toc22101913 \h </w:instrText>
             </w:r>
             <w:r>
               <w:rPr>
@@ -2577,7 +3490,7 @@
               <w:lang w:bidi="ar-SA"/>
             </w:rPr>
           </w:pPr>
-          <w:hyperlink w:anchor="_Toc20319735" w:history="1">
+          <w:hyperlink w:anchor="_Toc22101914" w:history="1">
             <w:r>
               <w:rPr>
                 <w:rStyle w:val="Hyperlink"/>
@@ -2604,7 +3517,7 @@
                 <w:noProof/>
                 <w:webHidden/>
               </w:rPr>
-              <w:instrText xml:space="preserve"> PAGEREF _Toc20319735 \h </w:instrText>
+              <w:instrText xml:space="preserve"> PAGEREF _Toc22101914 \h </w:instrText>
             </w:r>
             <w:r>
               <w:rPr>
@@ -2649,7 +3562,7 @@
               <w:lang w:bidi="ar-SA"/>
             </w:rPr>
           </w:pPr>
-          <w:hyperlink w:anchor="_Toc20319736" w:history="1">
+          <w:hyperlink w:anchor="_Toc22101915" w:history="1">
             <w:r>
               <w:rPr>
                 <w:rStyle w:val="Hyperlink"/>
@@ -2676,7 +3589,7 @@
                 <w:noProof/>
                 <w:webHidden/>
               </w:rPr>
-              <w:instrText xml:space="preserve"> PAGEREF _Toc20319736 \h </w:instrText>
+              <w:instrText xml:space="preserve"> PAGEREF _Toc22101915 \h </w:instrText>
             </w:r>
             <w:r>
               <w:rPr>
@@ -2721,7 +3634,7 @@
               <w:lang w:bidi="ar-SA"/>
             </w:rPr>
           </w:pPr>
-          <w:hyperlink w:anchor="_Toc20319737" w:history="1">
+          <w:hyperlink w:anchor="_Toc22101916" w:history="1">
             <w:r>
               <w:rPr>
                 <w:rStyle w:val="Hyperlink"/>
@@ -2748,7 +3661,7 @@
                 <w:noProof/>
                 <w:webHidden/>
               </w:rPr>
-              <w:instrText xml:space="preserve"> PAGEREF _Toc20319737 \h </w:instrText>
+              <w:instrText xml:space="preserve"> PAGEREF _Toc22101916 \h </w:instrText>
             </w:r>
             <w:r>
               <w:rPr>
@@ -2808,12 +3721,14 @@
           <w:numId w:val="4"/>
         </w:numPr>
       </w:pPr>
-      <w:bookmarkStart w:id="1" w:name="_Toc20319717"/>
+      <w:bookmarkStart w:id="1" w:name="_INTRODUÇÃO"/>
+      <w:bookmarkStart w:id="2" w:name="_Toc22101894"/>
+      <w:bookmarkEnd w:id="1"/>
       <w:r>
         <w:lastRenderedPageBreak/>
         <w:t>INTRODUÇÃO</w:t>
       </w:r>
-      <w:bookmarkEnd w:id="1"/>
+      <w:bookmarkEnd w:id="2"/>
     </w:p>
     <w:p>
       <w:pPr>
@@ -2828,21 +3743,43 @@
       <w:pPr>
         <w:pStyle w:val="Corpodetexto"/>
         <w:ind w:left="258"/>
+        <w:jc w:val="both"/>
       </w:pPr>
       <w:r>
-        <w:t>Este documento especifica as re</w:t>
+        <w:t xml:space="preserve">Este documento especifica </w:t>
       </w:r>
       <w:r>
-        <w:t>gras negociais do Sistema de Gerenciamento de Biblioteca</w:t>
+        <w:t>os principais aspectos técnicos referentes ao</w:t>
       </w:r>
       <w:r>
-        <w:t xml:space="preserve">, fornecendo aos desenvolvedores as informações necessárias para o projeto e implementação, assim como para a realização dos testes e homologação do sistema, no que tange </w:t>
+        <w:t xml:space="preserve"> </w:t>
+      </w:r>
+      <w:r>
+        <w:t>“</w:t>
+      </w:r>
+      <w:r>
+        <w:t xml:space="preserve">Sistema de Gerenciamento de </w:t>
+      </w:r>
+      <w:r>
+        <w:t>Ordens de Serviço” (Cosmos)</w:t>
+      </w:r>
+      <w:r>
+        <w:t xml:space="preserve">, </w:t>
+      </w:r>
+      <w:r>
+        <w:t>f</w:t>
+      </w:r>
+      <w:r>
+        <w:t xml:space="preserve">ornecendo aos desenvolvedores as informações necessárias para o projeto e implementação, assim como para a realização dos testes e homologação do sistema, no que tange </w:t>
       </w:r>
       <w:r>
         <w:t>às</w:t>
       </w:r>
       <w:r>
-        <w:t xml:space="preserve"> regras de negócio.</w:t>
+        <w:t xml:space="preserve"> regras de negócio</w:t>
+      </w:r>
+      <w:r>
+        <w:t>.</w:t>
       </w:r>
     </w:p>
     <w:p>
@@ -2866,14 +3803,14 @@
       <w:pPr>
         <w:pStyle w:val="Ttulo2"/>
       </w:pPr>
-      <w:bookmarkStart w:id="2" w:name="_Toc20319718"/>
+      <w:bookmarkStart w:id="3" w:name="_Toc22101895"/>
       <w:r>
         <w:t xml:space="preserve">1.1 </w:t>
       </w:r>
       <w:r>
         <w:t>Convenções, Termos e Abreviaturas.</w:t>
       </w:r>
-      <w:bookmarkEnd w:id="2"/>
+      <w:bookmarkEnd w:id="3"/>
     </w:p>
     <w:p>
       <w:pPr>
@@ -3464,11 +4401,11 @@
       <w:r>
         <w:t xml:space="preserve"> </w:t>
       </w:r>
-      <w:bookmarkStart w:id="3" w:name="_Toc20319719"/>
+      <w:bookmarkStart w:id="4" w:name="_Toc22101896"/>
       <w:r>
         <w:t>Referências</w:t>
       </w:r>
-      <w:bookmarkEnd w:id="3"/>
+      <w:bookmarkEnd w:id="4"/>
     </w:p>
     <w:p>
       <w:pPr>
@@ -3706,17 +4643,23 @@
               <w:jc w:val="center"/>
               <w:cnfStyle w:val="000000100000" w:firstRow="0" w:lastRow="0" w:firstColumn="0" w:lastColumn="0" w:oddVBand="0" w:evenVBand="0" w:oddHBand="1" w:evenHBand="0" w:firstRowFirstColumn="0" w:firstRowLastColumn="0" w:lastRowFirstColumn="0" w:lastRowLastColumn="0"/>
               <w:rPr>
+                <w:b/>
+                <w:bCs/>
                 <w:sz w:val="20"/>
               </w:rPr>
             </w:pPr>
             <w:r>
               <w:rPr>
+                <w:b/>
+                <w:bCs/>
                 <w:sz w:val="20"/>
               </w:rPr>
               <w:t>2</w:t>
             </w:r>
             <w:r>
               <w:rPr>
+                <w:b/>
+                <w:bCs/>
                 <w:sz w:val="20"/>
               </w:rPr>
               <w:t>.0</w:t>
@@ -3744,6 +4687,136 @@
                 <w:u w:val="single"/>
               </w:rPr>
               <w:t>https://github.com/ryatsuga/cosmos/blob/master/docs/Plano%20de%20Negocios.docx</w:t>
+            </w:r>
+          </w:p>
+        </w:tc>
+      </w:tr>
+      <w:tr>
+        <w:trPr>
+          <w:trHeight w:val="460"/>
+        </w:trPr>
+        <w:tc>
+          <w:tcPr>
+            <w:cnfStyle w:val="001000000000" w:firstRow="0" w:lastRow="0" w:firstColumn="1" w:lastColumn="0" w:oddVBand="0" w:evenVBand="0" w:oddHBand="0" w:evenHBand="0" w:firstRowFirstColumn="0" w:firstRowLastColumn="0" w:lastRowFirstColumn="0" w:lastRowLastColumn="0"/>
+            <w:tcW w:w="3534" w:type="dxa"/>
+            <w:vAlign w:val="center"/>
+          </w:tcPr>
+          <w:p>
+            <w:pPr>
+              <w:pStyle w:val="TableParagraph"/>
+              <w:spacing w:line="227" w:lineRule="exact"/>
+              <w:jc w:val="center"/>
+              <w:rPr>
+                <w:sz w:val="20"/>
+              </w:rPr>
+            </w:pPr>
+            <w:r>
+              <w:rPr>
+                <w:sz w:val="20"/>
+              </w:rPr>
+              <w:t>Documento de Requisitos</w:t>
+            </w:r>
+          </w:p>
+        </w:tc>
+        <w:tc>
+          <w:tcPr>
+            <w:cnfStyle w:val="000010000000" w:firstRow="0" w:lastRow="0" w:firstColumn="0" w:lastColumn="0" w:oddVBand="1" w:evenVBand="0" w:oddHBand="0" w:evenHBand="0" w:firstRowFirstColumn="0" w:firstRowLastColumn="0" w:lastRowFirstColumn="0" w:lastRowLastColumn="0"/>
+            <w:tcW w:w="1418" w:type="dxa"/>
+            <w:vAlign w:val="center"/>
+          </w:tcPr>
+          <w:p>
+            <w:pPr>
+              <w:pStyle w:val="TableParagraph"/>
+              <w:spacing w:line="227" w:lineRule="exact"/>
+              <w:jc w:val="center"/>
+              <w:rPr>
+                <w:b/>
+                <w:sz w:val="20"/>
+              </w:rPr>
+            </w:pPr>
+            <w:r>
+              <w:rPr>
+                <w:sz w:val="20"/>
+              </w:rPr>
+              <w:t>2</w:t>
+            </w:r>
+            <w:r>
+              <w:rPr>
+                <w:sz w:val="20"/>
+              </w:rPr>
+              <w:t>5</w:t>
+            </w:r>
+            <w:r>
+              <w:rPr>
+                <w:sz w:val="20"/>
+              </w:rPr>
+              <w:t>/</w:t>
+            </w:r>
+            <w:r>
+              <w:rPr>
+                <w:sz w:val="20"/>
+              </w:rPr>
+              <w:t>09</w:t>
+            </w:r>
+            <w:r>
+              <w:rPr>
+                <w:sz w:val="20"/>
+              </w:rPr>
+              <w:t>/2019</w:t>
+            </w:r>
+          </w:p>
+        </w:tc>
+        <w:tc>
+          <w:tcPr>
+            <w:tcW w:w="992" w:type="dxa"/>
+            <w:vAlign w:val="center"/>
+          </w:tcPr>
+          <w:p>
+            <w:pPr>
+              <w:pStyle w:val="TableParagraph"/>
+              <w:spacing w:line="227" w:lineRule="exact"/>
+              <w:jc w:val="center"/>
+              <w:cnfStyle w:val="000000000000" w:firstRow="0" w:lastRow="0" w:firstColumn="0" w:lastColumn="0" w:oddVBand="0" w:evenVBand="0" w:oddHBand="0" w:evenHBand="0" w:firstRowFirstColumn="0" w:firstRowLastColumn="0" w:lastRowFirstColumn="0" w:lastRowLastColumn="0"/>
+              <w:rPr>
+                <w:b/>
+                <w:sz w:val="20"/>
+              </w:rPr>
+            </w:pPr>
+            <w:r>
+              <w:rPr>
+                <w:sz w:val="20"/>
+              </w:rPr>
+              <w:t>1.</w:t>
+            </w:r>
+            <w:r>
+              <w:rPr>
+                <w:sz w:val="20"/>
+              </w:rPr>
+              <w:t>1</w:t>
+            </w:r>
+          </w:p>
+        </w:tc>
+        <w:tc>
+          <w:tcPr>
+            <w:cnfStyle w:val="000100000000" w:firstRow="0" w:lastRow="0" w:firstColumn="0" w:lastColumn="1" w:oddVBand="0" w:evenVBand="0" w:oddHBand="0" w:evenHBand="0" w:firstRowFirstColumn="0" w:firstRowLastColumn="0" w:lastRowFirstColumn="0" w:lastRowLastColumn="0"/>
+            <w:tcW w:w="3839" w:type="dxa"/>
+            <w:vAlign w:val="center"/>
+          </w:tcPr>
+          <w:p>
+            <w:pPr>
+              <w:pStyle w:val="TableParagraph"/>
+              <w:spacing w:line="227" w:lineRule="exact"/>
+              <w:jc w:val="both"/>
+              <w:rPr>
+                <w:sz w:val="20"/>
+              </w:rPr>
+            </w:pPr>
+            <w:r>
+              <w:rPr>
+                <w:sz w:val="20"/>
+                <w:u w:val="single"/>
+              </w:rPr>
+              <w:t>https://github.com/ryatsuga/cosmos/blob/master/docs/Documento%20de%20Requisitos.docx</w:t>
             </w:r>
           </w:p>
         </w:tc>
@@ -3772,7 +4845,7 @@
               <w:rPr>
                 <w:sz w:val="20"/>
               </w:rPr>
-              <w:t>Documento de Requisitos</w:t>
+              <w:t>Planilha Financeira</w:t>
             </w:r>
           </w:p>
         </w:tc>
@@ -3789,43 +4862,17 @@
               <w:jc w:val="center"/>
               <w:rPr>
                 <w:b w:val="0"/>
+                <w:bCs w:val="0"/>
                 <w:sz w:val="20"/>
               </w:rPr>
             </w:pPr>
             <w:r>
               <w:rPr>
                 <w:b w:val="0"/>
-                <w:sz w:val="20"/>
-              </w:rPr>
-              <w:t>2</w:t>
-            </w:r>
-            <w:r>
-              <w:rPr>
-                <w:b w:val="0"/>
-                <w:sz w:val="20"/>
-              </w:rPr>
-              <w:t>5</w:t>
-            </w:r>
-            <w:r>
-              <w:rPr>
-                <w:b w:val="0"/>
-                <w:sz w:val="20"/>
-              </w:rPr>
-              <w:t>/</w:t>
-            </w:r>
-            <w:r>
-              <w:rPr>
-                <w:b w:val="0"/>
-                <w:sz w:val="20"/>
-              </w:rPr>
-              <w:t>09</w:t>
-            </w:r>
-            <w:r>
-              <w:rPr>
-                <w:b w:val="0"/>
-                <w:sz w:val="20"/>
-              </w:rPr>
-              <w:t>/2019</w:t>
+                <w:bCs w:val="0"/>
+                <w:sz w:val="20"/>
+              </w:rPr>
+              <w:t>25/09/2019</w:t>
             </w:r>
           </w:p>
         </w:tc>
@@ -3841,20 +4888,11 @@
               <w:jc w:val="center"/>
               <w:cnfStyle w:val="010000000000" w:firstRow="0" w:lastRow="1" w:firstColumn="0" w:lastColumn="0" w:oddVBand="0" w:evenVBand="0" w:oddHBand="0" w:evenHBand="0" w:firstRowFirstColumn="0" w:firstRowLastColumn="0" w:lastRowFirstColumn="0" w:lastRowLastColumn="0"/>
               <w:rPr>
-                <w:b w:val="0"/>
                 <w:sz w:val="20"/>
               </w:rPr>
             </w:pPr>
             <w:r>
               <w:rPr>
-                <w:b w:val="0"/>
-                <w:sz w:val="20"/>
-              </w:rPr>
-              <w:t>1.</w:t>
-            </w:r>
-            <w:r>
-              <w:rPr>
-                <w:b w:val="0"/>
                 <w:sz w:val="20"/>
               </w:rPr>
               <w:t>1</w:t>
@@ -3874,6 +4912,7 @@
               <w:jc w:val="both"/>
               <w:rPr>
                 <w:sz w:val="20"/>
+                <w:u w:val="single"/>
               </w:rPr>
             </w:pPr>
             <w:r>
@@ -3881,7 +4920,7 @@
                 <w:sz w:val="20"/>
                 <w:u w:val="single"/>
               </w:rPr>
-              <w:t>https://github.com/ryatsuga/cosmos/blob/master/docs/Documento%20de%20Requisitos.docx</w:t>
+              <w:t>https://github.com/ryatsuga/cosmos/blob/master/docs/Planilha%20financeira%20de%20desenvolvimento.xlsx</w:t>
             </w:r>
           </w:p>
         </w:tc>
@@ -4024,12 +5063,13 @@
           <w:numId w:val="4"/>
         </w:numPr>
       </w:pPr>
-      <w:bookmarkStart w:id="4" w:name="_Toc20319720"/>
+      <w:bookmarkStart w:id="5" w:name="_REGRAS_DE_NEGÓCIO"/>
+      <w:bookmarkStart w:id="6" w:name="_Toc22101897"/>
+      <w:bookmarkEnd w:id="5"/>
       <w:r>
-        <w:lastRenderedPageBreak/>
         <w:t>REGRAS DE NEGÓCIO</w:t>
       </w:r>
-      <w:bookmarkEnd w:id="4"/>
+      <w:bookmarkEnd w:id="6"/>
     </w:p>
     <w:p>
       <w:pPr>
@@ -4052,14 +5092,14 @@
           <w:tab w:val="left" w:pos="727"/>
         </w:tabs>
       </w:pPr>
-      <w:bookmarkStart w:id="5" w:name="_Toc20319721"/>
+      <w:bookmarkStart w:id="7" w:name="_Toc22101898"/>
       <w:r>
         <w:t xml:space="preserve">Módulo: </w:t>
       </w:r>
       <w:r>
         <w:t>Gestão de Usuário</w:t>
       </w:r>
-      <w:bookmarkEnd w:id="5"/>
+      <w:bookmarkEnd w:id="7"/>
     </w:p>
     <w:p>
       <w:pPr>
@@ -5408,10 +6448,12 @@
           <w:tab w:val="left" w:pos="727"/>
         </w:tabs>
         <w:spacing w:before="92"/>
+        <w:outlineLvl w:val="1"/>
         <w:rPr>
           <w:b/>
         </w:rPr>
       </w:pPr>
+      <w:bookmarkStart w:id="8" w:name="_Toc22101899"/>
       <w:r>
         <w:rPr>
           <w:b/>
@@ -5424,6 +6466,7 @@
         </w:rPr>
         <w:t>de Negócio</w:t>
       </w:r>
+      <w:bookmarkEnd w:id="8"/>
     </w:p>
     <w:p>
       <w:pPr>
@@ -5641,7 +6684,7 @@
                 <w:bCs w:val="0"/>
                 <w:sz w:val="20"/>
               </w:rPr>
-              <w:t xml:space="preserve">e gerir </w:t>
+              <w:t>e gerir um negócio</w:t>
             </w:r>
             <w:r>
               <w:rPr>
@@ -5649,31 +6692,7 @@
                 <w:bCs w:val="0"/>
                 <w:sz w:val="20"/>
               </w:rPr>
-              <w:t xml:space="preserve">no </w:t>
-            </w:r>
-            <w:r>
-              <w:rPr>
-                <w:b w:val="0"/>
-                <w:bCs w:val="0"/>
-                <w:sz w:val="20"/>
-              </w:rPr>
-              <w:t>mínimo</w:t>
-            </w:r>
-            <w:r>
-              <w:rPr>
-                <w:b w:val="0"/>
-                <w:bCs w:val="0"/>
-                <w:sz w:val="20"/>
-              </w:rPr>
-              <w:t xml:space="preserve"> </w:t>
-            </w:r>
-            <w:r>
-              <w:rPr>
-                <w:b w:val="0"/>
-                <w:bCs w:val="0"/>
-                <w:sz w:val="20"/>
-              </w:rPr>
-              <w:t>um negócio em plano normal e três no plano pago.</w:t>
+              <w:t>.</w:t>
             </w:r>
           </w:p>
         </w:tc>
@@ -5853,15 +6872,16 @@
           <w:tab w:val="left" w:pos="727"/>
         </w:tabs>
         <w:spacing w:before="0"/>
+        <w:outlineLvl w:val="1"/>
         <w:rPr>
           <w:b/>
         </w:rPr>
       </w:pPr>
+      <w:bookmarkStart w:id="9" w:name="_Toc22101900"/>
       <w:r>
         <w:rPr>
           <w:b/>
         </w:rPr>
-        <w:lastRenderedPageBreak/>
         <w:t xml:space="preserve">Módulo: Gestão </w:t>
       </w:r>
       <w:r>
@@ -5870,6 +6890,7 @@
         </w:rPr>
         <w:t>de Ordem de Serviço</w:t>
       </w:r>
+      <w:bookmarkEnd w:id="9"/>
     </w:p>
     <w:p>
       <w:pPr>
@@ -6264,12 +7285,14 @@
         </w:numPr>
         <w:spacing w:after="240" w:line="360" w:lineRule="auto"/>
       </w:pPr>
-      <w:bookmarkStart w:id="6" w:name="_Toc20319722"/>
+      <w:bookmarkStart w:id="10" w:name="_REQUISITOS_FUNCIONAIS"/>
+      <w:bookmarkStart w:id="11" w:name="_Toc22101901"/>
+      <w:bookmarkEnd w:id="10"/>
       <w:r>
         <w:lastRenderedPageBreak/>
         <w:t>REQUISITOS FUNCIONAIS</w:t>
       </w:r>
-      <w:bookmarkEnd w:id="6"/>
+      <w:bookmarkEnd w:id="11"/>
     </w:p>
     <w:p>
       <w:pPr>
@@ -6286,11 +7309,11 @@
       <w:r>
         <w:t xml:space="preserve"> </w:t>
       </w:r>
-      <w:bookmarkStart w:id="7" w:name="_Toc20319723"/>
+      <w:bookmarkStart w:id="12" w:name="_Toc22101902"/>
       <w:r>
         <w:t>Processo: Controle de Usuários</w:t>
       </w:r>
-      <w:bookmarkEnd w:id="7"/>
+      <w:bookmarkEnd w:id="12"/>
     </w:p>
     <w:tbl>
       <w:tblPr>
@@ -6666,11 +7689,11 @@
       <w:r>
         <w:t xml:space="preserve"> </w:t>
       </w:r>
-      <w:bookmarkStart w:id="8" w:name="_Toc20319724"/>
+      <w:bookmarkStart w:id="13" w:name="_Toc22101903"/>
       <w:r>
         <w:t>Processo: Controle de Negócio</w:t>
       </w:r>
-      <w:bookmarkEnd w:id="8"/>
+      <w:bookmarkEnd w:id="13"/>
     </w:p>
     <w:tbl>
       <w:tblPr>
@@ -7151,11 +8174,11 @@
         <w:lastRenderedPageBreak/>
         <w:t xml:space="preserve"> </w:t>
       </w:r>
-      <w:bookmarkStart w:id="9" w:name="_Toc20319725"/>
+      <w:bookmarkStart w:id="14" w:name="_Toc22101904"/>
       <w:r>
         <w:t>Processo: Controle de Ordem de Serviço</w:t>
       </w:r>
-      <w:bookmarkEnd w:id="9"/>
+      <w:bookmarkEnd w:id="14"/>
     </w:p>
     <w:tbl>
       <w:tblPr>
@@ -7461,12 +8484,14 @@
         </w:numPr>
         <w:spacing w:after="240" w:line="360" w:lineRule="auto"/>
       </w:pPr>
-      <w:bookmarkStart w:id="10" w:name="_Toc20319726"/>
+      <w:bookmarkStart w:id="15" w:name="_REQUISITOS_NÃO_FUNCIONAIS"/>
+      <w:bookmarkStart w:id="16" w:name="_Toc22101905"/>
+      <w:bookmarkEnd w:id="15"/>
       <w:r>
         <w:lastRenderedPageBreak/>
         <w:t>REQUISITOS NÃO FUNCIONAIS</w:t>
       </w:r>
-      <w:bookmarkEnd w:id="10"/>
+      <w:bookmarkEnd w:id="16"/>
     </w:p>
     <w:p>
       <w:pPr>
@@ -7860,7 +8885,7 @@
               <w:rPr>
                 <w:sz w:val="20"/>
               </w:rPr>
-              <w:t>Sistema Operacional</w:t>
+              <w:t>Dispositivos</w:t>
             </w:r>
           </w:p>
         </w:tc>
@@ -7876,18 +8901,68 @@
               <w:spacing w:before="3" w:line="228" w:lineRule="exact"/>
               <w:jc w:val="both"/>
               <w:rPr>
+                <w:sz w:val="20"/>
+              </w:rPr>
+            </w:pPr>
+            <w:r>
+              <w:rPr>
                 <w:b w:val="0"/>
                 <w:bCs w:val="0"/>
                 <w:sz w:val="20"/>
               </w:rPr>
-            </w:pPr>
+              <w:t>Para a execução do sistema é necessária a utilização de qualquer um dos seguintes dispositivos:</w:t>
+            </w:r>
             <w:r>
               <w:rPr>
                 <w:b w:val="0"/>
                 <w:bCs w:val="0"/>
                 <w:sz w:val="20"/>
               </w:rPr>
-              <w:t>O sistema deverá ser instalado em uma máquina com Windows 7 ou superior.</w:t>
+              <w:t xml:space="preserve"> </w:t>
+            </w:r>
+          </w:p>
+          <w:p>
+            <w:pPr>
+              <w:pStyle w:val="TableParagraph"/>
+              <w:spacing w:before="3" w:line="228" w:lineRule="exact"/>
+              <w:jc w:val="both"/>
+              <w:rPr>
+                <w:b w:val="0"/>
+                <w:bCs w:val="0"/>
+                <w:sz w:val="20"/>
+              </w:rPr>
+            </w:pPr>
+            <w:r>
+              <w:rPr>
+                <w:b w:val="0"/>
+                <w:bCs w:val="0"/>
+                <w:sz w:val="20"/>
+              </w:rPr>
+              <w:t>Win</w:t>
+            </w:r>
+            <w:r>
+              <w:rPr>
+                <w:b w:val="0"/>
+                <w:bCs w:val="0"/>
+                <w:sz w:val="20"/>
+              </w:rPr>
+              <w:t>dows 7 ou superior</w:t>
+            </w:r>
+            <w:r>
+              <w:rPr>
+                <w:b w:val="0"/>
+                <w:bCs w:val="0"/>
+                <w:sz w:val="20"/>
+              </w:rPr>
+              <w:t xml:space="preserve"> (desktop), Mac (desktop), Android 4 ou superior (mobile), IOS (mobile)</w:t>
+            </w:r>
+            <w:r>
+              <w:rPr>
+                <w:b w:val="0"/>
+                <w:bCs w:val="0"/>
+                <w:sz w:val="20"/>
+              </w:rPr>
+              <w:t>.</w:t>
             </w:r>
           </w:p>
         </w:tc>
@@ -8204,7 +9279,7 @@
                 <w:bCs w:val="0"/>
                 <w:sz w:val="20"/>
               </w:rPr>
-              <w:t>A máquina</w:t>
+              <w:t>Na</w:t>
             </w:r>
             <w:r>
               <w:rPr>
@@ -8212,7 +9287,7 @@
                 <w:bCs w:val="0"/>
                 <w:sz w:val="20"/>
               </w:rPr>
-              <w:t xml:space="preserve"> do</w:t>
+              <w:t xml:space="preserve"> utilização em desktops é recomendável que os mesmos</w:t>
             </w:r>
             <w:r>
               <w:rPr>
@@ -8220,7 +9295,39 @@
                 <w:bCs w:val="0"/>
                 <w:sz w:val="20"/>
               </w:rPr>
-              <w:t xml:space="preserve"> cliente deverá ter os seguintes requisitos:</w:t>
+              <w:t xml:space="preserve"> estejam de acordo</w:t>
+            </w:r>
+            <w:r>
+              <w:rPr>
+                <w:b w:val="0"/>
+                <w:bCs w:val="0"/>
+                <w:sz w:val="20"/>
+              </w:rPr>
+              <w:t xml:space="preserve"> </w:t>
+            </w:r>
+            <w:r>
+              <w:rPr>
+                <w:b w:val="0"/>
+                <w:bCs w:val="0"/>
+                <w:sz w:val="20"/>
+              </w:rPr>
+              <w:t>com os</w:t>
+            </w:r>
+            <w:r>
+              <w:rPr>
+                <w:b w:val="0"/>
+                <w:bCs w:val="0"/>
+                <w:sz w:val="20"/>
+              </w:rPr>
+              <w:t xml:space="preserve"> se</w:t>
+            </w:r>
+            <w:r>
+              <w:rPr>
+                <w:b w:val="0"/>
+                <w:bCs w:val="0"/>
+                <w:sz w:val="20"/>
+              </w:rPr>
+              <w:t>guintes requisitos:</w:t>
             </w:r>
           </w:p>
           <w:p>
@@ -8569,12 +9676,13 @@
         </w:numPr>
         <w:spacing w:after="240"/>
       </w:pPr>
-      <w:bookmarkStart w:id="11" w:name="_Toc20319727"/>
+      <w:bookmarkStart w:id="17" w:name="_REQUISITOS_COMPLEMENTARES"/>
+      <w:bookmarkStart w:id="18" w:name="_Toc22101906"/>
+      <w:bookmarkEnd w:id="17"/>
       <w:r>
-        <w:lastRenderedPageBreak/>
         <w:t>REQUISITOS COMPLEMENTARES</w:t>
       </w:r>
-      <w:bookmarkEnd w:id="11"/>
+      <w:bookmarkEnd w:id="18"/>
     </w:p>
     <w:p>
       <w:pPr>
@@ -8598,11 +9706,11 @@
       <w:r>
         <w:t xml:space="preserve"> </w:t>
       </w:r>
-      <w:bookmarkStart w:id="12" w:name="_Toc20319728"/>
+      <w:bookmarkStart w:id="19" w:name="_Toc22101907"/>
       <w:r>
         <w:t>Processo: Controle de Usuários</w:t>
       </w:r>
-      <w:bookmarkEnd w:id="12"/>
+      <w:bookmarkEnd w:id="19"/>
     </w:p>
     <w:tbl>
       <w:tblPr>
@@ -9461,14 +10569,14 @@
       <w:r>
         <w:t xml:space="preserve"> </w:t>
       </w:r>
-      <w:bookmarkStart w:id="13" w:name="_Toc20319729"/>
+      <w:bookmarkStart w:id="20" w:name="_Toc22101908"/>
       <w:r>
         <w:t xml:space="preserve">Processo: Controle de </w:t>
       </w:r>
       <w:r>
         <w:t>Negócio</w:t>
       </w:r>
-      <w:bookmarkEnd w:id="13"/>
+      <w:bookmarkEnd w:id="20"/>
     </w:p>
     <w:tbl>
       <w:tblPr>
@@ -9899,17 +11007,16 @@
         <w:spacing w:after="240" w:line="360" w:lineRule="auto"/>
       </w:pPr>
       <w:r>
-        <w:lastRenderedPageBreak/>
         <w:t xml:space="preserve"> </w:t>
       </w:r>
-      <w:bookmarkStart w:id="14" w:name="_Toc20319730"/>
+      <w:bookmarkStart w:id="21" w:name="_Toc22101909"/>
       <w:r>
         <w:t xml:space="preserve">Processo: Controle de </w:t>
       </w:r>
       <w:r>
         <w:t>Ordem de Serviço</w:t>
       </w:r>
-      <w:bookmarkEnd w:id="14"/>
+      <w:bookmarkEnd w:id="21"/>
     </w:p>
     <w:tbl>
       <w:tblPr>
@@ -10442,14 +11549,15 @@
         </w:numPr>
         <w:spacing w:after="240"/>
       </w:pPr>
-      <w:bookmarkStart w:id="15" w:name="_67yng7u0nqhx" w:colFirst="0" w:colLast="0"/>
-      <w:bookmarkStart w:id="16" w:name="_Toc20319731"/>
-      <w:bookmarkEnd w:id="15"/>
+      <w:bookmarkStart w:id="22" w:name="_67yng7u0nqhx" w:colFirst="0" w:colLast="0"/>
+      <w:bookmarkStart w:id="23" w:name="_CASOS_DE_USO"/>
+      <w:bookmarkStart w:id="24" w:name="_Toc22101910"/>
+      <w:bookmarkEnd w:id="22"/>
+      <w:bookmarkEnd w:id="23"/>
       <w:r>
-        <w:lastRenderedPageBreak/>
         <w:t>CASOS DE USO</w:t>
       </w:r>
-      <w:bookmarkEnd w:id="16"/>
+      <w:bookmarkEnd w:id="24"/>
     </w:p>
     <w:p>
       <w:pPr>
@@ -10473,11 +11581,11 @@
       <w:r>
         <w:t xml:space="preserve"> </w:t>
       </w:r>
-      <w:bookmarkStart w:id="17" w:name="_Toc20319732"/>
+      <w:bookmarkStart w:id="25" w:name="_Toc22101911"/>
       <w:r>
         <w:t>DESCRIÇÃO DE CASO DE USO</w:t>
       </w:r>
-      <w:bookmarkEnd w:id="17"/>
+      <w:bookmarkEnd w:id="25"/>
     </w:p>
     <w:tbl>
       <w:tblPr>
@@ -11664,12 +12772,13 @@
         </w:numPr>
         <w:spacing w:after="240"/>
       </w:pPr>
-      <w:bookmarkStart w:id="18" w:name="_Toc20319733"/>
+      <w:bookmarkStart w:id="26" w:name="_DIAGRAMAS"/>
+      <w:bookmarkStart w:id="27" w:name="_Toc22101912"/>
+      <w:bookmarkEnd w:id="26"/>
       <w:r>
-        <w:lastRenderedPageBreak/>
         <w:t>DIAGRAMAS</w:t>
       </w:r>
-      <w:bookmarkEnd w:id="18"/>
+      <w:bookmarkEnd w:id="27"/>
     </w:p>
     <w:p>
       <w:pPr>
@@ -11678,7 +12787,6 @@
         <w:ind w:left="720"/>
       </w:pPr>
     </w:p>
-    <w:bookmarkStart w:id="19" w:name="_Toc20319734"/>
     <w:p>
       <w:pPr>
         <w:pStyle w:val="Ttulo2"/>
@@ -11691,6 +12799,7 @@
         </w:tabs>
         <w:spacing w:after="240" w:line="360" w:lineRule="auto"/>
       </w:pPr>
+      <w:bookmarkStart w:id="28" w:name="_Toc22101913"/>
       <w:r>
         <w:rPr>
           <w:noProof/>
@@ -31043,7 +32152,7 @@
       <w:r>
         <w:t xml:space="preserve"> DE USO</w:t>
       </w:r>
-      <w:bookmarkEnd w:id="19"/>
+      <w:bookmarkEnd w:id="28"/>
     </w:p>
     <w:p>
       <w:pPr>
@@ -31074,14 +32183,14 @@
         <w:spacing w:after="240" w:line="360" w:lineRule="auto"/>
         <w:ind w:left="567" w:firstLine="0"/>
       </w:pPr>
-      <w:bookmarkStart w:id="20" w:name="_Toc20319735"/>
+      <w:bookmarkStart w:id="29" w:name="_Toc22101914"/>
       <w:r>
         <w:t>7.2 DIAGRAMA DE CLASSE</w:t>
       </w:r>
       <w:r>
         <w:t>S</w:t>
       </w:r>
-      <w:bookmarkEnd w:id="20"/>
+      <w:bookmarkEnd w:id="29"/>
     </w:p>
     <w:p>
       <w:pPr>
@@ -31097,11 +32206,11 @@
         <w:pStyle w:val="Ttulo1"/>
         <w:ind w:left="426"/>
       </w:pPr>
-      <w:bookmarkStart w:id="21" w:name="_Toc20319736"/>
+      <w:bookmarkStart w:id="30" w:name="_Toc22101915"/>
       <w:r>
         <w:t>Em desenvolvimento....</w:t>
       </w:r>
-      <w:bookmarkEnd w:id="21"/>
+      <w:bookmarkEnd w:id="30"/>
     </w:p>
     <w:p>
       <w:pPr>
@@ -31120,15 +32229,14 @@
         <w:pStyle w:val="Ttulo1"/>
         <w:ind w:left="426"/>
       </w:pPr>
-      <w:bookmarkStart w:id="22" w:name="_Toc20319737"/>
+      <w:bookmarkStart w:id="31" w:name="_Toc22101916"/>
       <w:r>
-        <w:lastRenderedPageBreak/>
         <w:t xml:space="preserve">?. </w:t>
       </w:r>
       <w:r>
         <w:t>APROVAÇÃO</w:t>
       </w:r>
-      <w:bookmarkEnd w:id="22"/>
+      <w:bookmarkEnd w:id="31"/>
     </w:p>
     <w:p>
       <w:pPr>
@@ -31942,7 +33050,6 @@
         <w:docPartUnique/>
       </w:docPartObj>
     </w:sdtPr>
-    <w:sdtEndPr/>
     <w:sdtContent>
       <w:p>
         <w:pPr>
@@ -31989,7 +33096,6 @@
         <w:docPartUnique/>
       </w:docPartObj>
     </w:sdtPr>
-    <w:sdtEndPr/>
     <w:sdtContent>
       <w:p>
         <w:pPr>
@@ -32050,7 +33156,6 @@
         <w:docPartUnique/>
       </w:docPartObj>
     </w:sdtPr>
-    <w:sdtEndPr/>
     <w:sdtContent>
       <w:p>
         <w:pPr>
@@ -33425,6 +34530,95 @@
     </w:lvl>
   </w:abstractNum>
   <w:abstractNum w:abstractNumId="2" w15:restartNumberingAfterBreak="0">
+    <w:nsid w:val="14CE46FF"/>
+    <w:multiLevelType w:val="hybridMultilevel"/>
+    <w:tmpl w:val="5628D002"/>
+    <w:lvl w:ilvl="0" w:tplc="2DB6E568">
+      <w:start w:val="1"/>
+      <w:numFmt w:val="decimal"/>
+      <w:lvlText w:val="%1."/>
+      <w:lvlJc w:val="left"/>
+      <w:pPr>
+        <w:ind w:left="430" w:hanging="360"/>
+      </w:pPr>
+      <w:rPr>
+        <w:rFonts w:hint="default"/>
+      </w:rPr>
+    </w:lvl>
+    <w:lvl w:ilvl="1" w:tplc="04160019" w:tentative="1">
+      <w:start w:val="1"/>
+      <w:numFmt w:val="lowerLetter"/>
+      <w:lvlText w:val="%2."/>
+      <w:lvlJc w:val="left"/>
+      <w:pPr>
+        <w:ind w:left="1150" w:hanging="360"/>
+      </w:pPr>
+    </w:lvl>
+    <w:lvl w:ilvl="2" w:tplc="0416001B" w:tentative="1">
+      <w:start w:val="1"/>
+      <w:numFmt w:val="lowerRoman"/>
+      <w:lvlText w:val="%3."/>
+      <w:lvlJc w:val="right"/>
+      <w:pPr>
+        <w:ind w:left="1870" w:hanging="180"/>
+      </w:pPr>
+    </w:lvl>
+    <w:lvl w:ilvl="3" w:tplc="0416000F" w:tentative="1">
+      <w:start w:val="1"/>
+      <w:numFmt w:val="decimal"/>
+      <w:lvlText w:val="%4."/>
+      <w:lvlJc w:val="left"/>
+      <w:pPr>
+        <w:ind w:left="2590" w:hanging="360"/>
+      </w:pPr>
+    </w:lvl>
+    <w:lvl w:ilvl="4" w:tplc="04160019" w:tentative="1">
+      <w:start w:val="1"/>
+      <w:numFmt w:val="lowerLetter"/>
+      <w:lvlText w:val="%5."/>
+      <w:lvlJc w:val="left"/>
+      <w:pPr>
+        <w:ind w:left="3310" w:hanging="360"/>
+      </w:pPr>
+    </w:lvl>
+    <w:lvl w:ilvl="5" w:tplc="0416001B" w:tentative="1">
+      <w:start w:val="1"/>
+      <w:numFmt w:val="lowerRoman"/>
+      <w:lvlText w:val="%6."/>
+      <w:lvlJc w:val="right"/>
+      <w:pPr>
+        <w:ind w:left="4030" w:hanging="180"/>
+      </w:pPr>
+    </w:lvl>
+    <w:lvl w:ilvl="6" w:tplc="0416000F" w:tentative="1">
+      <w:start w:val="1"/>
+      <w:numFmt w:val="decimal"/>
+      <w:lvlText w:val="%7."/>
+      <w:lvlJc w:val="left"/>
+      <w:pPr>
+        <w:ind w:left="4750" w:hanging="360"/>
+      </w:pPr>
+    </w:lvl>
+    <w:lvl w:ilvl="7" w:tplc="04160019" w:tentative="1">
+      <w:start w:val="1"/>
+      <w:numFmt w:val="lowerLetter"/>
+      <w:lvlText w:val="%8."/>
+      <w:lvlJc w:val="left"/>
+      <w:pPr>
+        <w:ind w:left="5470" w:hanging="360"/>
+      </w:pPr>
+    </w:lvl>
+    <w:lvl w:ilvl="8" w:tplc="0416001B" w:tentative="1">
+      <w:start w:val="1"/>
+      <w:numFmt w:val="lowerRoman"/>
+      <w:lvlText w:val="%9."/>
+      <w:lvlJc w:val="right"/>
+      <w:pPr>
+        <w:ind w:left="6190" w:hanging="180"/>
+      </w:pPr>
+    </w:lvl>
+  </w:abstractNum>
+  <w:abstractNum w:abstractNumId="3" w15:restartNumberingAfterBreak="0">
     <w:nsid w:val="172C19FF"/>
     <w:multiLevelType w:val="multilevel"/>
     <w:tmpl w:val="5FE0A462"/>
@@ -33546,7 +34740,7 @@
       </w:rPr>
     </w:lvl>
   </w:abstractNum>
-  <w:abstractNum w:abstractNumId="3" w15:restartNumberingAfterBreak="0">
+  <w:abstractNum w:abstractNumId="4" w15:restartNumberingAfterBreak="0">
     <w:nsid w:val="19AE68D3"/>
     <w:multiLevelType w:val="multilevel"/>
     <w:tmpl w:val="F3742B46"/>
@@ -33667,7 +34861,7 @@
       </w:rPr>
     </w:lvl>
   </w:abstractNum>
-  <w:abstractNum w:abstractNumId="4" w15:restartNumberingAfterBreak="0">
+  <w:abstractNum w:abstractNumId="5" w15:restartNumberingAfterBreak="0">
     <w:nsid w:val="300A2762"/>
     <w:multiLevelType w:val="multilevel"/>
     <w:tmpl w:val="F3742B46"/>
@@ -33788,7 +34982,7 @@
       </w:rPr>
     </w:lvl>
   </w:abstractNum>
-  <w:abstractNum w:abstractNumId="5" w15:restartNumberingAfterBreak="0">
+  <w:abstractNum w:abstractNumId="6" w15:restartNumberingAfterBreak="0">
     <w:nsid w:val="33090D47"/>
     <w:multiLevelType w:val="hybridMultilevel"/>
     <w:tmpl w:val="2822EFC0"/>
@@ -33877,7 +35071,7 @@
       </w:pPr>
     </w:lvl>
   </w:abstractNum>
-  <w:abstractNum w:abstractNumId="6" w15:restartNumberingAfterBreak="0">
+  <w:abstractNum w:abstractNumId="7" w15:restartNumberingAfterBreak="0">
     <w:nsid w:val="39787550"/>
     <w:multiLevelType w:val="multilevel"/>
     <w:tmpl w:val="B3E62804"/>
@@ -33990,7 +35184,7 @@
       </w:rPr>
     </w:lvl>
   </w:abstractNum>
-  <w:abstractNum w:abstractNumId="7" w15:restartNumberingAfterBreak="0">
+  <w:abstractNum w:abstractNumId="8" w15:restartNumberingAfterBreak="0">
     <w:nsid w:val="3B346D2C"/>
     <w:multiLevelType w:val="hybridMultilevel"/>
     <w:tmpl w:val="0A64E32C"/>
@@ -34103,7 +35297,7 @@
       </w:rPr>
     </w:lvl>
   </w:abstractNum>
-  <w:abstractNum w:abstractNumId="8" w15:restartNumberingAfterBreak="0">
+  <w:abstractNum w:abstractNumId="9" w15:restartNumberingAfterBreak="0">
     <w:nsid w:val="3CD327A2"/>
     <w:multiLevelType w:val="multilevel"/>
     <w:tmpl w:val="E2CAF4F8"/>
@@ -34228,7 +35422,7 @@
       </w:rPr>
     </w:lvl>
   </w:abstractNum>
-  <w:abstractNum w:abstractNumId="9" w15:restartNumberingAfterBreak="0">
+  <w:abstractNum w:abstractNumId="10" w15:restartNumberingAfterBreak="0">
     <w:nsid w:val="3CE2609C"/>
     <w:multiLevelType w:val="multilevel"/>
     <w:tmpl w:val="AFF84B30"/>
@@ -34349,7 +35543,7 @@
       </w:rPr>
     </w:lvl>
   </w:abstractNum>
-  <w:abstractNum w:abstractNumId="10" w15:restartNumberingAfterBreak="0">
+  <w:abstractNum w:abstractNumId="11" w15:restartNumberingAfterBreak="0">
     <w:nsid w:val="474739C4"/>
     <w:multiLevelType w:val="multilevel"/>
     <w:tmpl w:val="477CC9A8"/>
@@ -34462,7 +35656,7 @@
       </w:rPr>
     </w:lvl>
   </w:abstractNum>
-  <w:abstractNum w:abstractNumId="11" w15:restartNumberingAfterBreak="0">
+  <w:abstractNum w:abstractNumId="12" w15:restartNumberingAfterBreak="0">
     <w:nsid w:val="554E4FF6"/>
     <w:multiLevelType w:val="multilevel"/>
     <w:tmpl w:val="AFF84B30"/>
@@ -34472,7 +35666,7 @@
       <w:lvlText w:val="%1."/>
       <w:lvlJc w:val="left"/>
       <w:pPr>
-        <w:ind w:left="720" w:hanging="360"/>
+        <w:ind w:left="360" w:hanging="360"/>
       </w:pPr>
       <w:rPr>
         <w:rFonts w:hint="default"/>
@@ -34485,7 +35679,7 @@
       <w:lvlText w:val="%1.%2"/>
       <w:lvlJc w:val="left"/>
       <w:pPr>
-        <w:ind w:left="720" w:hanging="360"/>
+        <w:ind w:left="360" w:hanging="360"/>
       </w:pPr>
       <w:rPr>
         <w:rFonts w:hint="default"/>
@@ -34498,7 +35692,7 @@
       <w:lvlText w:val="%1.%2.%3"/>
       <w:lvlJc w:val="left"/>
       <w:pPr>
-        <w:ind w:left="1080" w:hanging="720"/>
+        <w:ind w:left="720" w:hanging="720"/>
       </w:pPr>
       <w:rPr>
         <w:rFonts w:hint="default"/>
@@ -34511,7 +35705,7 @@
       <w:lvlText w:val="%1.%2.%3.%4"/>
       <w:lvlJc w:val="left"/>
       <w:pPr>
-        <w:ind w:left="1440" w:hanging="1080"/>
+        <w:ind w:left="1080" w:hanging="1080"/>
       </w:pPr>
       <w:rPr>
         <w:rFonts w:hint="default"/>
@@ -34524,7 +35718,7 @@
       <w:lvlText w:val="%1.%2.%3.%4.%5"/>
       <w:lvlJc w:val="left"/>
       <w:pPr>
-        <w:ind w:left="1440" w:hanging="1080"/>
+        <w:ind w:left="1080" w:hanging="1080"/>
       </w:pPr>
       <w:rPr>
         <w:rFonts w:hint="default"/>
@@ -34537,7 +35731,7 @@
       <w:lvlText w:val="%1.%2.%3.%4.%5.%6"/>
       <w:lvlJc w:val="left"/>
       <w:pPr>
-        <w:ind w:left="1800" w:hanging="1440"/>
+        <w:ind w:left="1440" w:hanging="1440"/>
       </w:pPr>
       <w:rPr>
         <w:rFonts w:hint="default"/>
@@ -34550,7 +35744,7 @@
       <w:lvlText w:val="%1.%2.%3.%4.%5.%6.%7"/>
       <w:lvlJc w:val="left"/>
       <w:pPr>
-        <w:ind w:left="1800" w:hanging="1440"/>
+        <w:ind w:left="1440" w:hanging="1440"/>
       </w:pPr>
       <w:rPr>
         <w:rFonts w:hint="default"/>
@@ -34563,7 +35757,7 @@
       <w:lvlText w:val="%1.%2.%3.%4.%5.%6.%7.%8"/>
       <w:lvlJc w:val="left"/>
       <w:pPr>
-        <w:ind w:left="2160" w:hanging="1800"/>
+        <w:ind w:left="1800" w:hanging="1800"/>
       </w:pPr>
       <w:rPr>
         <w:rFonts w:hint="default"/>
@@ -34576,14 +35770,14 @@
       <w:lvlText w:val="%1.%2.%3.%4.%5.%6.%7.%8.%9"/>
       <w:lvlJc w:val="left"/>
       <w:pPr>
-        <w:ind w:left="2160" w:hanging="1800"/>
+        <w:ind w:left="1800" w:hanging="1800"/>
       </w:pPr>
       <w:rPr>
         <w:rFonts w:hint="default"/>
       </w:rPr>
     </w:lvl>
   </w:abstractNum>
-  <w:abstractNum w:abstractNumId="12" w15:restartNumberingAfterBreak="0">
+  <w:abstractNum w:abstractNumId="13" w15:restartNumberingAfterBreak="0">
     <w:nsid w:val="5D2F1E41"/>
     <w:multiLevelType w:val="multilevel"/>
     <w:tmpl w:val="477CC9A8"/>
@@ -34696,7 +35890,7 @@
       </w:rPr>
     </w:lvl>
   </w:abstractNum>
-  <w:abstractNum w:abstractNumId="13" w15:restartNumberingAfterBreak="0">
+  <w:abstractNum w:abstractNumId="14" w15:restartNumberingAfterBreak="0">
     <w:nsid w:val="5F156CAB"/>
     <w:multiLevelType w:val="multilevel"/>
     <w:tmpl w:val="477CC9A8"/>
@@ -34809,7 +36003,7 @@
       </w:rPr>
     </w:lvl>
   </w:abstractNum>
-  <w:abstractNum w:abstractNumId="14" w15:restartNumberingAfterBreak="0">
+  <w:abstractNum w:abstractNumId="15" w15:restartNumberingAfterBreak="0">
     <w:nsid w:val="5F2F6433"/>
     <w:multiLevelType w:val="multilevel"/>
     <w:tmpl w:val="F3742B46"/>
@@ -34930,7 +36124,7 @@
       </w:rPr>
     </w:lvl>
   </w:abstractNum>
-  <w:abstractNum w:abstractNumId="15" w15:restartNumberingAfterBreak="0">
+  <w:abstractNum w:abstractNumId="16" w15:restartNumberingAfterBreak="0">
     <w:nsid w:val="5F5A416F"/>
     <w:multiLevelType w:val="multilevel"/>
     <w:tmpl w:val="33D03D00"/>
@@ -35043,7 +36237,7 @@
       </w:rPr>
     </w:lvl>
   </w:abstractNum>
-  <w:abstractNum w:abstractNumId="16" w15:restartNumberingAfterBreak="0">
+  <w:abstractNum w:abstractNumId="17" w15:restartNumberingAfterBreak="0">
     <w:nsid w:val="60877390"/>
     <w:multiLevelType w:val="multilevel"/>
     <w:tmpl w:val="F3742B46"/>
@@ -35164,7 +36358,7 @@
       </w:rPr>
     </w:lvl>
   </w:abstractNum>
-  <w:abstractNum w:abstractNumId="17" w15:restartNumberingAfterBreak="0">
+  <w:abstractNum w:abstractNumId="18" w15:restartNumberingAfterBreak="0">
     <w:nsid w:val="6D582A49"/>
     <w:multiLevelType w:val="multilevel"/>
     <w:tmpl w:val="DF0A444C"/>
@@ -35277,7 +36471,7 @@
       </w:rPr>
     </w:lvl>
   </w:abstractNum>
-  <w:abstractNum w:abstractNumId="18" w15:restartNumberingAfterBreak="0">
+  <w:abstractNum w:abstractNumId="19" w15:restartNumberingAfterBreak="0">
     <w:nsid w:val="78CE36D7"/>
     <w:multiLevelType w:val="multilevel"/>
     <w:tmpl w:val="477CC9A8"/>
@@ -35390,7 +36584,7 @@
       </w:rPr>
     </w:lvl>
   </w:abstractNum>
-  <w:abstractNum w:abstractNumId="19" w15:restartNumberingAfterBreak="0">
+  <w:abstractNum w:abstractNumId="20" w15:restartNumberingAfterBreak="0">
     <w:nsid w:val="7A0B42C7"/>
     <w:multiLevelType w:val="multilevel"/>
     <w:tmpl w:val="F3742B46"/>
@@ -35512,64 +36706,67 @@
     </w:lvl>
   </w:abstractNum>
   <w:num w:numId="1">
-    <w:abstractNumId w:val="8"/>
+    <w:abstractNumId w:val="9"/>
   </w:num>
   <w:num w:numId="2">
-    <w:abstractNumId w:val="2"/>
+    <w:abstractNumId w:val="3"/>
   </w:num>
   <w:num w:numId="3">
     <w:abstractNumId w:val="1"/>
   </w:num>
   <w:num w:numId="4">
+    <w:abstractNumId w:val="12"/>
+  </w:num>
+  <w:num w:numId="5">
+    <w:abstractNumId w:val="7"/>
+  </w:num>
+  <w:num w:numId="6">
+    <w:abstractNumId w:val="10"/>
+  </w:num>
+  <w:num w:numId="7">
+    <w:abstractNumId w:val="19"/>
+  </w:num>
+  <w:num w:numId="8">
+    <w:abstractNumId w:val="14"/>
+  </w:num>
+  <w:num w:numId="9">
     <w:abstractNumId w:val="11"/>
   </w:num>
-  <w:num w:numId="5">
+  <w:num w:numId="10">
+    <w:abstractNumId w:val="13"/>
+  </w:num>
+  <w:num w:numId="11">
+    <w:abstractNumId w:val="16"/>
+  </w:num>
+  <w:num w:numId="12">
     <w:abstractNumId w:val="6"/>
   </w:num>
-  <w:num w:numId="6">
-    <w:abstractNumId w:val="9"/>
-  </w:num>
-  <w:num w:numId="7">
+  <w:num w:numId="13">
     <w:abstractNumId w:val="18"/>
   </w:num>
-  <w:num w:numId="8">
-    <w:abstractNumId w:val="13"/>
-  </w:num>
-  <w:num w:numId="9">
-    <w:abstractNumId w:val="10"/>
-  </w:num>
-  <w:num w:numId="10">
-    <w:abstractNumId w:val="12"/>
-  </w:num>
-  <w:num w:numId="11">
-    <w:abstractNumId w:val="15"/>
-  </w:num>
-  <w:num w:numId="12">
-    <w:abstractNumId w:val="5"/>
-  </w:num>
-  <w:num w:numId="13">
-    <w:abstractNumId w:val="17"/>
-  </w:num>
   <w:num w:numId="14">
-    <w:abstractNumId w:val="19"/>
+    <w:abstractNumId w:val="20"/>
   </w:num>
   <w:num w:numId="15">
-    <w:abstractNumId w:val="7"/>
+    <w:abstractNumId w:val="8"/>
   </w:num>
   <w:num w:numId="16">
     <w:abstractNumId w:val="0"/>
   </w:num>
   <w:num w:numId="17">
-    <w:abstractNumId w:val="14"/>
+    <w:abstractNumId w:val="15"/>
   </w:num>
   <w:num w:numId="18">
+    <w:abstractNumId w:val="5"/>
+  </w:num>
+  <w:num w:numId="19">
     <w:abstractNumId w:val="4"/>
   </w:num>
-  <w:num w:numId="19">
-    <w:abstractNumId w:val="3"/>
+  <w:num w:numId="20">
+    <w:abstractNumId w:val="17"/>
   </w:num>
-  <w:num w:numId="20">
-    <w:abstractNumId w:val="16"/>
+  <w:num w:numId="21">
+    <w:abstractNumId w:val="2"/>
   </w:num>
 </w:numbering>
 </file>
@@ -36419,6 +37616,30 @@
       <w:lang w:val="pt-BR" w:eastAsia="pt-BR" w:bidi="pt-BR"/>
     </w:rPr>
   </w:style>
+  <w:style w:type="character" w:styleId="MenoPendente">
+    <w:name w:val="Unresolved Mention"/>
+    <w:basedOn w:val="Fontepargpadro"/>
+    <w:uiPriority w:val="99"/>
+    <w:semiHidden/>
+    <w:unhideWhenUsed/>
+    <w:rsid w:val="00BE1CE2"/>
+    <w:rPr>
+      <w:color w:val="605E5C"/>
+      <w:shd w:val="clear" w:color="auto" w:fill="E1DFDD"/>
+    </w:rPr>
+  </w:style>
+  <w:style w:type="character" w:styleId="HiperlinkVisitado">
+    <w:name w:val="FollowedHyperlink"/>
+    <w:basedOn w:val="Fontepargpadro"/>
+    <w:uiPriority w:val="99"/>
+    <w:semiHidden/>
+    <w:unhideWhenUsed/>
+    <w:rsid w:val="00BE1CE2"/>
+    <w:rPr>
+      <w:color w:val="800080" w:themeColor="followedHyperlink"/>
+      <w:u w:val="single"/>
+    </w:rPr>
+  </w:style>
 </w:styles>
 </file>
 
@@ -36710,7 +37931,7 @@
 </file>
 
 <file path=customXml/itemProps1.xml><?xml version="1.0" encoding="utf-8"?>
-<ds:datastoreItem xmlns:ds="http://schemas.openxmlformats.org/officeDocument/2006/customXml" ds:itemID="{3E156AC4-90AD-489E-A9B1-EA78B28853F9}">
+<ds:datastoreItem xmlns:ds="http://schemas.openxmlformats.org/officeDocument/2006/customXml" ds:itemID="{2941EFE4-6F67-4B97-9A50-71075A93B705}">
   <ds:schemaRefs>
     <ds:schemaRef ds:uri="http://schemas.openxmlformats.org/officeDocument/2006/bibliography"/>
   </ds:schemaRefs>

</xml_diff>

<commit_message>
Documento de requisitos (versão 4.1)
</commit_message>
<xml_diff>
--- a/docs/Documento de Requisitos.docx
+++ b/docs/Documento de Requisitos.docx
@@ -2256,7 +2256,13 @@
               <w:t xml:space="preserve"> (</w:t>
             </w:r>
             <w:r>
-              <w:t>alteração dos atributos nos processos 5.1, 5.2 e 5.3 para realizar adequações e correções em relação aos demais componentes documentados);</w:t>
+              <w:t xml:space="preserve">alteração dos atributos nos processos 5.1, 5.2 e 5.3 para realizar adequações e correções </w:t>
+            </w:r>
+            <w:r>
+              <w:t>quanto</w:t>
+            </w:r>
+            <w:r>
+              <w:t xml:space="preserve"> aos demais componentes documentados);</w:t>
             </w:r>
           </w:p>
           <w:p>
@@ -2387,6 +2393,143 @@
                 <w:bCs/>
               </w:rPr>
             </w:pPr>
+          </w:p>
+        </w:tc>
+        <w:tc>
+          <w:tcPr>
+            <w:tcW w:w="2471" w:type="dxa"/>
+          </w:tcPr>
+          <w:p>
+            <w:pPr>
+              <w:pStyle w:val="TableParagraph"/>
+              <w:spacing w:line="227" w:lineRule="exact"/>
+              <w:rPr>
+                <w:b/>
+                <w:bCs/>
+              </w:rPr>
+            </w:pPr>
+            <w:r>
+              <w:rPr>
+                <w:b/>
+                <w:bCs/>
+              </w:rPr>
+              <w:t>Guilherme Andrade</w:t>
+            </w:r>
+          </w:p>
+        </w:tc>
+      </w:tr>
+      <w:tr>
+        <w:trPr>
+          <w:trHeight w:val="282"/>
+        </w:trPr>
+        <w:tc>
+          <w:tcPr>
+            <w:tcW w:w="1579" w:type="dxa"/>
+          </w:tcPr>
+          <w:p>
+            <w:pPr>
+              <w:pStyle w:val="TableParagraph"/>
+              <w:spacing w:line="227" w:lineRule="exact"/>
+              <w:ind w:left="69"/>
+              <w:jc w:val="center"/>
+              <w:rPr>
+                <w:b/>
+                <w:bCs/>
+                <w:lang w:val="en-US" w:eastAsia="en-US"/>
+              </w:rPr>
+            </w:pPr>
+            <w:r>
+              <w:rPr>
+                <w:b/>
+                <w:bCs/>
+                <w:lang w:val="en-US" w:eastAsia="en-US"/>
+              </w:rPr>
+              <w:t>29/10/2019</w:t>
+            </w:r>
+          </w:p>
+        </w:tc>
+        <w:tc>
+          <w:tcPr>
+            <w:tcW w:w="1051" w:type="dxa"/>
+          </w:tcPr>
+          <w:p>
+            <w:pPr>
+              <w:pStyle w:val="TableParagraph"/>
+              <w:spacing w:line="227" w:lineRule="exact"/>
+              <w:ind w:left="184" w:right="177"/>
+              <w:jc w:val="center"/>
+              <w:rPr>
+                <w:b/>
+                <w:bCs/>
+                <w:lang w:val="en-US" w:eastAsia="en-US"/>
+              </w:rPr>
+            </w:pPr>
+            <w:r>
+              <w:rPr>
+                <w:b/>
+                <w:bCs/>
+                <w:lang w:val="en-US" w:eastAsia="en-US"/>
+              </w:rPr>
+              <w:t>4.1</w:t>
+            </w:r>
+          </w:p>
+        </w:tc>
+        <w:tc>
+          <w:tcPr>
+            <w:tcW w:w="4619" w:type="dxa"/>
+          </w:tcPr>
+          <w:p>
+            <w:pPr>
+              <w:pStyle w:val="TableParagraph"/>
+              <w:ind w:left="70"/>
+              <w:rPr>
+                <w:b/>
+                <w:bCs/>
+              </w:rPr>
+            </w:pPr>
+            <w:r>
+              <w:rPr>
+                <w:b/>
+                <w:bCs/>
+              </w:rPr>
+              <w:t>Atualização do Documento:</w:t>
+            </w:r>
+          </w:p>
+          <w:p>
+            <w:pPr>
+              <w:pStyle w:val="TableParagraph"/>
+              <w:ind w:left="70"/>
+            </w:pPr>
+            <w:hyperlink w:anchor="_INTERFACES" w:history="1">
+              <w:r>
+                <w:rPr>
+                  <w:rStyle w:val="Hyperlink"/>
+                  <w:b/>
+                  <w:bCs/>
+                  <w:color w:val="000000" w:themeColor="text1"/>
+                  <w:u w:val="none"/>
+                </w:rPr>
+                <w:t>9. Interfaces</w:t>
+              </w:r>
+            </w:hyperlink>
+            <w:r>
+              <w:rPr>
+                <w:rStyle w:val="Hyperlink"/>
+                <w:b/>
+                <w:bCs/>
+                <w:color w:val="000000" w:themeColor="text1"/>
+                <w:u w:val="none"/>
+              </w:rPr>
+              <w:t xml:space="preserve"> </w:t>
+            </w:r>
+            <w:r>
+              <w:rPr>
+                <w:rStyle w:val="Hyperlink"/>
+                <w:color w:val="000000" w:themeColor="text1"/>
+                <w:u w:val="none"/>
+              </w:rPr>
+              <w:t>(reelaboração do layout da interface do sistema);</w:t>
+            </w:r>
           </w:p>
         </w:tc>
         <w:tc>
@@ -4980,7 +5123,7 @@
                 <w:noProof/>
                 <w:webHidden/>
               </w:rPr>
-              <w:t>19</w:t>
+              <w:t>21</w:t>
             </w:r>
             <w:r>
               <w:rPr>
@@ -5067,7 +5210,7 @@
                 <w:noProof/>
                 <w:webHidden/>
               </w:rPr>
-              <w:t>20</w:t>
+              <w:t>24</w:t>
             </w:r>
             <w:r>
               <w:rPr>
@@ -5161,7 +5304,7 @@
                 <w:noProof/>
                 <w:webHidden/>
               </w:rPr>
-              <w:t>20</w:t>
+              <w:t>24</w:t>
             </w:r>
             <w:r>
               <w:rPr>
@@ -5255,7 +5398,7 @@
                 <w:noProof/>
                 <w:webHidden/>
               </w:rPr>
-              <w:t>20</w:t>
+              <w:t>24</w:t>
             </w:r>
             <w:r>
               <w:rPr>
@@ -5333,7 +5476,7 @@
                 <w:noProof/>
                 <w:webHidden/>
               </w:rPr>
-              <w:t>20</w:t>
+              <w:t>24</w:t>
             </w:r>
             <w:r>
               <w:rPr>
@@ -5405,7 +5548,7 @@
                 <w:noProof/>
                 <w:webHidden/>
               </w:rPr>
-              <w:t>22</w:t>
+              <w:t>26</w:t>
             </w:r>
             <w:r>
               <w:rPr>
@@ -6648,8 +6791,10 @@
                 <w:bCs/>
                 <w:sz w:val="20"/>
               </w:rPr>
-              <w:t>0</w:t>
-            </w:r>
+              <w:t>1</w:t>
+            </w:r>
+            <w:bookmarkStart w:id="4" w:name="_GoBack"/>
+            <w:bookmarkEnd w:id="4"/>
           </w:p>
         </w:tc>
         <w:tc>
@@ -7011,14 +7156,14 @@
           <w:numId w:val="4"/>
         </w:numPr>
       </w:pPr>
-      <w:bookmarkStart w:id="4" w:name="_REGRAS_DE_NEGÓCIO"/>
-      <w:bookmarkStart w:id="5" w:name="_Toc22977015"/>
-      <w:bookmarkEnd w:id="4"/>
+      <w:bookmarkStart w:id="5" w:name="_REGRAS_DE_NEGÓCIO"/>
+      <w:bookmarkStart w:id="6" w:name="_Toc22977015"/>
+      <w:bookmarkEnd w:id="5"/>
       <w:r>
         <w:lastRenderedPageBreak/>
         <w:t>REGRAS DE NEGÓCIO</w:t>
       </w:r>
-      <w:bookmarkEnd w:id="5"/>
+      <w:bookmarkEnd w:id="6"/>
     </w:p>
     <w:p>
       <w:pPr>
@@ -7041,14 +7186,14 @@
           <w:tab w:val="left" w:pos="727"/>
         </w:tabs>
       </w:pPr>
-      <w:bookmarkStart w:id="6" w:name="_Toc22977016"/>
+      <w:bookmarkStart w:id="7" w:name="_Toc22977016"/>
       <w:r>
         <w:t xml:space="preserve">Módulo: </w:t>
       </w:r>
       <w:r>
         <w:t>Gestão de Usuário</w:t>
       </w:r>
-      <w:bookmarkEnd w:id="6"/>
+      <w:bookmarkEnd w:id="7"/>
     </w:p>
     <w:p>
       <w:pPr>
@@ -8568,7 +8713,7 @@
           <w:b/>
         </w:rPr>
       </w:pPr>
-      <w:bookmarkStart w:id="7" w:name="_Toc22977017"/>
+      <w:bookmarkStart w:id="8" w:name="_Toc22977017"/>
       <w:r>
         <w:rPr>
           <w:b/>
@@ -8581,7 +8726,7 @@
         </w:rPr>
         <w:t>de Negócio</w:t>
       </w:r>
-      <w:bookmarkEnd w:id="7"/>
+      <w:bookmarkEnd w:id="8"/>
     </w:p>
     <w:p>
       <w:pPr>
@@ -8998,7 +9143,7 @@
           <w:b/>
         </w:rPr>
       </w:pPr>
-      <w:bookmarkStart w:id="8" w:name="_Toc22977018"/>
+      <w:bookmarkStart w:id="9" w:name="_Toc22977018"/>
       <w:r>
         <w:rPr>
           <w:b/>
@@ -9012,7 +9157,7 @@
         </w:rPr>
         <w:t>de Ordem de Serviço</w:t>
       </w:r>
-      <w:bookmarkEnd w:id="8"/>
+      <w:bookmarkEnd w:id="9"/>
     </w:p>
     <w:p>
       <w:pPr>
@@ -9439,14 +9584,14 @@
         </w:numPr>
         <w:spacing w:after="240" w:line="360" w:lineRule="auto"/>
       </w:pPr>
-      <w:bookmarkStart w:id="9" w:name="_REQUISITOS_FUNCIONAIS"/>
-      <w:bookmarkStart w:id="10" w:name="_Toc22977019"/>
-      <w:bookmarkEnd w:id="9"/>
+      <w:bookmarkStart w:id="10" w:name="_REQUISITOS_FUNCIONAIS"/>
+      <w:bookmarkStart w:id="11" w:name="_Toc22977019"/>
+      <w:bookmarkEnd w:id="10"/>
       <w:r>
         <w:lastRenderedPageBreak/>
         <w:t>REQUISITOS FUNCIONAIS</w:t>
       </w:r>
-      <w:bookmarkEnd w:id="10"/>
+      <w:bookmarkEnd w:id="11"/>
     </w:p>
     <w:p>
       <w:pPr>
@@ -9463,11 +9608,11 @@
       <w:r>
         <w:t xml:space="preserve"> </w:t>
       </w:r>
-      <w:bookmarkStart w:id="11" w:name="_Toc22977020"/>
+      <w:bookmarkStart w:id="12" w:name="_Toc22977020"/>
       <w:r>
         <w:t>Processo: Controle de Usuários</w:t>
       </w:r>
-      <w:bookmarkEnd w:id="11"/>
+      <w:bookmarkEnd w:id="12"/>
     </w:p>
     <w:tbl>
       <w:tblPr>
@@ -9859,11 +10004,11 @@
       <w:r>
         <w:t xml:space="preserve"> </w:t>
       </w:r>
-      <w:bookmarkStart w:id="12" w:name="_Toc22977021"/>
+      <w:bookmarkStart w:id="13" w:name="_Toc22977021"/>
       <w:r>
         <w:t xml:space="preserve">Processo: Controle de </w:t>
       </w:r>
-      <w:bookmarkEnd w:id="12"/>
+      <w:bookmarkEnd w:id="13"/>
       <w:r>
         <w:t>Empreendimento</w:t>
       </w:r>
@@ -10411,11 +10556,11 @@
         <w:lastRenderedPageBreak/>
         <w:t xml:space="preserve"> </w:t>
       </w:r>
-      <w:bookmarkStart w:id="13" w:name="_Toc22977022"/>
+      <w:bookmarkStart w:id="14" w:name="_Toc22977022"/>
       <w:r>
         <w:t>Processo: Controle de Ordem de Serviço</w:t>
       </w:r>
-      <w:bookmarkEnd w:id="13"/>
+      <w:bookmarkEnd w:id="14"/>
     </w:p>
     <w:tbl>
       <w:tblPr>
@@ -10721,14 +10866,14 @@
         </w:numPr>
         <w:spacing w:after="240" w:line="360" w:lineRule="auto"/>
       </w:pPr>
-      <w:bookmarkStart w:id="14" w:name="_REQUISITOS_NÃO_FUNCIONAIS"/>
-      <w:bookmarkStart w:id="15" w:name="_Toc22977023"/>
-      <w:bookmarkEnd w:id="14"/>
+      <w:bookmarkStart w:id="15" w:name="_REQUISITOS_NÃO_FUNCIONAIS"/>
+      <w:bookmarkStart w:id="16" w:name="_Toc22977023"/>
+      <w:bookmarkEnd w:id="15"/>
       <w:r>
         <w:lastRenderedPageBreak/>
         <w:t>REQUISITOS NÃO FUNCIONAIS</w:t>
       </w:r>
-      <w:bookmarkEnd w:id="15"/>
+      <w:bookmarkEnd w:id="16"/>
     </w:p>
     <w:p>
       <w:pPr>
@@ -11903,14 +12048,14 @@
         </w:numPr>
         <w:spacing w:after="240"/>
       </w:pPr>
-      <w:bookmarkStart w:id="16" w:name="_REQUISITOS_COMPLEMENTARES"/>
-      <w:bookmarkStart w:id="17" w:name="_Toc22977024"/>
-      <w:bookmarkEnd w:id="16"/>
+      <w:bookmarkStart w:id="17" w:name="_REQUISITOS_COMPLEMENTARES"/>
+      <w:bookmarkStart w:id="18" w:name="_Toc22977024"/>
+      <w:bookmarkEnd w:id="17"/>
       <w:r>
         <w:lastRenderedPageBreak/>
         <w:t>REQUISITOS COMPLEMENTARES</w:t>
       </w:r>
-      <w:bookmarkEnd w:id="17"/>
+      <w:bookmarkEnd w:id="18"/>
     </w:p>
     <w:p>
       <w:pPr>
@@ -11934,11 +12079,11 @@
       <w:r>
         <w:t xml:space="preserve"> </w:t>
       </w:r>
-      <w:bookmarkStart w:id="18" w:name="_Toc22977025"/>
+      <w:bookmarkStart w:id="19" w:name="_Toc22977025"/>
       <w:r>
         <w:t>Processo: Controle de Usuários</w:t>
       </w:r>
-      <w:bookmarkEnd w:id="18"/>
+      <w:bookmarkEnd w:id="19"/>
     </w:p>
     <w:tbl>
       <w:tblPr>
@@ -12841,11 +12986,11 @@
       <w:r>
         <w:t xml:space="preserve"> </w:t>
       </w:r>
-      <w:bookmarkStart w:id="19" w:name="_Toc22977026"/>
+      <w:bookmarkStart w:id="20" w:name="_Toc22977026"/>
       <w:r>
         <w:t xml:space="preserve">Processo: Controle de </w:t>
       </w:r>
-      <w:bookmarkEnd w:id="19"/>
+      <w:bookmarkEnd w:id="20"/>
       <w:r>
         <w:t>Empreendimento</w:t>
       </w:r>
@@ -13414,14 +13559,14 @@
       <w:r>
         <w:t xml:space="preserve"> </w:t>
       </w:r>
-      <w:bookmarkStart w:id="20" w:name="_Toc22977027"/>
+      <w:bookmarkStart w:id="21" w:name="_Toc22977027"/>
       <w:r>
         <w:t xml:space="preserve">Processo: Controle de </w:t>
       </w:r>
       <w:r>
         <w:t>Ordem de Serviço</w:t>
       </w:r>
-      <w:bookmarkEnd w:id="20"/>
+      <w:bookmarkEnd w:id="21"/>
     </w:p>
     <w:tbl>
       <w:tblPr>
@@ -14059,16 +14204,16 @@
         </w:numPr>
         <w:spacing w:after="240"/>
       </w:pPr>
-      <w:bookmarkStart w:id="21" w:name="_67yng7u0nqhx" w:colFirst="0" w:colLast="0"/>
-      <w:bookmarkStart w:id="22" w:name="_CASOS_DE_USO"/>
-      <w:bookmarkStart w:id="23" w:name="_Toc22977028"/>
-      <w:bookmarkEnd w:id="21"/>
+      <w:bookmarkStart w:id="22" w:name="_67yng7u0nqhx" w:colFirst="0" w:colLast="0"/>
+      <w:bookmarkStart w:id="23" w:name="_CASOS_DE_USO"/>
+      <w:bookmarkStart w:id="24" w:name="_Toc22977028"/>
       <w:bookmarkEnd w:id="22"/>
+      <w:bookmarkEnd w:id="23"/>
       <w:r>
         <w:lastRenderedPageBreak/>
         <w:t>CASOS DE USO</w:t>
       </w:r>
-      <w:bookmarkEnd w:id="23"/>
+      <w:bookmarkEnd w:id="24"/>
     </w:p>
     <w:p>
       <w:pPr>
@@ -14092,11 +14237,11 @@
       <w:r>
         <w:t xml:space="preserve"> </w:t>
       </w:r>
-      <w:bookmarkStart w:id="24" w:name="_Toc22977029"/>
+      <w:bookmarkStart w:id="25" w:name="_Toc22977029"/>
       <w:r>
         <w:t>DESCRIÇÃO DE CASO DE USO</w:t>
       </w:r>
-      <w:bookmarkEnd w:id="24"/>
+      <w:bookmarkEnd w:id="25"/>
     </w:p>
     <w:tbl>
       <w:tblPr>
@@ -15327,14 +15472,14 @@
         </w:numPr>
         <w:spacing w:after="240"/>
       </w:pPr>
-      <w:bookmarkStart w:id="25" w:name="_DIAGRAMAS"/>
-      <w:bookmarkStart w:id="26" w:name="_Toc22977030"/>
-      <w:bookmarkEnd w:id="25"/>
+      <w:bookmarkStart w:id="26" w:name="_DIAGRAMAS"/>
+      <w:bookmarkStart w:id="27" w:name="_Toc22977030"/>
+      <w:bookmarkEnd w:id="26"/>
       <w:r>
         <w:lastRenderedPageBreak/>
         <w:t>DIAGRAMAS</w:t>
       </w:r>
-      <w:bookmarkEnd w:id="26"/>
+      <w:bookmarkEnd w:id="27"/>
     </w:p>
     <w:p>
       <w:pPr>
@@ -15355,7 +15500,7 @@
         </w:tabs>
         <w:spacing w:after="240" w:line="360" w:lineRule="auto"/>
       </w:pPr>
-      <w:bookmarkStart w:id="27" w:name="_Toc22977031"/>
+      <w:bookmarkStart w:id="28" w:name="_Toc22977031"/>
       <w:r>
         <w:rPr>
           <w:noProof/>
@@ -15448,7 +15593,6 @@
                                 </w:rPr>
                                 <w:t xml:space="preserve"> </w:t>
                               </w:r>
-                              <w:proofErr w:type="spellStart"/>
                               <w:r>
                                 <w:rPr>
                                   <w:rFonts w:ascii="Times New Roman" w:eastAsia="Times New Roman" w:hAnsi="Times New Roman" w:cs="Times New Roman"/>
@@ -15457,7 +15601,6 @@
                                 </w:rPr>
                                 <w:t>powered</w:t>
                               </w:r>
-                              <w:proofErr w:type="spellEnd"/>
                               <w:r>
                                 <w:rPr>
                                   <w:rFonts w:ascii="Times New Roman" w:eastAsia="Times New Roman" w:hAnsi="Times New Roman" w:cs="Times New Roman"/>
@@ -15467,7 +15610,6 @@
                                 </w:rPr>
                                 <w:t xml:space="preserve"> </w:t>
                               </w:r>
-                              <w:proofErr w:type="spellStart"/>
                               <w:r>
                                 <w:rPr>
                                   <w:rFonts w:ascii="Times New Roman" w:eastAsia="Times New Roman" w:hAnsi="Times New Roman" w:cs="Times New Roman"/>
@@ -15476,7 +15618,6 @@
                                 </w:rPr>
                                 <w:t>by</w:t>
                               </w:r>
-                              <w:proofErr w:type="spellEnd"/>
                               <w:r>
                                 <w:rPr>
                                   <w:rFonts w:ascii="Times New Roman" w:eastAsia="Times New Roman" w:hAnsi="Times New Roman" w:cs="Times New Roman"/>
@@ -15486,7 +15627,6 @@
                                 </w:rPr>
                                 <w:t xml:space="preserve"> </w:t>
                               </w:r>
-                              <w:proofErr w:type="spellStart"/>
                               <w:r>
                                 <w:rPr>
                                   <w:rFonts w:ascii="Times New Roman" w:eastAsia="Times New Roman" w:hAnsi="Times New Roman" w:cs="Times New Roman"/>
@@ -15495,7 +15635,6 @@
                                 </w:rPr>
                                 <w:t>Astah</w:t>
                               </w:r>
-                              <w:proofErr w:type="spellEnd"/>
                               <w:r>
                                 <w:rPr>
                                   <w:rFonts w:ascii="Times New Roman" w:eastAsia="Times New Roman" w:hAnsi="Times New Roman" w:cs="Times New Roman"/>
@@ -15952,7 +16091,6 @@
                         <wps:txbx>
                           <w:txbxContent>
                             <w:p>
-                              <w:proofErr w:type="spellStart"/>
                               <w:r>
                                 <w:rPr>
                                   <w:rFonts w:ascii="Times New Roman" w:eastAsia="Times New Roman" w:hAnsi="Times New Roman" w:cs="Times New Roman"/>
@@ -15961,7 +16099,6 @@
                                 </w:rPr>
                                 <w:t>uc</w:t>
                               </w:r>
-                              <w:proofErr w:type="spellEnd"/>
                               <w:r>
                                 <w:rPr>
                                   <w:rFonts w:ascii="Times New Roman" w:eastAsia="Times New Roman" w:hAnsi="Times New Roman" w:cs="Times New Roman"/>
@@ -26043,7 +26180,6 @@
                           </w:rPr>
                           <w:t xml:space="preserve"> </w:t>
                         </w:r>
-                        <w:proofErr w:type="spellStart"/>
                         <w:r>
                           <w:rPr>
                             <w:rFonts w:ascii="Times New Roman" w:eastAsia="Times New Roman" w:hAnsi="Times New Roman" w:cs="Times New Roman"/>
@@ -26052,7 +26188,6 @@
                           </w:rPr>
                           <w:t>powered</w:t>
                         </w:r>
-                        <w:proofErr w:type="spellEnd"/>
                         <w:r>
                           <w:rPr>
                             <w:rFonts w:ascii="Times New Roman" w:eastAsia="Times New Roman" w:hAnsi="Times New Roman" w:cs="Times New Roman"/>
@@ -26062,7 +26197,6 @@
                           </w:rPr>
                           <w:t xml:space="preserve"> </w:t>
                         </w:r>
-                        <w:proofErr w:type="spellStart"/>
                         <w:r>
                           <w:rPr>
                             <w:rFonts w:ascii="Times New Roman" w:eastAsia="Times New Roman" w:hAnsi="Times New Roman" w:cs="Times New Roman"/>
@@ -26071,7 +26205,6 @@
                           </w:rPr>
                           <w:t>by</w:t>
                         </w:r>
-                        <w:proofErr w:type="spellEnd"/>
                         <w:r>
                           <w:rPr>
                             <w:rFonts w:ascii="Times New Roman" w:eastAsia="Times New Roman" w:hAnsi="Times New Roman" w:cs="Times New Roman"/>
@@ -26081,7 +26214,6 @@
                           </w:rPr>
                           <w:t xml:space="preserve"> </w:t>
                         </w:r>
-                        <w:proofErr w:type="spellStart"/>
                         <w:r>
                           <w:rPr>
                             <w:rFonts w:ascii="Times New Roman" w:eastAsia="Times New Roman" w:hAnsi="Times New Roman" w:cs="Times New Roman"/>
@@ -26090,7 +26222,6 @@
                           </w:rPr>
                           <w:t>Astah</w:t>
                         </w:r>
-                        <w:proofErr w:type="spellEnd"/>
                         <w:r>
                           <w:rPr>
                             <w:rFonts w:ascii="Times New Roman" w:eastAsia="Times New Roman" w:hAnsi="Times New Roman" w:cs="Times New Roman"/>
@@ -26182,7 +26313,6 @@
                   <v:textbox inset="0,0,0,0">
                     <w:txbxContent>
                       <w:p>
-                        <w:proofErr w:type="spellStart"/>
                         <w:r>
                           <w:rPr>
                             <w:rFonts w:ascii="Times New Roman" w:eastAsia="Times New Roman" w:hAnsi="Times New Roman" w:cs="Times New Roman"/>
@@ -26191,7 +26321,6 @@
                           </w:rPr>
                           <w:t>uc</w:t>
                         </w:r>
-                        <w:proofErr w:type="spellEnd"/>
                         <w:r>
                           <w:rPr>
                             <w:rFonts w:ascii="Times New Roman" w:eastAsia="Times New Roman" w:hAnsi="Times New Roman" w:cs="Times New Roman"/>
@@ -27646,7 +27775,7 @@
       <w:r>
         <w:t xml:space="preserve"> DE USO</w:t>
       </w:r>
-      <w:bookmarkEnd w:id="27"/>
+      <w:bookmarkEnd w:id="28"/>
     </w:p>
     <w:p>
       <w:pPr>
@@ -27740,9 +27869,9 @@
         </w:tabs>
         <w:spacing w:after="240" w:line="360" w:lineRule="auto"/>
       </w:pPr>
-      <w:bookmarkStart w:id="28" w:name="_DIAGRAMA_DE_CLASSES"/>
-      <w:bookmarkStart w:id="29" w:name="_Toc22977032"/>
-      <w:bookmarkEnd w:id="28"/>
+      <w:bookmarkStart w:id="29" w:name="_DIAGRAMA_DE_CLASSES"/>
+      <w:bookmarkStart w:id="30" w:name="_Toc22977032"/>
+      <w:bookmarkEnd w:id="29"/>
       <w:r>
         <w:rPr>
           <w:noProof/>
@@ -27811,7 +27940,7 @@
       <w:r>
         <w:t>S</w:t>
       </w:r>
-      <w:bookmarkEnd w:id="29"/>
+      <w:bookmarkEnd w:id="30"/>
     </w:p>
     <w:p>
       <w:pPr>
@@ -27941,7 +28070,7 @@
         <w:spacing w:after="240" w:line="360" w:lineRule="auto"/>
         <w:ind w:left="360" w:firstLine="0"/>
       </w:pPr>
-      <w:bookmarkStart w:id="30" w:name="_Toc22977033"/>
+      <w:bookmarkStart w:id="31" w:name="_Toc22977033"/>
       <w:r>
         <w:rPr>
           <w:noProof/>
@@ -28006,7 +28135,7 @@
       <w:r>
         <w:t>DIAGRAMA DE SEQUÊNCIA</w:t>
       </w:r>
-      <w:bookmarkEnd w:id="30"/>
+      <w:bookmarkEnd w:id="31"/>
     </w:p>
     <w:p>
       <w:pPr>
@@ -28021,14 +28150,14 @@
           <w:numId w:val="17"/>
         </w:numPr>
       </w:pPr>
-      <w:bookmarkStart w:id="31" w:name="_MODELAGEM_DO_BANCO"/>
-      <w:bookmarkStart w:id="32" w:name="_Toc22977034"/>
-      <w:bookmarkEnd w:id="31"/>
+      <w:bookmarkStart w:id="32" w:name="_MODELAGEM_DO_BANCO"/>
+      <w:bookmarkStart w:id="33" w:name="_Toc22977034"/>
+      <w:bookmarkEnd w:id="32"/>
       <w:r>
         <w:lastRenderedPageBreak/>
         <w:t>MODELAGEM DO BANCO DE DADOS</w:t>
       </w:r>
-      <w:bookmarkEnd w:id="32"/>
+      <w:bookmarkEnd w:id="33"/>
     </w:p>
     <w:p>
       <w:pPr>
@@ -28047,7 +28176,7 @@
           <w:szCs w:val="24"/>
         </w:rPr>
       </w:pPr>
-      <w:bookmarkStart w:id="33" w:name="_Toc22977035"/>
+      <w:bookmarkStart w:id="34" w:name="_Toc22977035"/>
       <w:r>
         <w:rPr>
           <w:sz w:val="24"/>
@@ -28055,7 +28184,7 @@
         </w:rPr>
         <w:t>MODELO CONCEITUAL</w:t>
       </w:r>
-      <w:bookmarkEnd w:id="33"/>
+      <w:bookmarkEnd w:id="34"/>
       <w:r>
         <w:rPr>
           <w:sz w:val="24"/>
@@ -28069,10 +28198,10 @@
         <w:pStyle w:val="Ttulo1"/>
         <w:ind w:left="765"/>
       </w:pPr>
-      <w:bookmarkStart w:id="34" w:name="_Toc22137214"/>
-      <w:bookmarkStart w:id="35" w:name="_Toc22137346"/>
-      <w:bookmarkStart w:id="36" w:name="_Toc22137940"/>
-      <w:bookmarkStart w:id="37" w:name="_Toc22977036"/>
+      <w:bookmarkStart w:id="35" w:name="_Toc22137214"/>
+      <w:bookmarkStart w:id="36" w:name="_Toc22137346"/>
+      <w:bookmarkStart w:id="37" w:name="_Toc22137940"/>
+      <w:bookmarkStart w:id="38" w:name="_Toc22977036"/>
       <w:r>
         <w:rPr>
           <w:noProof/>
@@ -28143,10 +28272,10 @@
           </wp:anchor>
         </w:drawing>
       </w:r>
-      <w:bookmarkEnd w:id="34"/>
       <w:bookmarkEnd w:id="35"/>
       <w:bookmarkEnd w:id="36"/>
       <w:bookmarkEnd w:id="37"/>
+      <w:bookmarkEnd w:id="38"/>
     </w:p>
     <w:p>
       <w:pPr>
@@ -28237,7 +28366,7 @@
           <w:szCs w:val="24"/>
         </w:rPr>
       </w:pPr>
-      <w:bookmarkStart w:id="38" w:name="_Toc22977037"/>
+      <w:bookmarkStart w:id="39" w:name="_Toc22977037"/>
       <w:r>
         <w:rPr>
           <w:sz w:val="24"/>
@@ -28253,17 +28382,17 @@
         </w:rPr>
         <w:t xml:space="preserve"> LÓGICO</w:t>
       </w:r>
-      <w:bookmarkEnd w:id="38"/>
+      <w:bookmarkEnd w:id="39"/>
     </w:p>
     <w:p>
       <w:pPr>
         <w:pStyle w:val="Ttulo1"/>
         <w:ind w:left="720"/>
       </w:pPr>
-      <w:bookmarkStart w:id="39" w:name="_Toc22137216"/>
-      <w:bookmarkStart w:id="40" w:name="_Toc22137348"/>
-      <w:bookmarkStart w:id="41" w:name="_Toc22137942"/>
-      <w:bookmarkStart w:id="42" w:name="_Toc22977038"/>
+      <w:bookmarkStart w:id="40" w:name="_Toc22137216"/>
+      <w:bookmarkStart w:id="41" w:name="_Toc22137348"/>
+      <w:bookmarkStart w:id="42" w:name="_Toc22137942"/>
+      <w:bookmarkStart w:id="43" w:name="_Toc22977038"/>
       <w:r>
         <w:rPr>
           <w:noProof/>
@@ -28334,10 +28463,10 @@
           </wp:anchor>
         </w:drawing>
       </w:r>
-      <w:bookmarkEnd w:id="39"/>
       <w:bookmarkEnd w:id="40"/>
       <w:bookmarkEnd w:id="41"/>
       <w:bookmarkEnd w:id="42"/>
+      <w:bookmarkEnd w:id="43"/>
     </w:p>
     <w:p>
       <w:pPr>
@@ -28426,14 +28555,14 @@
         </w:numPr>
         <w:spacing w:before="120"/>
       </w:pPr>
-      <w:bookmarkStart w:id="43" w:name="_Toc22977039"/>
       <w:bookmarkStart w:id="44" w:name="_INTERFACES"/>
+      <w:bookmarkStart w:id="45" w:name="_Toc22977039"/>
       <w:bookmarkEnd w:id="44"/>
       <w:r>
         <w:lastRenderedPageBreak/>
         <w:t>INTERFACES</w:t>
       </w:r>
-      <w:bookmarkEnd w:id="43"/>
+      <w:bookmarkEnd w:id="45"/>
     </w:p>
     <w:p>
       <w:pPr>
@@ -28453,7 +28582,79 @@
           <w:szCs w:val="24"/>
         </w:rPr>
       </w:pPr>
-      <w:bookmarkStart w:id="45" w:name="_Toc22977040"/>
+      <w:bookmarkStart w:id="46" w:name="_Toc22977040"/>
+      <w:r>
+        <w:rPr>
+          <w:noProof/>
+          <w:sz w:val="24"/>
+          <w:szCs w:val="24"/>
+        </w:rPr>
+        <w:drawing>
+          <wp:anchor distT="0" distB="0" distL="114300" distR="114300" simplePos="0" relativeHeight="251666432" behindDoc="0" locked="0" layoutInCell="1" allowOverlap="1" wp14:anchorId="33182E64" wp14:editId="0A0B5D7E">
+            <wp:simplePos x="0" y="0"/>
+            <wp:positionH relativeFrom="column">
+              <wp:posOffset>-1314</wp:posOffset>
+            </wp:positionH>
+            <wp:positionV relativeFrom="paragraph">
+              <wp:posOffset>491490</wp:posOffset>
+            </wp:positionV>
+            <wp:extent cx="6448425" cy="4314825"/>
+            <wp:effectExtent l="0" t="0" r="9525" b="9525"/>
+            <wp:wrapSquare wrapText="bothSides"/>
+            <wp:docPr id="1856" name="Imagem 1856"/>
+            <wp:cNvGraphicFramePr>
+              <a:graphicFrameLocks xmlns:a="http://schemas.openxmlformats.org/drawingml/2006/main" noChangeAspect="1"/>
+            </wp:cNvGraphicFramePr>
+            <a:graphic xmlns:a="http://schemas.openxmlformats.org/drawingml/2006/main">
+              <a:graphicData uri="http://schemas.openxmlformats.org/drawingml/2006/picture">
+                <pic:pic xmlns:pic="http://schemas.openxmlformats.org/drawingml/2006/picture">
+                  <pic:nvPicPr>
+                    <pic:cNvPr id="0" name="Picture 1"/>
+                    <pic:cNvPicPr>
+                      <a:picLocks noChangeAspect="1" noChangeArrowheads="1"/>
+                    </pic:cNvPicPr>
+                  </pic:nvPicPr>
+                  <pic:blipFill rotWithShape="1">
+                    <a:blip r:embed="rId23">
+                      <a:extLst>
+                        <a:ext uri="{28A0092B-C50C-407E-A947-70E740481C1C}">
+                          <a14:useLocalDpi xmlns:a14="http://schemas.microsoft.com/office/drawing/2010/main" val="0"/>
+                        </a:ext>
+                      </a:extLst>
+                    </a:blip>
+                    <a:srcRect t="10651"/>
+                    <a:stretch/>
+                  </pic:blipFill>
+                  <pic:spPr bwMode="auto">
+                    <a:xfrm>
+                      <a:off x="0" y="0"/>
+                      <a:ext cx="6448425" cy="4314825"/>
+                    </a:xfrm>
+                    <a:prstGeom prst="rect">
+                      <a:avLst/>
+                    </a:prstGeom>
+                    <a:noFill/>
+                    <a:ln>
+                      <a:noFill/>
+                    </a:ln>
+                    <a:extLst>
+                      <a:ext uri="{53640926-AAD7-44D8-BBD7-CCE9431645EC}">
+                        <a14:shadowObscured xmlns:a14="http://schemas.microsoft.com/office/drawing/2010/main"/>
+                      </a:ext>
+                    </a:extLst>
+                  </pic:spPr>
+                </pic:pic>
+              </a:graphicData>
+            </a:graphic>
+            <wp14:sizeRelH relativeFrom="page">
+              <wp14:pctWidth>0</wp14:pctWidth>
+            </wp14:sizeRelH>
+            <wp14:sizeRelV relativeFrom="page">
+              <wp14:pctHeight>0</wp14:pctHeight>
+            </wp14:sizeRelV>
+          </wp:anchor>
+        </w:drawing>
+      </w:r>
       <w:r>
         <w:rPr>
           <w:sz w:val="24"/>
@@ -28461,7 +28662,84 @@
         </w:rPr>
         <w:t>TELA INICIAL</w:t>
       </w:r>
-      <w:bookmarkEnd w:id="45"/>
+      <w:bookmarkEnd w:id="46"/>
+      <w:r>
+        <w:rPr>
+          <w:sz w:val="24"/>
+          <w:szCs w:val="24"/>
+        </w:rPr>
+        <w:t xml:space="preserve"> (PARTE 1)</w:t>
+      </w:r>
+    </w:p>
+    <w:p>
+      <w:pPr>
+        <w:pStyle w:val="Ttulo1"/>
+        <w:ind w:left="765"/>
+        <w:rPr>
+          <w:sz w:val="24"/>
+          <w:szCs w:val="24"/>
+        </w:rPr>
+      </w:pPr>
+    </w:p>
+    <w:p>
+      <w:pPr>
+        <w:pStyle w:val="Ttulo1"/>
+        <w:ind w:left="765"/>
+        <w:rPr>
+          <w:sz w:val="24"/>
+          <w:szCs w:val="24"/>
+        </w:rPr>
+      </w:pPr>
+    </w:p>
+    <w:p>
+      <w:pPr>
+        <w:pStyle w:val="Ttulo1"/>
+        <w:ind w:left="765"/>
+        <w:rPr>
+          <w:sz w:val="24"/>
+          <w:szCs w:val="24"/>
+        </w:rPr>
+      </w:pPr>
+    </w:p>
+    <w:p>
+      <w:pPr>
+        <w:pStyle w:val="Ttulo1"/>
+        <w:ind w:left="765"/>
+        <w:rPr>
+          <w:sz w:val="24"/>
+          <w:szCs w:val="24"/>
+        </w:rPr>
+      </w:pPr>
+    </w:p>
+    <w:p>
+      <w:pPr>
+        <w:pStyle w:val="Ttulo1"/>
+        <w:ind w:left="765"/>
+        <w:rPr>
+          <w:sz w:val="24"/>
+          <w:szCs w:val="24"/>
+        </w:rPr>
+      </w:pPr>
+    </w:p>
+    <w:p>
+      <w:pPr>
+        <w:pStyle w:val="Ttulo1"/>
+        <w:ind w:left="765"/>
+        <w:rPr>
+          <w:sz w:val="24"/>
+          <w:szCs w:val="24"/>
+        </w:rPr>
+      </w:pPr>
+    </w:p>
+    <w:p>
+      <w:pPr>
+        <w:pStyle w:val="Ttulo1"/>
+        <w:ind w:left="765"/>
+        <w:rPr>
+          <w:sz w:val="24"/>
+          <w:szCs w:val="24"/>
+        </w:rPr>
+      </w:pPr>
     </w:p>
     <w:p>
       <w:pPr>
@@ -28475,116 +28753,692 @@
           <w:szCs w:val="24"/>
         </w:rPr>
       </w:pPr>
-      <w:bookmarkStart w:id="46" w:name="_Toc22977041"/>
-      <w:bookmarkEnd w:id="46"/>
+      <w:r>
+        <w:rPr>
+          <w:noProof/>
+          <w:sz w:val="24"/>
+          <w:szCs w:val="24"/>
+        </w:rPr>
+        <w:lastRenderedPageBreak/>
+        <w:drawing>
+          <wp:anchor distT="0" distB="0" distL="114300" distR="114300" simplePos="0" relativeHeight="251667456" behindDoc="0" locked="0" layoutInCell="1" allowOverlap="1" wp14:anchorId="2C1A1DF9" wp14:editId="4AF330A0">
+            <wp:simplePos x="0" y="0"/>
+            <wp:positionH relativeFrom="column">
+              <wp:posOffset>3086</wp:posOffset>
+            </wp:positionH>
+            <wp:positionV relativeFrom="paragraph">
+              <wp:posOffset>340360</wp:posOffset>
+            </wp:positionV>
+            <wp:extent cx="6443345" cy="4370247"/>
+            <wp:effectExtent l="0" t="0" r="0" b="0"/>
+            <wp:wrapSquare wrapText="bothSides"/>
+            <wp:docPr id="1857" name="Imagem 1857"/>
+            <wp:cNvGraphicFramePr>
+              <a:graphicFrameLocks xmlns:a="http://schemas.openxmlformats.org/drawingml/2006/main" noChangeAspect="1"/>
+            </wp:cNvGraphicFramePr>
+            <a:graphic xmlns:a="http://schemas.openxmlformats.org/drawingml/2006/main">
+              <a:graphicData uri="http://schemas.openxmlformats.org/drawingml/2006/picture">
+                <pic:pic xmlns:pic="http://schemas.openxmlformats.org/drawingml/2006/picture">
+                  <pic:nvPicPr>
+                    <pic:cNvPr id="0" name="Picture 2"/>
+                    <pic:cNvPicPr>
+                      <a:picLocks noChangeAspect="1" noChangeArrowheads="1"/>
+                    </pic:cNvPicPr>
+                  </pic:nvPicPr>
+                  <pic:blipFill rotWithShape="1">
+                    <a:blip r:embed="rId24">
+                      <a:extLst>
+                        <a:ext uri="{28A0092B-C50C-407E-A947-70E740481C1C}">
+                          <a14:useLocalDpi xmlns:a14="http://schemas.microsoft.com/office/drawing/2010/main" val="0"/>
+                        </a:ext>
+                      </a:extLst>
+                    </a:blip>
+                    <a:srcRect t="10457"/>
+                    <a:stretch/>
+                  </pic:blipFill>
+                  <pic:spPr bwMode="auto">
+                    <a:xfrm>
+                      <a:off x="0" y="0"/>
+                      <a:ext cx="6443345" cy="4370247"/>
+                    </a:xfrm>
+                    <a:prstGeom prst="rect">
+                      <a:avLst/>
+                    </a:prstGeom>
+                    <a:noFill/>
+                    <a:ln>
+                      <a:noFill/>
+                    </a:ln>
+                    <a:extLst>
+                      <a:ext uri="{53640926-AAD7-44D8-BBD7-CCE9431645EC}">
+                        <a14:shadowObscured xmlns:a14="http://schemas.microsoft.com/office/drawing/2010/main"/>
+                      </a:ext>
+                    </a:extLst>
+                  </pic:spPr>
+                </pic:pic>
+              </a:graphicData>
+            </a:graphic>
+            <wp14:sizeRelH relativeFrom="page">
+              <wp14:pctWidth>0</wp14:pctWidth>
+            </wp14:sizeRelH>
+            <wp14:sizeRelV relativeFrom="page">
+              <wp14:pctHeight>0</wp14:pctHeight>
+            </wp14:sizeRelV>
+          </wp:anchor>
+        </w:drawing>
+      </w:r>
+      <w:r>
+        <w:rPr>
+          <w:sz w:val="24"/>
+          <w:szCs w:val="24"/>
+        </w:rPr>
+        <w:t>TELA INICIAL (PARTE 2)</w:t>
+      </w:r>
     </w:p>
     <w:p>
       <w:pPr>
         <w:pStyle w:val="Ttulo1"/>
-        <w:ind w:left="363"/>
+        <w:ind w:left="765"/>
+        <w:rPr>
+          <w:sz w:val="24"/>
+          <w:szCs w:val="24"/>
+        </w:rPr>
       </w:pPr>
     </w:p>
     <w:p>
       <w:pPr>
         <w:pStyle w:val="Ttulo1"/>
-        <w:ind w:left="363"/>
+        <w:ind w:left="765"/>
+        <w:rPr>
+          <w:sz w:val="24"/>
+          <w:szCs w:val="24"/>
+        </w:rPr>
       </w:pPr>
     </w:p>
     <w:p>
       <w:pPr>
         <w:pStyle w:val="Ttulo1"/>
-        <w:ind w:left="363"/>
+        <w:ind w:left="765"/>
+        <w:rPr>
+          <w:sz w:val="24"/>
+          <w:szCs w:val="24"/>
+        </w:rPr>
       </w:pPr>
     </w:p>
     <w:p>
       <w:pPr>
         <w:pStyle w:val="Ttulo1"/>
-        <w:ind w:left="363"/>
+        <w:ind w:left="765"/>
+        <w:rPr>
+          <w:sz w:val="24"/>
+          <w:szCs w:val="24"/>
+        </w:rPr>
       </w:pPr>
     </w:p>
     <w:p>
       <w:pPr>
         <w:pStyle w:val="Ttulo1"/>
-        <w:ind w:left="363"/>
+        <w:ind w:left="765"/>
+        <w:rPr>
+          <w:sz w:val="24"/>
+          <w:szCs w:val="24"/>
+        </w:rPr>
       </w:pPr>
     </w:p>
     <w:p>
       <w:pPr>
         <w:pStyle w:val="Ttulo1"/>
-        <w:ind w:left="363"/>
+        <w:ind w:left="765"/>
+        <w:rPr>
+          <w:sz w:val="24"/>
+          <w:szCs w:val="24"/>
+        </w:rPr>
       </w:pPr>
     </w:p>
     <w:p>
       <w:pPr>
         <w:pStyle w:val="Ttulo1"/>
-        <w:ind w:left="363"/>
+        <w:ind w:left="765"/>
+        <w:rPr>
+          <w:sz w:val="24"/>
+          <w:szCs w:val="24"/>
+        </w:rPr>
       </w:pPr>
     </w:p>
     <w:p>
       <w:pPr>
         <w:pStyle w:val="Ttulo1"/>
-        <w:ind w:left="363"/>
+        <w:ind w:left="765"/>
+        <w:rPr>
+          <w:sz w:val="24"/>
+          <w:szCs w:val="24"/>
+        </w:rPr>
       </w:pPr>
     </w:p>
     <w:p>
       <w:pPr>
         <w:pStyle w:val="Ttulo1"/>
-        <w:ind w:left="363"/>
+        <w:ind w:left="765"/>
+        <w:rPr>
+          <w:sz w:val="24"/>
+          <w:szCs w:val="24"/>
+        </w:rPr>
       </w:pPr>
     </w:p>
     <w:p>
       <w:pPr>
         <w:pStyle w:val="Ttulo1"/>
-        <w:ind w:left="363"/>
-      </w:pPr>
+        <w:numPr>
+          <w:ilvl w:val="1"/>
+          <w:numId w:val="17"/>
+        </w:numPr>
+        <w:rPr>
+          <w:sz w:val="24"/>
+          <w:szCs w:val="24"/>
+        </w:rPr>
+      </w:pPr>
+      <w:bookmarkStart w:id="47" w:name="_Toc22977041"/>
+      <w:bookmarkEnd w:id="47"/>
+      <w:r>
+        <w:rPr>
+          <w:noProof/>
+          <w:sz w:val="24"/>
+          <w:szCs w:val="24"/>
+        </w:rPr>
+        <w:lastRenderedPageBreak/>
+        <w:drawing>
+          <wp:anchor distT="0" distB="0" distL="114300" distR="114300" simplePos="0" relativeHeight="251668480" behindDoc="0" locked="0" layoutInCell="1" allowOverlap="1" wp14:anchorId="522C7F73" wp14:editId="48A74DC9">
+            <wp:simplePos x="0" y="0"/>
+            <wp:positionH relativeFrom="column">
+              <wp:posOffset>506</wp:posOffset>
+            </wp:positionH>
+            <wp:positionV relativeFrom="paragraph">
+              <wp:posOffset>344111</wp:posOffset>
+            </wp:positionV>
+            <wp:extent cx="6454140" cy="4327229"/>
+            <wp:effectExtent l="0" t="0" r="3810" b="0"/>
+            <wp:wrapSquare wrapText="bothSides"/>
+            <wp:docPr id="1859" name="Imagem 1859"/>
+            <wp:cNvGraphicFramePr>
+              <a:graphicFrameLocks xmlns:a="http://schemas.openxmlformats.org/drawingml/2006/main" noChangeAspect="1"/>
+            </wp:cNvGraphicFramePr>
+            <a:graphic xmlns:a="http://schemas.openxmlformats.org/drawingml/2006/main">
+              <a:graphicData uri="http://schemas.openxmlformats.org/drawingml/2006/picture">
+                <pic:pic xmlns:pic="http://schemas.openxmlformats.org/drawingml/2006/picture">
+                  <pic:nvPicPr>
+                    <pic:cNvPr id="0" name="Picture 4"/>
+                    <pic:cNvPicPr>
+                      <a:picLocks noChangeAspect="1" noChangeArrowheads="1"/>
+                    </pic:cNvPicPr>
+                  </pic:nvPicPr>
+                  <pic:blipFill rotWithShape="1">
+                    <a:blip r:embed="rId25">
+                      <a:extLst>
+                        <a:ext uri="{28A0092B-C50C-407E-A947-70E740481C1C}">
+                          <a14:useLocalDpi xmlns:a14="http://schemas.microsoft.com/office/drawing/2010/main" val="0"/>
+                        </a:ext>
+                      </a:extLst>
+                    </a:blip>
+                    <a:srcRect t="10746"/>
+                    <a:stretch/>
+                  </pic:blipFill>
+                  <pic:spPr bwMode="auto">
+                    <a:xfrm>
+                      <a:off x="0" y="0"/>
+                      <a:ext cx="6454140" cy="4327229"/>
+                    </a:xfrm>
+                    <a:prstGeom prst="rect">
+                      <a:avLst/>
+                    </a:prstGeom>
+                    <a:noFill/>
+                    <a:ln>
+                      <a:noFill/>
+                    </a:ln>
+                    <a:extLst>
+                      <a:ext uri="{53640926-AAD7-44D8-BBD7-CCE9431645EC}">
+                        <a14:shadowObscured xmlns:a14="http://schemas.microsoft.com/office/drawing/2010/main"/>
+                      </a:ext>
+                    </a:extLst>
+                  </pic:spPr>
+                </pic:pic>
+              </a:graphicData>
+            </a:graphic>
+            <wp14:sizeRelH relativeFrom="page">
+              <wp14:pctWidth>0</wp14:pctWidth>
+            </wp14:sizeRelH>
+            <wp14:sizeRelV relativeFrom="page">
+              <wp14:pctHeight>0</wp14:pctHeight>
+            </wp14:sizeRelV>
+          </wp:anchor>
+        </w:drawing>
+      </w:r>
+      <w:r>
+        <w:rPr>
+          <w:sz w:val="24"/>
+          <w:szCs w:val="24"/>
+        </w:rPr>
+        <w:t>TELA INICIAL (PARTE 3)</w:t>
+      </w:r>
     </w:p>
     <w:p>
       <w:pPr>
         <w:pStyle w:val="Ttulo1"/>
-        <w:ind w:left="363"/>
+        <w:ind w:left="765"/>
+        <w:rPr>
+          <w:sz w:val="24"/>
+          <w:szCs w:val="24"/>
+        </w:rPr>
       </w:pPr>
     </w:p>
     <w:p>
       <w:pPr>
         <w:pStyle w:val="Ttulo1"/>
-        <w:ind w:left="363"/>
+        <w:ind w:left="765"/>
+        <w:rPr>
+          <w:sz w:val="24"/>
+          <w:szCs w:val="24"/>
+        </w:rPr>
       </w:pPr>
     </w:p>
     <w:p>
       <w:pPr>
         <w:pStyle w:val="Ttulo1"/>
-        <w:ind w:left="363"/>
+        <w:ind w:left="765"/>
+        <w:rPr>
+          <w:sz w:val="24"/>
+          <w:szCs w:val="24"/>
+        </w:rPr>
       </w:pPr>
     </w:p>
     <w:p>
       <w:pPr>
         <w:pStyle w:val="Ttulo1"/>
-        <w:ind w:left="363"/>
+        <w:ind w:left="765"/>
+        <w:rPr>
+          <w:sz w:val="24"/>
+          <w:szCs w:val="24"/>
+        </w:rPr>
       </w:pPr>
     </w:p>
     <w:p>
       <w:pPr>
         <w:pStyle w:val="Ttulo1"/>
-        <w:ind w:left="363"/>
+        <w:ind w:left="765"/>
+        <w:rPr>
+          <w:sz w:val="24"/>
+          <w:szCs w:val="24"/>
+        </w:rPr>
       </w:pPr>
     </w:p>
     <w:p>
       <w:pPr>
         <w:pStyle w:val="Ttulo1"/>
-        <w:ind w:left="363"/>
+        <w:ind w:left="765"/>
+        <w:rPr>
+          <w:sz w:val="24"/>
+          <w:szCs w:val="24"/>
+        </w:rPr>
       </w:pPr>
     </w:p>
     <w:p>
       <w:pPr>
         <w:pStyle w:val="Ttulo1"/>
-        <w:ind w:left="363"/>
+        <w:ind w:left="765"/>
+        <w:rPr>
+          <w:sz w:val="24"/>
+          <w:szCs w:val="24"/>
+        </w:rPr>
       </w:pPr>
     </w:p>
     <w:p>
       <w:pPr>
         <w:pStyle w:val="Ttulo1"/>
-        <w:spacing w:before="120"/>
-        <w:ind w:left="360"/>
+        <w:ind w:left="765"/>
+        <w:rPr>
+          <w:sz w:val="24"/>
+          <w:szCs w:val="24"/>
+        </w:rPr>
+      </w:pPr>
+    </w:p>
+    <w:p>
+      <w:pPr>
+        <w:pStyle w:val="Ttulo1"/>
+        <w:ind w:left="765"/>
+        <w:rPr>
+          <w:sz w:val="24"/>
+          <w:szCs w:val="24"/>
+        </w:rPr>
+      </w:pPr>
+    </w:p>
+    <w:p>
+      <w:pPr>
+        <w:pStyle w:val="Ttulo1"/>
+        <w:numPr>
+          <w:ilvl w:val="1"/>
+          <w:numId w:val="17"/>
+        </w:numPr>
+        <w:rPr>
+          <w:sz w:val="24"/>
+          <w:szCs w:val="24"/>
+        </w:rPr>
+      </w:pPr>
+      <w:r>
+        <w:rPr>
+          <w:noProof/>
+          <w:sz w:val="24"/>
+          <w:szCs w:val="24"/>
+        </w:rPr>
+        <w:lastRenderedPageBreak/>
+        <w:drawing>
+          <wp:anchor distT="0" distB="0" distL="114300" distR="114300" simplePos="0" relativeHeight="251669504" behindDoc="0" locked="0" layoutInCell="1" allowOverlap="1" wp14:anchorId="32975129" wp14:editId="0CF32228">
+            <wp:simplePos x="0" y="0"/>
+            <wp:positionH relativeFrom="column">
+              <wp:posOffset>-886</wp:posOffset>
+            </wp:positionH>
+            <wp:positionV relativeFrom="paragraph">
+              <wp:posOffset>340374</wp:posOffset>
+            </wp:positionV>
+            <wp:extent cx="6453812" cy="4019092"/>
+            <wp:effectExtent l="0" t="0" r="4445" b="635"/>
+            <wp:wrapSquare wrapText="bothSides"/>
+            <wp:docPr id="1861" name="Imagem 1861"/>
+            <wp:cNvGraphicFramePr>
+              <a:graphicFrameLocks xmlns:a="http://schemas.openxmlformats.org/drawingml/2006/main" noChangeAspect="1"/>
+            </wp:cNvGraphicFramePr>
+            <a:graphic xmlns:a="http://schemas.openxmlformats.org/drawingml/2006/main">
+              <a:graphicData uri="http://schemas.openxmlformats.org/drawingml/2006/picture">
+                <pic:pic xmlns:pic="http://schemas.openxmlformats.org/drawingml/2006/picture">
+                  <pic:nvPicPr>
+                    <pic:cNvPr id="0" name="Picture 6"/>
+                    <pic:cNvPicPr>
+                      <a:picLocks noChangeAspect="1" noChangeArrowheads="1"/>
+                    </pic:cNvPicPr>
+                  </pic:nvPicPr>
+                  <pic:blipFill rotWithShape="1">
+                    <a:blip r:embed="rId26">
+                      <a:extLst>
+                        <a:ext uri="{28A0092B-C50C-407E-A947-70E740481C1C}">
+                          <a14:useLocalDpi xmlns:a14="http://schemas.microsoft.com/office/drawing/2010/main" val="0"/>
+                        </a:ext>
+                      </a:extLst>
+                    </a:blip>
+                    <a:srcRect t="13895"/>
+                    <a:stretch/>
+                  </pic:blipFill>
+                  <pic:spPr bwMode="auto">
+                    <a:xfrm>
+                      <a:off x="0" y="0"/>
+                      <a:ext cx="6453812" cy="4019092"/>
+                    </a:xfrm>
+                    <a:prstGeom prst="rect">
+                      <a:avLst/>
+                    </a:prstGeom>
+                    <a:noFill/>
+                    <a:ln>
+                      <a:noFill/>
+                    </a:ln>
+                    <a:extLst>
+                      <a:ext uri="{53640926-AAD7-44D8-BBD7-CCE9431645EC}">
+                        <a14:shadowObscured xmlns:a14="http://schemas.microsoft.com/office/drawing/2010/main"/>
+                      </a:ext>
+                    </a:extLst>
+                  </pic:spPr>
+                </pic:pic>
+              </a:graphicData>
+            </a:graphic>
+            <wp14:sizeRelH relativeFrom="page">
+              <wp14:pctWidth>0</wp14:pctWidth>
+            </wp14:sizeRelH>
+            <wp14:sizeRelV relativeFrom="page">
+              <wp14:pctHeight>0</wp14:pctHeight>
+            </wp14:sizeRelV>
+          </wp:anchor>
+        </w:drawing>
+      </w:r>
+      <w:r>
+        <w:rPr>
+          <w:sz w:val="24"/>
+          <w:szCs w:val="24"/>
+        </w:rPr>
+        <w:t>TELA INCIAL (PARTE 4)</w:t>
+      </w:r>
+    </w:p>
+    <w:p>
+      <w:pPr>
+        <w:pStyle w:val="Ttulo1"/>
+        <w:ind w:left="765"/>
+        <w:rPr>
+          <w:sz w:val="24"/>
+          <w:szCs w:val="24"/>
+        </w:rPr>
+      </w:pPr>
+    </w:p>
+    <w:p>
+      <w:pPr>
+        <w:pStyle w:val="Ttulo1"/>
+        <w:ind w:left="765"/>
+        <w:rPr>
+          <w:sz w:val="24"/>
+          <w:szCs w:val="24"/>
+        </w:rPr>
+      </w:pPr>
+    </w:p>
+    <w:p>
+      <w:pPr>
+        <w:pStyle w:val="Ttulo1"/>
+        <w:ind w:left="765"/>
+        <w:rPr>
+          <w:sz w:val="24"/>
+          <w:szCs w:val="24"/>
+        </w:rPr>
+      </w:pPr>
+    </w:p>
+    <w:p>
+      <w:pPr>
+        <w:pStyle w:val="Ttulo1"/>
+        <w:ind w:left="765"/>
+        <w:rPr>
+          <w:sz w:val="24"/>
+          <w:szCs w:val="24"/>
+        </w:rPr>
+      </w:pPr>
+    </w:p>
+    <w:p>
+      <w:pPr>
+        <w:pStyle w:val="Ttulo1"/>
+        <w:ind w:left="765"/>
+        <w:rPr>
+          <w:sz w:val="24"/>
+          <w:szCs w:val="24"/>
+        </w:rPr>
+      </w:pPr>
+    </w:p>
+    <w:p>
+      <w:pPr>
+        <w:pStyle w:val="Ttulo1"/>
+        <w:ind w:left="765"/>
+        <w:rPr>
+          <w:sz w:val="24"/>
+          <w:szCs w:val="24"/>
+        </w:rPr>
+      </w:pPr>
+    </w:p>
+    <w:p>
+      <w:pPr>
+        <w:pStyle w:val="Ttulo1"/>
+        <w:ind w:left="765"/>
+        <w:rPr>
+          <w:sz w:val="24"/>
+          <w:szCs w:val="24"/>
+        </w:rPr>
+      </w:pPr>
+    </w:p>
+    <w:p>
+      <w:pPr>
+        <w:pStyle w:val="Ttulo1"/>
+        <w:ind w:left="765"/>
+        <w:rPr>
+          <w:sz w:val="24"/>
+          <w:szCs w:val="24"/>
+        </w:rPr>
+      </w:pPr>
+    </w:p>
+    <w:p>
+      <w:pPr>
+        <w:pStyle w:val="Ttulo1"/>
+        <w:ind w:left="765"/>
+        <w:rPr>
+          <w:sz w:val="24"/>
+          <w:szCs w:val="24"/>
+        </w:rPr>
+      </w:pPr>
+    </w:p>
+    <w:p>
+      <w:pPr>
+        <w:pStyle w:val="Ttulo1"/>
+        <w:ind w:left="765"/>
+        <w:rPr>
+          <w:sz w:val="24"/>
+          <w:szCs w:val="24"/>
+        </w:rPr>
+      </w:pPr>
+    </w:p>
+    <w:p>
+      <w:pPr>
+        <w:pStyle w:val="Ttulo1"/>
+        <w:numPr>
+          <w:ilvl w:val="1"/>
+          <w:numId w:val="17"/>
+        </w:numPr>
+        <w:rPr>
+          <w:sz w:val="24"/>
+          <w:szCs w:val="24"/>
+        </w:rPr>
+      </w:pPr>
+      <w:r>
+        <w:rPr>
+          <w:noProof/>
+        </w:rPr>
+        <w:lastRenderedPageBreak/>
+        <w:drawing>
+          <wp:anchor distT="0" distB="0" distL="114300" distR="114300" simplePos="0" relativeHeight="251670528" behindDoc="0" locked="0" layoutInCell="1" allowOverlap="1" wp14:anchorId="7D2591B1" wp14:editId="7491AEFE">
+            <wp:simplePos x="0" y="0"/>
+            <wp:positionH relativeFrom="column">
+              <wp:posOffset>-458</wp:posOffset>
+            </wp:positionH>
+            <wp:positionV relativeFrom="paragraph">
+              <wp:posOffset>340360</wp:posOffset>
+            </wp:positionV>
+            <wp:extent cx="6454140" cy="4317069"/>
+            <wp:effectExtent l="0" t="0" r="3810" b="7620"/>
+            <wp:wrapSquare wrapText="bothSides"/>
+            <wp:docPr id="1862" name="Imagem 1862"/>
+            <wp:cNvGraphicFramePr>
+              <a:graphicFrameLocks xmlns:a="http://schemas.openxmlformats.org/drawingml/2006/main" noChangeAspect="1"/>
+            </wp:cNvGraphicFramePr>
+            <a:graphic xmlns:a="http://schemas.openxmlformats.org/drawingml/2006/main">
+              <a:graphicData uri="http://schemas.openxmlformats.org/drawingml/2006/picture">
+                <pic:pic xmlns:pic="http://schemas.openxmlformats.org/drawingml/2006/picture">
+                  <pic:nvPicPr>
+                    <pic:cNvPr id="0" name="Picture 7"/>
+                    <pic:cNvPicPr>
+                      <a:picLocks noChangeAspect="1" noChangeArrowheads="1"/>
+                    </pic:cNvPicPr>
+                  </pic:nvPicPr>
+                  <pic:blipFill rotWithShape="1">
+                    <a:blip r:embed="rId27">
+                      <a:extLst>
+                        <a:ext uri="{28A0092B-C50C-407E-A947-70E740481C1C}">
+                          <a14:useLocalDpi xmlns:a14="http://schemas.microsoft.com/office/drawing/2010/main" val="0"/>
+                        </a:ext>
+                      </a:extLst>
+                    </a:blip>
+                    <a:srcRect t="10768"/>
+                    <a:stretch/>
+                  </pic:blipFill>
+                  <pic:spPr bwMode="auto">
+                    <a:xfrm>
+                      <a:off x="0" y="0"/>
+                      <a:ext cx="6454140" cy="4317069"/>
+                    </a:xfrm>
+                    <a:prstGeom prst="rect">
+                      <a:avLst/>
+                    </a:prstGeom>
+                    <a:noFill/>
+                    <a:ln>
+                      <a:noFill/>
+                    </a:ln>
+                    <a:extLst>
+                      <a:ext uri="{53640926-AAD7-44D8-BBD7-CCE9431645EC}">
+                        <a14:shadowObscured xmlns:a14="http://schemas.microsoft.com/office/drawing/2010/main"/>
+                      </a:ext>
+                    </a:extLst>
+                  </pic:spPr>
+                </pic:pic>
+              </a:graphicData>
+            </a:graphic>
+            <wp14:sizeRelH relativeFrom="page">
+              <wp14:pctWidth>0</wp14:pctWidth>
+            </wp14:sizeRelH>
+            <wp14:sizeRelV relativeFrom="page">
+              <wp14:pctHeight>0</wp14:pctHeight>
+            </wp14:sizeRelV>
+          </wp:anchor>
+        </w:drawing>
+      </w:r>
+      <w:r>
+        <w:rPr>
+          <w:sz w:val="24"/>
+          <w:szCs w:val="24"/>
+        </w:rPr>
+        <w:t>TELA INICIAL (PARTE 5)</w:t>
+      </w:r>
+    </w:p>
+    <w:p>
+      <w:pPr>
+        <w:pStyle w:val="Ttulo1"/>
+        <w:ind w:left="363"/>
+      </w:pPr>
+    </w:p>
+    <w:p>
+      <w:pPr>
+        <w:pStyle w:val="Ttulo1"/>
+        <w:ind w:left="363"/>
+      </w:pPr>
+    </w:p>
+    <w:p>
+      <w:pPr>
+        <w:pStyle w:val="Ttulo1"/>
+        <w:ind w:left="363"/>
+      </w:pPr>
+    </w:p>
+    <w:p>
+      <w:pPr>
+        <w:pStyle w:val="Ttulo1"/>
+        <w:ind w:left="363"/>
+      </w:pPr>
+    </w:p>
+    <w:p>
+      <w:pPr>
+        <w:pStyle w:val="Ttulo1"/>
+        <w:ind w:left="363"/>
+      </w:pPr>
+    </w:p>
+    <w:p>
+      <w:pPr>
+        <w:pStyle w:val="Ttulo1"/>
+        <w:ind w:left="363"/>
+      </w:pPr>
+    </w:p>
+    <w:p>
+      <w:pPr>
+        <w:pStyle w:val="Ttulo1"/>
+        <w:ind w:left="363"/>
+      </w:pPr>
+    </w:p>
+    <w:p>
+      <w:pPr>
+        <w:pStyle w:val="Ttulo1"/>
+        <w:ind w:left="363"/>
       </w:pPr>
     </w:p>
     <w:p>
@@ -28597,17 +29451,17 @@
         <w:spacing w:before="120"/>
         <w:ind w:left="660"/>
       </w:pPr>
-      <w:bookmarkStart w:id="47" w:name="_CASOS_DE_TESTE"/>
-      <w:bookmarkEnd w:id="47"/>
+      <w:bookmarkStart w:id="48" w:name="_CASOS_DE_TESTE"/>
+      <w:bookmarkEnd w:id="48"/>
       <w:r>
         <w:lastRenderedPageBreak/>
         <w:t xml:space="preserve"> </w:t>
       </w:r>
-      <w:bookmarkStart w:id="48" w:name="_Toc22977042"/>
+      <w:bookmarkStart w:id="49" w:name="_Toc22977042"/>
       <w:r>
         <w:t>CASOS DE TESTE</w:t>
       </w:r>
-      <w:bookmarkEnd w:id="48"/>
+      <w:bookmarkEnd w:id="49"/>
     </w:p>
     <w:p>
       <w:pPr>
@@ -28633,7 +29487,7 @@
       <w:r>
         <w:t xml:space="preserve"> </w:t>
       </w:r>
-      <w:bookmarkStart w:id="49" w:name="_Toc22977043"/>
+      <w:bookmarkStart w:id="50" w:name="_Toc22977043"/>
       <w:r>
         <w:rPr>
           <w:sz w:val="24"/>
@@ -28641,7 +29495,7 @@
         </w:rPr>
         <w:t>LOGIN</w:t>
       </w:r>
-      <w:bookmarkEnd w:id="49"/>
+      <w:bookmarkEnd w:id="50"/>
     </w:p>
     <w:p>
       <w:pPr>
@@ -29434,7 +30288,7 @@
         </w:rPr>
         <w:t xml:space="preserve"> </w:t>
       </w:r>
-      <w:bookmarkStart w:id="50" w:name="_Toc22977044"/>
+      <w:bookmarkStart w:id="51" w:name="_Toc22977044"/>
       <w:r>
         <w:rPr>
           <w:sz w:val="24"/>
@@ -29442,7 +30296,7 @@
         </w:rPr>
         <w:t>CADASTRO</w:t>
       </w:r>
-      <w:bookmarkEnd w:id="50"/>
+      <w:bookmarkEnd w:id="51"/>
     </w:p>
     <w:p>
       <w:pPr>
@@ -30224,8 +31078,8 @@
           <w:szCs w:val="24"/>
         </w:rPr>
       </w:pPr>
-      <w:bookmarkStart w:id="51" w:name="_Toc22977045"/>
-      <w:bookmarkEnd w:id="51"/>
+      <w:bookmarkStart w:id="52" w:name="_Toc22977045"/>
+      <w:bookmarkEnd w:id="52"/>
     </w:p>
     <w:p>
       <w:pPr>
@@ -30282,8 +31136,6 @@
         <w:spacing w:before="120"/>
         <w:ind w:left="0"/>
       </w:pPr>
-      <w:bookmarkStart w:id="52" w:name="_GoBack"/>
-      <w:bookmarkEnd w:id="52"/>
     </w:p>
     <w:p>
       <w:pPr>
@@ -31195,7 +32047,7 @@
     <w:p/>
     <w:p/>
     <w:sectPr>
-      <w:footerReference w:type="default" r:id="rId23"/>
+      <w:footerReference w:type="default" r:id="rId28"/>
       <w:pgSz w:w="11910" w:h="16850"/>
       <w:pgMar w:top="2980" w:right="580" w:bottom="1520" w:left="1160" w:header="576" w:footer="1322" w:gutter="0"/>
       <w:cols w:space="720"/>
@@ -31724,21 +32576,7 @@
                                     <w:i/>
                                     <w:sz w:val="18"/>
                                   </w:rPr>
-                                  <w:t>2</w:t>
-                                </w:r>
-                                <w:r>
-                                  <w:rPr>
-                                    <w:i/>
-                                    <w:sz w:val="18"/>
-                                  </w:rPr>
-                                  <w:t>8</w:t>
-                                </w:r>
-                                <w:r>
-                                  <w:rPr>
-                                    <w:i/>
-                                    <w:sz w:val="18"/>
-                                  </w:rPr>
-                                  <w:t>/10/2019</w:t>
+                                  <w:t>28/10/2019</w:t>
                                 </w:r>
                               </w:p>
                             </w:tc>
@@ -32263,21 +33101,7 @@
                               <w:i/>
                               <w:sz w:val="18"/>
                             </w:rPr>
-                            <w:t>2</w:t>
-                          </w:r>
-                          <w:r>
-                            <w:rPr>
-                              <w:i/>
-                              <w:sz w:val="18"/>
-                            </w:rPr>
-                            <w:t>8</w:t>
-                          </w:r>
-                          <w:r>
-                            <w:rPr>
-                              <w:i/>
-                              <w:sz w:val="18"/>
-                            </w:rPr>
-                            <w:t>/10/2019</w:t>
+                            <w:t>28/10/2019</w:t>
                           </w:r>
                         </w:p>
                       </w:tc>
@@ -36846,7 +37670,7 @@
 </file>
 
 <file path=customXml/itemProps1.xml><?xml version="1.0" encoding="utf-8"?>
-<ds:datastoreItem xmlns:ds="http://schemas.openxmlformats.org/officeDocument/2006/customXml" ds:itemID="{98EFD6AA-81FC-438B-98F6-A803D26189E9}">
+<ds:datastoreItem xmlns:ds="http://schemas.openxmlformats.org/officeDocument/2006/customXml" ds:itemID="{ECEB5FD1-8985-4E59-928E-165073FEAA73}">
   <ds:schemaRefs>
     <ds:schemaRef ds:uri="http://schemas.openxmlformats.org/officeDocument/2006/bibliography"/>
   </ds:schemaRefs>

</xml_diff>